<commit_message>
Add Gas Appliances Regulation (EU) 2016/426 module to QS training manual (Rev. 01)
New section 4.9 (scope, NB-mandatory modules, gas categories per country,
marking, hENs, evidence checks, pitfalls); sections 4.10-4.17 renumbered;
matrix, US/CA/CH, quiz, practical P3, checklist C.5 and annexes updated.

Co-Authored-By: Claude Opus 5.5 <noreply@anthropic.com>
Claude-Session: https://claude.ai/code/session_011KC3NwuhUa3muSLWD4tvxq
</commit_message>
<xml_diff>
--- a/training/QS-Onboarding-Training-Manual.docx
+++ b/training/QS-Onboarding-Training-Manual.docx
@@ -219,7 +219,7 @@
                 <w:sz w:val="18"/>
                 <w:szCs w:val="18"/>
               </w:rPr>
-              <w:t xml:space="preserve">00 — first issue</w:t>
+              <w:t xml:space="preserve">01 — draft for approval</w:t>
             </w:r>
           </w:p>
         </w:tc>
@@ -1396,6 +1396,135 @@
               <w:bottom w:val="single" w:color="BFBFBF" w:sz="4"/>
               <w:right w:val="single" w:color="BFBFBF" w:sz="4"/>
             </w:tcBorders>
+            <w:tcMar>
+              <w:top w:type="dxa" w:w="60"/>
+              <w:left w:type="dxa" w:w="100"/>
+              <w:bottom w:type="dxa" w:w="60"/>
+              <w:right w:type="dxa" w:w="100"/>
+            </w:tcMar>
+            <w:vAlign w:val="top"/>
+          </w:tcPr>
+          <w:p>
+            <w:pPr>
+              <w:spacing w:after="40"/>
+            </w:pPr>
+            <w:r>
+              <w:rPr>
+                <w:sz w:val="18"/>
+                <w:szCs w:val="18"/>
+              </w:rPr>
+              <w:t xml:space="preserve">CQAD office</w:t>
+            </w:r>
+          </w:p>
+        </w:tc>
+      </w:tr>
+      <w:tr>
+        <w:trPr>
+          <w:cantSplit/>
+        </w:trPr>
+        <w:tc>
+          <w:tcPr>
+            <w:tcW w:type="dxa" w:w="800"/>
+            <w:tcBorders>
+              <w:top w:val="single" w:color="BFBFBF" w:sz="4"/>
+              <w:left w:val="single" w:color="BFBFBF" w:sz="4"/>
+              <w:bottom w:val="single" w:color="BFBFBF" w:sz="4"/>
+              <w:right w:val="single" w:color="BFBFBF" w:sz="4"/>
+            </w:tcBorders>
+            <w:shd w:fill="F5F7FA" w:color="auto" w:val="clear"/>
+            <w:tcMar>
+              <w:top w:type="dxa" w:w="60"/>
+              <w:left w:type="dxa" w:w="100"/>
+              <w:bottom w:type="dxa" w:w="60"/>
+              <w:right w:type="dxa" w:w="100"/>
+            </w:tcMar>
+            <w:vAlign w:val="top"/>
+          </w:tcPr>
+          <w:p>
+            <w:pPr>
+              <w:spacing w:after="40"/>
+            </w:pPr>
+            <w:r>
+              <w:rPr>
+                <w:sz w:val="18"/>
+                <w:szCs w:val="18"/>
+              </w:rPr>
+              <w:t xml:space="preserve">01</w:t>
+            </w:r>
+          </w:p>
+        </w:tc>
+        <w:tc>
+          <w:tcPr>
+            <w:tcW w:type="dxa" w:w="1400"/>
+            <w:tcBorders>
+              <w:top w:val="single" w:color="BFBFBF" w:sz="4"/>
+              <w:left w:val="single" w:color="BFBFBF" w:sz="4"/>
+              <w:bottom w:val="single" w:color="BFBFBF" w:sz="4"/>
+              <w:right w:val="single" w:color="BFBFBF" w:sz="4"/>
+            </w:tcBorders>
+            <w:shd w:fill="F5F7FA" w:color="auto" w:val="clear"/>
+            <w:tcMar>
+              <w:top w:type="dxa" w:w="60"/>
+              <w:left w:type="dxa" w:w="100"/>
+              <w:bottom w:type="dxa" w:w="60"/>
+              <w:right w:type="dxa" w:w="100"/>
+            </w:tcMar>
+            <w:vAlign w:val="top"/>
+          </w:tcPr>
+          <w:p>
+            <w:pPr>
+              <w:spacing w:after="40"/>
+            </w:pPr>
+            <w:r>
+              <w:rPr>
+                <w:sz w:val="18"/>
+                <w:szCs w:val="18"/>
+              </w:rPr>
+              <w:t xml:space="preserve">2026-10-15</w:t>
+            </w:r>
+          </w:p>
+        </w:tc>
+        <w:tc>
+          <w:tcPr>
+            <w:tcW w:type="dxa" w:w="5638"/>
+            <w:tcBorders>
+              <w:top w:val="single" w:color="BFBFBF" w:sz="4"/>
+              <w:left w:val="single" w:color="BFBFBF" w:sz="4"/>
+              <w:bottom w:val="single" w:color="BFBFBF" w:sz="4"/>
+              <w:right w:val="single" w:color="BFBFBF" w:sz="4"/>
+            </w:tcBorders>
+            <w:shd w:fill="F5F7FA" w:color="auto" w:val="clear"/>
+            <w:tcMar>
+              <w:top w:type="dxa" w:w="60"/>
+              <w:left w:type="dxa" w:w="100"/>
+              <w:bottom w:type="dxa" w:w="60"/>
+              <w:right w:type="dxa" w:w="100"/>
+            </w:tcMar>
+            <w:vAlign w:val="top"/>
+          </w:tcPr>
+          <w:p>
+            <w:pPr>
+              <w:spacing w:after="40"/>
+            </w:pPr>
+            <w:r>
+              <w:rPr>
+                <w:sz w:val="18"/>
+                <w:szCs w:val="18"/>
+              </w:rPr>
+              <w:t xml:space="preserve">Added §4.9 Gas Appliances Regulation (EU) 2016/426; renumbered §4.10–4.17; updated matrix, US/CA/CH, quiz, checklists and annexes.</w:t>
+            </w:r>
+          </w:p>
+        </w:tc>
+        <w:tc>
+          <w:tcPr>
+            <w:tcW w:type="dxa" w:w="1800"/>
+            <w:tcBorders>
+              <w:top w:val="single" w:color="BFBFBF" w:sz="4"/>
+              <w:left w:val="single" w:color="BFBFBF" w:sz="4"/>
+              <w:bottom w:val="single" w:color="BFBFBF" w:sz="4"/>
+              <w:right w:val="single" w:color="BFBFBF" w:sz="4"/>
+            </w:tcBorders>
+            <w:shd w:fill="F5F7FA" w:color="auto" w:val="clear"/>
             <w:tcMar>
               <w:top w:type="dxa" w:w="60"/>
               <w:left w:type="dxa" w:w="100"/>
@@ -2153,7 +2282,7 @@
                 <w:sz w:val="18"/>
                 <w:szCs w:val="18"/>
               </w:rPr>
-              <w:t xml:space="preserve">EU horizontal &amp; product legislation (§4.1–4.13)</w:t>
+              <w:t xml:space="preserve">EU horizontal &amp; product legislation (§4.1–4.14)</w:t>
             </w:r>
           </w:p>
         </w:tc>
@@ -2310,7 +2439,7 @@
                 <w:sz w:val="18"/>
                 <w:szCs w:val="18"/>
               </w:rPr>
-              <w:t xml:space="preserve">Battery, PPE and CPR deep-dives (§4.6–4.8)</w:t>
+              <w:t xml:space="preserve">Battery, PPE, CPR and Gas Appliances deep-dives (§4.6–4.9)</w:t>
             </w:r>
           </w:p>
         </w:tc>
@@ -2372,7 +2501,7 @@
                 <w:sz w:val="18"/>
                 <w:szCs w:val="18"/>
               </w:rPr>
-              <w:t xml:space="preserve">8</w:t>
+              <w:t xml:space="preserve">10</w:t>
             </w:r>
           </w:p>
         </w:tc>
@@ -2468,7 +2597,7 @@
                 <w:sz w:val="18"/>
                 <w:szCs w:val="18"/>
               </w:rPr>
-              <w:t xml:space="preserve">Switzerland, US, Canada (§4.14–4.16)</w:t>
+              <w:t xml:space="preserve">Switzerland, US, Canada (§4.15–4.17)</w:t>
             </w:r>
           </w:p>
         </w:tc>
@@ -3342,7 +3471,7 @@
                 <w:sz w:val="18"/>
                 <w:szCs w:val="18"/>
               </w:rPr>
-              <w:t xml:space="preserve">71</w:t>
+              <w:t xml:space="preserve">73</w:t>
             </w:r>
             <w:r>
               <w:rPr>
@@ -4644,7 +4773,7 @@
                 <w:sz w:val="18"/>
                 <w:szCs w:val="18"/>
               </w:rPr>
-              <w:t xml:space="preserve">Approves Cat III PPE, CPR system 1/1+, Annex IV / Part A machinery</w:t>
+              <w:t xml:space="preserve">Approves Cat III PPE, CPR system 1/1+, Annex IV / Part A machinery, gas appliances (GAR)</w:t>
             </w:r>
           </w:p>
         </w:tc>
@@ -7405,7 +7534,7 @@
                 <w:sz w:val="18"/>
                 <w:szCs w:val="18"/>
               </w:rPr>
-              <w:t xml:space="preserve">Review Ally brief; classify item new / repeat / modified; identify legislation &amp; standards per market; flag high-risk (Cat III PPE, battery, CPR AVCP 1/1+, Annex I-A machinery, children’s products).</w:t>
+              <w:t xml:space="preserve">Review Ally brief; classify item new / repeat / modified; identify legislation &amp; standards per market; flag high-risk (Cat III PPE, battery, gas appliances, CPR AVCP 1/1+, Annex I-A machinery, children’s products).</w:t>
             </w:r>
           </w:p>
         </w:tc>
@@ -8400,7 +8529,7 @@
         <w:spacing w:after="60"/>
       </w:pPr>
       <w:r>
-        <w:t xml:space="preserve">Repeat for Switzerland, US and Canada (§4.14–4.16).</w:t>
+        <w:t xml:space="preserve">Repeat for Switzerland, US and Canada (§4.15–4.17).</w:t>
       </w:r>
     </w:p>
     <w:p>
@@ -10368,7 +10497,7 @@
                 <w:sz w:val="18"/>
                 <w:szCs w:val="18"/>
               </w:rPr>
-              <w:t xml:space="preserve">Toys 2009/48/EC → (EU) 2025/2509</w:t>
+              <w:t xml:space="preserve">Gas Appliances (EU) 2016/426</w:t>
             </w:r>
           </w:p>
         </w:tc>
@@ -10399,6 +10528,68 @@
                 <w:sz w:val="18"/>
                 <w:szCs w:val="18"/>
               </w:rPr>
+              <w:t xml:space="preserve">●</w:t>
+            </w:r>
+          </w:p>
+        </w:tc>
+        <w:tc>
+          <w:tcPr>
+            <w:tcW w:type="dxa" w:w="1200"/>
+            <w:tcBorders>
+              <w:top w:val="single" w:color="BFBFBF" w:sz="4"/>
+              <w:left w:val="single" w:color="BFBFBF" w:sz="4"/>
+              <w:bottom w:val="single" w:color="BFBFBF" w:sz="4"/>
+              <w:right w:val="single" w:color="BFBFBF" w:sz="4"/>
+            </w:tcBorders>
+            <w:shd w:fill="F5F7FA" w:color="auto" w:val="clear"/>
+            <w:tcMar>
+              <w:top w:type="dxa" w:w="60"/>
+              <w:left w:type="dxa" w:w="100"/>
+              <w:bottom w:type="dxa" w:w="60"/>
+              <w:right w:type="dxa" w:w="100"/>
+            </w:tcMar>
+            <w:vAlign w:val="top"/>
+          </w:tcPr>
+          <w:p>
+            <w:pPr>
+              <w:spacing w:after="40"/>
+            </w:pPr>
+            <w:r>
+              <w:rPr>
+                <w:sz w:val="18"/>
+                <w:szCs w:val="18"/>
+              </w:rPr>
+              <w:t xml:space="preserve">—</w:t>
+            </w:r>
+          </w:p>
+        </w:tc>
+        <w:tc>
+          <w:tcPr>
+            <w:tcW w:type="dxa" w:w="1200"/>
+            <w:tcBorders>
+              <w:top w:val="single" w:color="BFBFBF" w:sz="4"/>
+              <w:left w:val="single" w:color="BFBFBF" w:sz="4"/>
+              <w:bottom w:val="single" w:color="BFBFBF" w:sz="4"/>
+              <w:right w:val="single" w:color="BFBFBF" w:sz="4"/>
+            </w:tcBorders>
+            <w:shd w:fill="F5F7FA" w:color="auto" w:val="clear"/>
+            <w:tcMar>
+              <w:top w:type="dxa" w:w="60"/>
+              <w:left w:type="dxa" w:w="100"/>
+              <w:bottom w:type="dxa" w:w="60"/>
+              <w:right w:type="dxa" w:w="100"/>
+            </w:tcMar>
+            <w:vAlign w:val="top"/>
+          </w:tcPr>
+          <w:p>
+            <w:pPr>
+              <w:spacing w:after="40"/>
+            </w:pPr>
+            <w:r>
+              <w:rPr>
+                <w:sz w:val="18"/>
+                <w:szCs w:val="18"/>
+              </w:rPr>
               <w:t xml:space="preserve">○</w:t>
             </w:r>
           </w:p>
@@ -10462,68 +10653,6 @@
                 <w:szCs w:val="18"/>
               </w:rPr>
               <w:t xml:space="preserve">○</w:t>
-            </w:r>
-          </w:p>
-        </w:tc>
-        <w:tc>
-          <w:tcPr>
-            <w:tcW w:type="dxa" w:w="1200"/>
-            <w:tcBorders>
-              <w:top w:val="single" w:color="BFBFBF" w:sz="4"/>
-              <w:left w:val="single" w:color="BFBFBF" w:sz="4"/>
-              <w:bottom w:val="single" w:color="BFBFBF" w:sz="4"/>
-              <w:right w:val="single" w:color="BFBFBF" w:sz="4"/>
-            </w:tcBorders>
-            <w:shd w:fill="F5F7FA" w:color="auto" w:val="clear"/>
-            <w:tcMar>
-              <w:top w:type="dxa" w:w="60"/>
-              <w:left w:type="dxa" w:w="100"/>
-              <w:bottom w:type="dxa" w:w="60"/>
-              <w:right w:type="dxa" w:w="100"/>
-            </w:tcMar>
-            <w:vAlign w:val="top"/>
-          </w:tcPr>
-          <w:p>
-            <w:pPr>
-              <w:spacing w:after="40"/>
-            </w:pPr>
-            <w:r>
-              <w:rPr>
-                <w:sz w:val="18"/>
-                <w:szCs w:val="18"/>
-              </w:rPr>
-              <w:t xml:space="preserve">—</w:t>
-            </w:r>
-          </w:p>
-        </w:tc>
-        <w:tc>
-          <w:tcPr>
-            <w:tcW w:type="dxa" w:w="1200"/>
-            <w:tcBorders>
-              <w:top w:val="single" w:color="BFBFBF" w:sz="4"/>
-              <w:left w:val="single" w:color="BFBFBF" w:sz="4"/>
-              <w:bottom w:val="single" w:color="BFBFBF" w:sz="4"/>
-              <w:right w:val="single" w:color="BFBFBF" w:sz="4"/>
-            </w:tcBorders>
-            <w:shd w:fill="F5F7FA" w:color="auto" w:val="clear"/>
-            <w:tcMar>
-              <w:top w:type="dxa" w:w="60"/>
-              <w:left w:type="dxa" w:w="100"/>
-              <w:bottom w:type="dxa" w:w="60"/>
-              <w:right w:type="dxa" w:w="100"/>
-            </w:tcMar>
-            <w:vAlign w:val="top"/>
-          </w:tcPr>
-          <w:p>
-            <w:pPr>
-              <w:spacing w:after="40"/>
-            </w:pPr>
-            <w:r>
-              <w:rPr>
-                <w:sz w:val="18"/>
-                <w:szCs w:val="18"/>
-              </w:rPr>
-              <w:t xml:space="preserve">—</w:t>
             </w:r>
           </w:p>
         </w:tc>
@@ -10558,7 +10687,7 @@
                 <w:sz w:val="18"/>
                 <w:szCs w:val="18"/>
               </w:rPr>
-              <w:t xml:space="preserve">REACH / POPs</w:t>
+              <w:t xml:space="preserve">Toys 2009/48/EC → (EU) 2025/2509</w:t>
             </w:r>
           </w:p>
         </w:tc>
@@ -10588,7 +10717,7 @@
                 <w:sz w:val="18"/>
                 <w:szCs w:val="18"/>
               </w:rPr>
-              <w:t xml:space="preserve">●</w:t>
+              <w:t xml:space="preserve">○</w:t>
             </w:r>
           </w:p>
         </w:tc>
@@ -10618,7 +10747,7 @@
                 <w:sz w:val="18"/>
                 <w:szCs w:val="18"/>
               </w:rPr>
-              <w:t xml:space="preserve">●</w:t>
+              <w:t xml:space="preserve">—</w:t>
             </w:r>
           </w:p>
         </w:tc>
@@ -10648,7 +10777,7 @@
                 <w:sz w:val="18"/>
                 <w:szCs w:val="18"/>
               </w:rPr>
-              <w:t xml:space="preserve">●</w:t>
+              <w:t xml:space="preserve">○</w:t>
             </w:r>
           </w:p>
         </w:tc>
@@ -10678,7 +10807,7 @@
                 <w:sz w:val="18"/>
                 <w:szCs w:val="18"/>
               </w:rPr>
-              <w:t xml:space="preserve">●</w:t>
+              <w:t xml:space="preserve">—</w:t>
             </w:r>
           </w:p>
         </w:tc>
@@ -10708,7 +10837,7 @@
                 <w:sz w:val="18"/>
                 <w:szCs w:val="18"/>
               </w:rPr>
-              <w:t xml:space="preserve">●</w:t>
+              <w:t xml:space="preserve">—</w:t>
             </w:r>
           </w:p>
         </w:tc>
@@ -10744,7 +10873,7 @@
                 <w:sz w:val="18"/>
                 <w:szCs w:val="18"/>
               </w:rPr>
-              <w:t xml:space="preserve">Food contact (EC) 1935/2004</w:t>
+              <w:t xml:space="preserve">REACH / POPs</w:t>
             </w:r>
           </w:p>
         </w:tc>
@@ -10775,7 +10904,7 @@
                 <w:sz w:val="18"/>
                 <w:szCs w:val="18"/>
               </w:rPr>
-              <w:t xml:space="preserve">○</w:t>
+              <w:t xml:space="preserve">●</w:t>
             </w:r>
           </w:p>
         </w:tc>
@@ -10806,7 +10935,7 @@
                 <w:sz w:val="18"/>
                 <w:szCs w:val="18"/>
               </w:rPr>
-              <w:t xml:space="preserve">—</w:t>
+              <w:t xml:space="preserve">●</w:t>
             </w:r>
           </w:p>
         </w:tc>
@@ -10837,7 +10966,7 @@
                 <w:sz w:val="18"/>
                 <w:szCs w:val="18"/>
               </w:rPr>
-              <w:t xml:space="preserve">○</w:t>
+              <w:t xml:space="preserve">●</w:t>
             </w:r>
           </w:p>
         </w:tc>
@@ -10868,7 +10997,7 @@
                 <w:sz w:val="18"/>
                 <w:szCs w:val="18"/>
               </w:rPr>
-              <w:t xml:space="preserve">—</w:t>
+              <w:t xml:space="preserve">●</w:t>
             </w:r>
           </w:p>
         </w:tc>
@@ -10899,7 +11028,7 @@
                 <w:sz w:val="18"/>
                 <w:szCs w:val="18"/>
               </w:rPr>
-              <w:t xml:space="preserve">—</w:t>
+              <w:t xml:space="preserve">●</w:t>
             </w:r>
           </w:p>
         </w:tc>
@@ -10934,7 +11063,7 @@
                 <w:sz w:val="18"/>
                 <w:szCs w:val="18"/>
               </w:rPr>
-              <w:t xml:space="preserve">Packaging (EU) 2025/40 (PPWR)</w:t>
+              <w:t xml:space="preserve">Food contact (EC) 1935/2004</w:t>
             </w:r>
           </w:p>
         </w:tc>
@@ -10964,7 +11093,7 @@
                 <w:sz w:val="18"/>
                 <w:szCs w:val="18"/>
               </w:rPr>
-              <w:t xml:space="preserve">●</w:t>
+              <w:t xml:space="preserve">○</w:t>
             </w:r>
           </w:p>
         </w:tc>
@@ -10994,7 +11123,7 @@
                 <w:sz w:val="18"/>
                 <w:szCs w:val="18"/>
               </w:rPr>
-              <w:t xml:space="preserve">●</w:t>
+              <w:t xml:space="preserve">—</w:t>
             </w:r>
           </w:p>
         </w:tc>
@@ -11024,7 +11153,7 @@
                 <w:sz w:val="18"/>
                 <w:szCs w:val="18"/>
               </w:rPr>
-              <w:t xml:space="preserve">●</w:t>
+              <w:t xml:space="preserve">○</w:t>
             </w:r>
           </w:p>
         </w:tc>
@@ -11054,7 +11183,7 @@
                 <w:sz w:val="18"/>
                 <w:szCs w:val="18"/>
               </w:rPr>
-              <w:t xml:space="preserve">●</w:t>
+              <w:t xml:space="preserve">—</w:t>
             </w:r>
           </w:p>
         </w:tc>
@@ -11084,7 +11213,7 @@
                 <w:sz w:val="18"/>
                 <w:szCs w:val="18"/>
               </w:rPr>
-              <w:t xml:space="preserve">●</w:t>
+              <w:t xml:space="preserve">—</w:t>
             </w:r>
           </w:p>
         </w:tc>
@@ -11120,7 +11249,7 @@
                 <w:sz w:val="18"/>
                 <w:szCs w:val="18"/>
               </w:rPr>
-              <w:t xml:space="preserve">EUDR (EU) 2023/1115</w:t>
+              <w:t xml:space="preserve">Packaging (EU) 2025/40 (PPWR)</w:t>
             </w:r>
           </w:p>
         </w:tc>
@@ -11182,7 +11311,7 @@
                 <w:sz w:val="18"/>
                 <w:szCs w:val="18"/>
               </w:rPr>
-              <w:t xml:space="preserve">○</w:t>
+              <w:t xml:space="preserve">●</w:t>
             </w:r>
           </w:p>
         </w:tc>
@@ -11244,7 +11373,7 @@
                 <w:sz w:val="18"/>
                 <w:szCs w:val="18"/>
               </w:rPr>
-              <w:t xml:space="preserve">○</w:t>
+              <w:t xml:space="preserve">●</w:t>
             </w:r>
           </w:p>
         </w:tc>
@@ -11310,7 +11439,7 @@
                 <w:sz w:val="18"/>
                 <w:szCs w:val="18"/>
               </w:rPr>
-              <w:t xml:space="preserve">CBAM (EU) 2023/956</w:t>
+              <w:t xml:space="preserve">EUDR (EU) 2023/1115</w:t>
             </w:r>
           </w:p>
         </w:tc>
@@ -11340,6 +11469,36 @@
                 <w:sz w:val="18"/>
                 <w:szCs w:val="18"/>
               </w:rPr>
+              <w:t xml:space="preserve">●</w:t>
+            </w:r>
+          </w:p>
+        </w:tc>
+        <w:tc>
+          <w:tcPr>
+            <w:tcW w:type="dxa" w:w="1200"/>
+            <w:tcBorders>
+              <w:top w:val="single" w:color="BFBFBF" w:sz="4"/>
+              <w:left w:val="single" w:color="BFBFBF" w:sz="4"/>
+              <w:bottom w:val="single" w:color="BFBFBF" w:sz="4"/>
+              <w:right w:val="single" w:color="BFBFBF" w:sz="4"/>
+            </w:tcBorders>
+            <w:tcMar>
+              <w:top w:type="dxa" w:w="60"/>
+              <w:left w:type="dxa" w:w="100"/>
+              <w:bottom w:type="dxa" w:w="60"/>
+              <w:right w:type="dxa" w:w="100"/>
+            </w:tcMar>
+            <w:vAlign w:val="top"/>
+          </w:tcPr>
+          <w:p>
+            <w:pPr>
+              <w:spacing w:after="40"/>
+            </w:pPr>
+            <w:r>
+              <w:rPr>
+                <w:sz w:val="18"/>
+                <w:szCs w:val="18"/>
+              </w:rPr>
               <w:t xml:space="preserve">○</w:t>
             </w:r>
           </w:p>
@@ -11371,36 +11530,6 @@
                 <w:szCs w:val="18"/>
               </w:rPr>
               <w:t xml:space="preserve">●</w:t>
-            </w:r>
-          </w:p>
-        </w:tc>
-        <w:tc>
-          <w:tcPr>
-            <w:tcW w:type="dxa" w:w="1200"/>
-            <w:tcBorders>
-              <w:top w:val="single" w:color="BFBFBF" w:sz="4"/>
-              <w:left w:val="single" w:color="BFBFBF" w:sz="4"/>
-              <w:bottom w:val="single" w:color="BFBFBF" w:sz="4"/>
-              <w:right w:val="single" w:color="BFBFBF" w:sz="4"/>
-            </w:tcBorders>
-            <w:tcMar>
-              <w:top w:type="dxa" w:w="60"/>
-              <w:left w:type="dxa" w:w="100"/>
-              <w:bottom w:type="dxa" w:w="60"/>
-              <w:right w:type="dxa" w:w="100"/>
-            </w:tcMar>
-            <w:vAlign w:val="top"/>
-          </w:tcPr>
-          <w:p>
-            <w:pPr>
-              <w:spacing w:after="40"/>
-            </w:pPr>
-            <w:r>
-              <w:rPr>
-                <w:sz w:val="18"/>
-                <w:szCs w:val="18"/>
-              </w:rPr>
-              <w:t xml:space="preserve">○</w:t>
             </w:r>
           </w:p>
         </w:tc>
@@ -11496,6 +11625,196 @@
                 <w:sz w:val="18"/>
                 <w:szCs w:val="18"/>
               </w:rPr>
+              <w:t xml:space="preserve">CBAM (EU) 2023/956</w:t>
+            </w:r>
+          </w:p>
+        </w:tc>
+        <w:tc>
+          <w:tcPr>
+            <w:tcW w:type="dxa" w:w="1200"/>
+            <w:tcBorders>
+              <w:top w:val="single" w:color="BFBFBF" w:sz="4"/>
+              <w:left w:val="single" w:color="BFBFBF" w:sz="4"/>
+              <w:bottom w:val="single" w:color="BFBFBF" w:sz="4"/>
+              <w:right w:val="single" w:color="BFBFBF" w:sz="4"/>
+            </w:tcBorders>
+            <w:shd w:fill="F5F7FA" w:color="auto" w:val="clear"/>
+            <w:tcMar>
+              <w:top w:type="dxa" w:w="60"/>
+              <w:left w:type="dxa" w:w="100"/>
+              <w:bottom w:type="dxa" w:w="60"/>
+              <w:right w:type="dxa" w:w="100"/>
+            </w:tcMar>
+            <w:vAlign w:val="top"/>
+          </w:tcPr>
+          <w:p>
+            <w:pPr>
+              <w:spacing w:after="40"/>
+            </w:pPr>
+            <w:r>
+              <w:rPr>
+                <w:sz w:val="18"/>
+                <w:szCs w:val="18"/>
+              </w:rPr>
+              <w:t xml:space="preserve">○</w:t>
+            </w:r>
+          </w:p>
+        </w:tc>
+        <w:tc>
+          <w:tcPr>
+            <w:tcW w:type="dxa" w:w="1200"/>
+            <w:tcBorders>
+              <w:top w:val="single" w:color="BFBFBF" w:sz="4"/>
+              <w:left w:val="single" w:color="BFBFBF" w:sz="4"/>
+              <w:bottom w:val="single" w:color="BFBFBF" w:sz="4"/>
+              <w:right w:val="single" w:color="BFBFBF" w:sz="4"/>
+            </w:tcBorders>
+            <w:shd w:fill="F5F7FA" w:color="auto" w:val="clear"/>
+            <w:tcMar>
+              <w:top w:type="dxa" w:w="60"/>
+              <w:left w:type="dxa" w:w="100"/>
+              <w:bottom w:type="dxa" w:w="60"/>
+              <w:right w:type="dxa" w:w="100"/>
+            </w:tcMar>
+            <w:vAlign w:val="top"/>
+          </w:tcPr>
+          <w:p>
+            <w:pPr>
+              <w:spacing w:after="40"/>
+            </w:pPr>
+            <w:r>
+              <w:rPr>
+                <w:sz w:val="18"/>
+                <w:szCs w:val="18"/>
+              </w:rPr>
+              <w:t xml:space="preserve">●</w:t>
+            </w:r>
+          </w:p>
+        </w:tc>
+        <w:tc>
+          <w:tcPr>
+            <w:tcW w:type="dxa" w:w="1200"/>
+            <w:tcBorders>
+              <w:top w:val="single" w:color="BFBFBF" w:sz="4"/>
+              <w:left w:val="single" w:color="BFBFBF" w:sz="4"/>
+              <w:bottom w:val="single" w:color="BFBFBF" w:sz="4"/>
+              <w:right w:val="single" w:color="BFBFBF" w:sz="4"/>
+            </w:tcBorders>
+            <w:shd w:fill="F5F7FA" w:color="auto" w:val="clear"/>
+            <w:tcMar>
+              <w:top w:type="dxa" w:w="60"/>
+              <w:left w:type="dxa" w:w="100"/>
+              <w:bottom w:type="dxa" w:w="60"/>
+              <w:right w:type="dxa" w:w="100"/>
+            </w:tcMar>
+            <w:vAlign w:val="top"/>
+          </w:tcPr>
+          <w:p>
+            <w:pPr>
+              <w:spacing w:after="40"/>
+            </w:pPr>
+            <w:r>
+              <w:rPr>
+                <w:sz w:val="18"/>
+                <w:szCs w:val="18"/>
+              </w:rPr>
+              <w:t xml:space="preserve">○</w:t>
+            </w:r>
+          </w:p>
+        </w:tc>
+        <w:tc>
+          <w:tcPr>
+            <w:tcW w:type="dxa" w:w="1200"/>
+            <w:tcBorders>
+              <w:top w:val="single" w:color="BFBFBF" w:sz="4"/>
+              <w:left w:val="single" w:color="BFBFBF" w:sz="4"/>
+              <w:bottom w:val="single" w:color="BFBFBF" w:sz="4"/>
+              <w:right w:val="single" w:color="BFBFBF" w:sz="4"/>
+            </w:tcBorders>
+            <w:shd w:fill="F5F7FA" w:color="auto" w:val="clear"/>
+            <w:tcMar>
+              <w:top w:type="dxa" w:w="60"/>
+              <w:left w:type="dxa" w:w="100"/>
+              <w:bottom w:type="dxa" w:w="60"/>
+              <w:right w:type="dxa" w:w="100"/>
+            </w:tcMar>
+            <w:vAlign w:val="top"/>
+          </w:tcPr>
+          <w:p>
+            <w:pPr>
+              <w:spacing w:after="40"/>
+            </w:pPr>
+            <w:r>
+              <w:rPr>
+                <w:sz w:val="18"/>
+                <w:szCs w:val="18"/>
+              </w:rPr>
+              <w:t xml:space="preserve">○</w:t>
+            </w:r>
+          </w:p>
+        </w:tc>
+        <w:tc>
+          <w:tcPr>
+            <w:tcW w:type="dxa" w:w="1200"/>
+            <w:tcBorders>
+              <w:top w:val="single" w:color="BFBFBF" w:sz="4"/>
+              <w:left w:val="single" w:color="BFBFBF" w:sz="4"/>
+              <w:bottom w:val="single" w:color="BFBFBF" w:sz="4"/>
+              <w:right w:val="single" w:color="BFBFBF" w:sz="4"/>
+            </w:tcBorders>
+            <w:shd w:fill="F5F7FA" w:color="auto" w:val="clear"/>
+            <w:tcMar>
+              <w:top w:type="dxa" w:w="60"/>
+              <w:left w:type="dxa" w:w="100"/>
+              <w:bottom w:type="dxa" w:w="60"/>
+              <w:right w:type="dxa" w:w="100"/>
+            </w:tcMar>
+            <w:vAlign w:val="top"/>
+          </w:tcPr>
+          <w:p>
+            <w:pPr>
+              <w:spacing w:after="40"/>
+            </w:pPr>
+            <w:r>
+              <w:rPr>
+                <w:sz w:val="18"/>
+                <w:szCs w:val="18"/>
+              </w:rPr>
+              <w:t xml:space="preserve">●</w:t>
+            </w:r>
+          </w:p>
+        </w:tc>
+      </w:tr>
+      <w:tr>
+        <w:trPr>
+          <w:cantSplit/>
+        </w:trPr>
+        <w:tc>
+          <w:tcPr>
+            <w:tcW w:type="dxa" w:w="3638"/>
+            <w:tcBorders>
+              <w:top w:val="single" w:color="BFBFBF" w:sz="4"/>
+              <w:left w:val="single" w:color="BFBFBF" w:sz="4"/>
+              <w:bottom w:val="single" w:color="BFBFBF" w:sz="4"/>
+              <w:right w:val="single" w:color="BFBFBF" w:sz="4"/>
+            </w:tcBorders>
+            <w:tcMar>
+              <w:top w:type="dxa" w:w="60"/>
+              <w:left w:type="dxa" w:w="100"/>
+              <w:bottom w:type="dxa" w:w="60"/>
+              <w:right w:type="dxa" w:w="100"/>
+            </w:tcMar>
+            <w:vAlign w:val="top"/>
+          </w:tcPr>
+          <w:p>
+            <w:pPr>
+              <w:spacing w:after="40"/>
+            </w:pPr>
+            <w:r>
+              <w:rPr>
+                <w:sz w:val="18"/>
+                <w:szCs w:val="18"/>
+              </w:rPr>
               <w:t xml:space="preserve">Ecodesign / ESPR (EU) 2024/1781</w:t>
             </w:r>
           </w:p>
@@ -11509,7 +11828,6 @@
               <w:bottom w:val="single" w:color="BFBFBF" w:sz="4"/>
               <w:right w:val="single" w:color="BFBFBF" w:sz="4"/>
             </w:tcBorders>
-            <w:shd w:fill="F5F7FA" w:color="auto" w:val="clear"/>
             <w:tcMar>
               <w:top w:type="dxa" w:w="60"/>
               <w:left w:type="dxa" w:w="100"/>
@@ -11540,7 +11858,6 @@
               <w:bottom w:val="single" w:color="BFBFBF" w:sz="4"/>
               <w:right w:val="single" w:color="BFBFBF" w:sz="4"/>
             </w:tcBorders>
-            <w:shd w:fill="F5F7FA" w:color="auto" w:val="clear"/>
             <w:tcMar>
               <w:top w:type="dxa" w:w="60"/>
               <w:left w:type="dxa" w:w="100"/>
@@ -11571,7 +11888,6 @@
               <w:bottom w:val="single" w:color="BFBFBF" w:sz="4"/>
               <w:right w:val="single" w:color="BFBFBF" w:sz="4"/>
             </w:tcBorders>
-            <w:shd w:fill="F5F7FA" w:color="auto" w:val="clear"/>
             <w:tcMar>
               <w:top w:type="dxa" w:w="60"/>
               <w:left w:type="dxa" w:w="100"/>
@@ -11602,7 +11918,6 @@
               <w:bottom w:val="single" w:color="BFBFBF" w:sz="4"/>
               <w:right w:val="single" w:color="BFBFBF" w:sz="4"/>
             </w:tcBorders>
-            <w:shd w:fill="F5F7FA" w:color="auto" w:val="clear"/>
             <w:tcMar>
               <w:top w:type="dxa" w:w="60"/>
               <w:left w:type="dxa" w:w="100"/>
@@ -11633,7 +11948,6 @@
               <w:bottom w:val="single" w:color="BFBFBF" w:sz="4"/>
               <w:right w:val="single" w:color="BFBFBF" w:sz="4"/>
             </w:tcBorders>
-            <w:shd w:fill="F5F7FA" w:color="auto" w:val="clear"/>
             <w:tcMar>
               <w:top w:type="dxa" w:w="60"/>
               <w:left w:type="dxa" w:w="100"/>
@@ -15927,7 +16241,15 @@
         <w:pStyle w:val="Heading2"/>
       </w:pPr>
       <w:r>
-        <w:t xml:space="preserve">4.9 Toys</w:t>
+        <w:t xml:space="preserve">4.9 Gas appliances — Regulation (EU) 2016/426 (GAR)</w:t>
+      </w:r>
+    </w:p>
+    <w:p>
+      <w:pPr>
+        <w:spacing w:after="100"/>
+      </w:pPr>
+      <w:r>
+        <w:t xml:space="preserve">Relevant mainly for GARDEN and DECO: gas barbecues and plancha grills, outdoor hotplates, patio and parasol heaters, gas fire pits / fire tables, camping stoves and lanterns, plus the hoses and regulators supplied with them.</w:t>
       </w:r>
     </w:p>
     <w:tbl>
@@ -15978,7 +16300,7 @@
                 <w:sz w:val="18"/>
                 <w:szCs w:val="18"/>
               </w:rPr>
-              <w:t xml:space="preserve">Directive 2009/48/EC → Regulation (EU) 2025/2509</w:t>
+              <w:t xml:space="preserve">Gas Appliances Regulation (EU) 2016/426 — applies since 21 Apr 2018 (repealed Directive 2009/142/EC)</w:t>
             </w:r>
           </w:p>
         </w:tc>
@@ -16016,7 +16338,7 @@
                 <w:sz w:val="18"/>
                 <w:szCs w:val="18"/>
               </w:rPr>
-              <w:t xml:space="preserve">Relevance</w:t>
+              <w:t xml:space="preserve">Scope</w:t>
             </w:r>
           </w:p>
         </w:tc>
@@ -16046,7 +16368,63 @@
                 <w:sz w:val="18"/>
                 <w:szCs w:val="18"/>
               </w:rPr>
-              <w:t xml:space="preserve">DECO and GARDEN items that may be considered toys (children’s garden tools, decorative figures, Christmas decorations attractive to children, sandpits, swings). Decide via the toy definition (designed or intended for play by children &lt; 14 years) and the Commission guidance documents.</w:t>
+              <w:t xml:space="preserve"/>
+            </w:r>
+            <w:r>
+              <w:rPr>
+                <w:b/>
+                <w:bCs/>
+                <w:sz w:val="18"/>
+                <w:szCs w:val="18"/>
+              </w:rPr>
+              <w:t xml:space="preserve">Appliances</w:t>
+            </w:r>
+            <w:r>
+              <w:rPr>
+                <w:sz w:val="18"/>
+                <w:szCs w:val="18"/>
+              </w:rPr>
+              <w:t xml:space="preserve"> burning gaseous fuels used for cooking, refrigeration, air-conditioning, space heating, hot-water production, lighting or washing (incl. forced-draught burners and heating bodies).</w:t>
+            </w:r>
+          </w:p>
+          <w:p>
+            <w:pPr>
+              <w:spacing w:after="40"/>
+            </w:pPr>
+            <w:r>
+              <w:rPr>
+                <w:sz w:val="18"/>
+                <w:szCs w:val="18"/>
+              </w:rPr>
+              <w:t xml:space="preserve"/>
+            </w:r>
+            <w:r>
+              <w:rPr>
+                <w:b/>
+                <w:bCs/>
+                <w:sz w:val="18"/>
+                <w:szCs w:val="18"/>
+              </w:rPr>
+              <w:t xml:space="preserve">Fittings</w:t>
+            </w:r>
+            <w:r>
+              <w:rPr>
+                <w:sz w:val="18"/>
+                <w:szCs w:val="18"/>
+              </w:rPr>
+              <w:t xml:space="preserve"> — safety, controlling or regulating devices and their sub-assemblies placed on the market separately (e.g. regulators, valves, flame-supervision devices).</w:t>
+            </w:r>
+          </w:p>
+          <w:p>
+            <w:pPr>
+              <w:spacing w:after="40"/>
+            </w:pPr>
+            <w:r>
+              <w:rPr>
+                <w:sz w:val="18"/>
+                <w:szCs w:val="18"/>
+              </w:rPr>
+              <w:t xml:space="preserve">Excluded: appliances specifically designed for use in industrial processes on industrial premises.</w:t>
             </w:r>
           </w:p>
         </w:tc>
@@ -16084,7 +16462,7 @@
                 <w:sz w:val="18"/>
                 <w:szCs w:val="18"/>
               </w:rPr>
-              <w:t xml:space="preserve">Key points</w:t>
+              <w:t xml:space="preserve">Essential requirements</w:t>
             </w:r>
           </w:p>
         </w:tc>
@@ -16114,7 +16492,7 @@
                 <w:sz w:val="18"/>
                 <w:szCs w:val="18"/>
               </w:rPr>
-              <w:t xml:space="preserve">EN 71 series; chemical limits incl. nitrosamines, allergenic fragrances; new Regulation (published Dec 2025) introduces a Digital Product Passport and a general ban of CMR/endocrine-disruptor/PFAS substances, with a multi-year transition ⚑ VERIFY application date.</w:t>
+              <w:t xml:space="preserve">Annex I: safe design and operation (gas tightness, combustion, flame stability, CO hygiene, ignition, flame-failure safety where required, surface temperatures, materials resistant to gas/heat), rational use of energy, and appliance-specific instructions and warnings.</w:t>
             </w:r>
           </w:p>
         </w:tc>
@@ -16152,7 +16530,7 @@
                 <w:sz w:val="18"/>
                 <w:szCs w:val="18"/>
               </w:rPr>
-              <w:t xml:space="preserve">Escalation</w:t>
+              <w:t xml:space="preserve">Conformity route</w:t>
             </w:r>
           </w:p>
         </w:tc>
@@ -16182,7 +16560,699 @@
                 <w:sz w:val="18"/>
                 <w:szCs w:val="18"/>
               </w:rPr>
-              <w:t xml:space="preserve">Any toy or borderline item → CQAD decision before G2.</w:t>
+              <w:t xml:space="preserve"/>
+            </w:r>
+            <w:r>
+              <w:rPr>
+                <w:b/>
+                <w:bCs/>
+                <w:sz w:val="18"/>
+                <w:szCs w:val="18"/>
+              </w:rPr>
+              <w:t xml:space="preserve">A Notified Body is always required</w:t>
+            </w:r>
+            <w:r>
+              <w:rPr>
+                <w:sz w:val="18"/>
+                <w:szCs w:val="18"/>
+              </w:rPr>
+              <w:t xml:space="preserve"> — no self-declaration.</w:t>
+            </w:r>
+          </w:p>
+          <w:p>
+            <w:pPr>
+              <w:spacing w:after="40"/>
+            </w:pPr>
+            <w:r>
+              <w:rPr>
+                <w:sz w:val="18"/>
+                <w:szCs w:val="18"/>
+              </w:rPr>
+              <w:t xml:space="preserve">Module </w:t>
+            </w:r>
+            <w:r>
+              <w:rPr>
+                <w:b/>
+                <w:bCs/>
+                <w:sz w:val="18"/>
+                <w:szCs w:val="18"/>
+              </w:rPr>
+              <w:t xml:space="preserve">B</w:t>
+            </w:r>
+            <w:r>
+              <w:rPr>
+                <w:sz w:val="18"/>
+                <w:szCs w:val="18"/>
+              </w:rPr>
+              <w:t xml:space="preserve"> (EU type-examination) + one of Module </w:t>
+            </w:r>
+            <w:r>
+              <w:rPr>
+                <w:b/>
+                <w:bCs/>
+                <w:sz w:val="18"/>
+                <w:szCs w:val="18"/>
+              </w:rPr>
+              <w:t xml:space="preserve">C2</w:t>
+            </w:r>
+            <w:r>
+              <w:rPr>
+                <w:sz w:val="18"/>
+                <w:szCs w:val="18"/>
+              </w:rPr>
+              <w:t xml:space="preserve"> (supervised appliance checks at random intervals), </w:t>
+            </w:r>
+            <w:r>
+              <w:rPr>
+                <w:b/>
+                <w:bCs/>
+                <w:sz w:val="18"/>
+                <w:szCs w:val="18"/>
+              </w:rPr>
+              <w:t xml:space="preserve">D</w:t>
+            </w:r>
+            <w:r>
+              <w:rPr>
+                <w:sz w:val="18"/>
+                <w:szCs w:val="18"/>
+              </w:rPr>
+              <w:t xml:space="preserve"> (production QA), </w:t>
+            </w:r>
+            <w:r>
+              <w:rPr>
+                <w:b/>
+                <w:bCs/>
+                <w:sz w:val="18"/>
+                <w:szCs w:val="18"/>
+              </w:rPr>
+              <w:t xml:space="preserve">E</w:t>
+            </w:r>
+            <w:r>
+              <w:rPr>
+                <w:sz w:val="18"/>
+                <w:szCs w:val="18"/>
+              </w:rPr>
+              <w:t xml:space="preserve"> (product QA) or </w:t>
+            </w:r>
+            <w:r>
+              <w:rPr>
+                <w:b/>
+                <w:bCs/>
+                <w:sz w:val="18"/>
+                <w:szCs w:val="18"/>
+              </w:rPr>
+              <w:t xml:space="preserve">F</w:t>
+            </w:r>
+            <w:r>
+              <w:rPr>
+                <w:sz w:val="18"/>
+                <w:szCs w:val="18"/>
+              </w:rPr>
+              <w:t xml:space="preserve"> (product verification).</w:t>
+            </w:r>
+          </w:p>
+          <w:p>
+            <w:pPr>
+              <w:spacing w:after="40"/>
+            </w:pPr>
+            <w:r>
+              <w:rPr>
+                <w:sz w:val="18"/>
+                <w:szCs w:val="18"/>
+              </w:rPr>
+              <w:t xml:space="preserve">EU type-examination certificate: maximum validity </w:t>
+            </w:r>
+            <w:r>
+              <w:rPr>
+                <w:b/>
+                <w:bCs/>
+                <w:sz w:val="18"/>
+                <w:szCs w:val="18"/>
+              </w:rPr>
+              <w:t xml:space="preserve">10 years</w:t>
+            </w:r>
+            <w:r>
+              <w:rPr>
+                <w:sz w:val="18"/>
+                <w:szCs w:val="18"/>
+              </w:rPr>
+              <w:t xml:space="preserve">; re-assessment on any design change or revised harmonised standard.</w:t>
+            </w:r>
+          </w:p>
+        </w:tc>
+      </w:tr>
+      <w:tr>
+        <w:trPr>
+          <w:cantSplit w:val="false"/>
+        </w:trPr>
+        <w:tc>
+          <w:tcPr>
+            <w:tcW w:type="dxa" w:w="2300"/>
+            <w:tcBorders>
+              <w:top w:val="single" w:color="BFBFBF" w:sz="4"/>
+              <w:left w:val="single" w:color="BFBFBF" w:sz="4"/>
+              <w:bottom w:val="single" w:color="BFBFBF" w:sz="4"/>
+              <w:right w:val="single" w:color="BFBFBF" w:sz="4"/>
+            </w:tcBorders>
+            <w:shd w:fill="E8EDF5" w:color="auto" w:val="clear"/>
+            <w:tcMar>
+              <w:top w:type="dxa" w:w="60"/>
+              <w:left w:type="dxa" w:w="100"/>
+              <w:bottom w:type="dxa" w:w="60"/>
+              <w:right w:type="dxa" w:w="100"/>
+            </w:tcMar>
+            <w:vAlign w:val="top"/>
+          </w:tcPr>
+          <w:p>
+            <w:pPr>
+              <w:spacing w:after="40"/>
+            </w:pPr>
+            <w:r>
+              <w:rPr>
+                <w:b/>
+                <w:bCs/>
+                <w:sz w:val="18"/>
+                <w:szCs w:val="18"/>
+              </w:rPr>
+              <w:t xml:space="preserve">Gas conditions</w:t>
+            </w:r>
+          </w:p>
+        </w:tc>
+        <w:tc>
+          <w:tcPr>
+            <w:tcW w:type="dxa" w:w="7338"/>
+            <w:tcBorders>
+              <w:top w:val="single" w:color="BFBFBF" w:sz="4"/>
+              <w:left w:val="single" w:color="BFBFBF" w:sz="4"/>
+              <w:bottom w:val="single" w:color="BFBFBF" w:sz="4"/>
+              <w:right w:val="single" w:color="BFBFBF" w:sz="4"/>
+            </w:tcBorders>
+            <w:tcMar>
+              <w:top w:type="dxa" w:w="60"/>
+              <w:left w:type="dxa" w:w="100"/>
+              <w:bottom w:type="dxa" w:w="60"/>
+              <w:right w:type="dxa" w:w="100"/>
+            </w:tcMar>
+            <w:vAlign w:val="top"/>
+          </w:tcPr>
+          <w:p>
+            <w:pPr>
+              <w:spacing w:after="40"/>
+            </w:pPr>
+            <w:r>
+              <w:rPr>
+                <w:sz w:val="18"/>
+                <w:szCs w:val="18"/>
+              </w:rPr>
+              <w:t xml:space="preserve">The appliance must be designed for the </w:t>
+            </w:r>
+            <w:r>
+              <w:rPr>
+                <w:b/>
+                <w:bCs/>
+                <w:sz w:val="18"/>
+                <w:szCs w:val="18"/>
+              </w:rPr>
+              <w:t xml:space="preserve">gas category and supply pressure of each destination country</w:t>
+            </w:r>
+            <w:r>
+              <w:rPr>
+                <w:sz w:val="18"/>
+                <w:szCs w:val="18"/>
+              </w:rPr>
+              <w:t xml:space="preserve">, as notified by Member States and published by the Commission (OJEU). Typical LPG examples: I3B/P (30 mbar) NL, Nordics; I3B/P (50 mbar) DE, AT, CH; I3+ (28-30/37 mbar) FR, BE, IT, ES, PT, IE ⚑ VERIFY against the current OJEU list for every destination. Regulator, injector and data plate must match.</w:t>
+            </w:r>
+          </w:p>
+        </w:tc>
+      </w:tr>
+      <w:tr>
+        <w:trPr>
+          <w:cantSplit w:val="false"/>
+        </w:trPr>
+        <w:tc>
+          <w:tcPr>
+            <w:tcW w:type="dxa" w:w="2300"/>
+            <w:tcBorders>
+              <w:top w:val="single" w:color="BFBFBF" w:sz="4"/>
+              <w:left w:val="single" w:color="BFBFBF" w:sz="4"/>
+              <w:bottom w:val="single" w:color="BFBFBF" w:sz="4"/>
+              <w:right w:val="single" w:color="BFBFBF" w:sz="4"/>
+            </w:tcBorders>
+            <w:shd w:fill="E8EDF5" w:color="auto" w:val="clear"/>
+            <w:tcMar>
+              <w:top w:type="dxa" w:w="60"/>
+              <w:left w:type="dxa" w:w="100"/>
+              <w:bottom w:type="dxa" w:w="60"/>
+              <w:right w:type="dxa" w:w="100"/>
+            </w:tcMar>
+            <w:vAlign w:val="top"/>
+          </w:tcPr>
+          <w:p>
+            <w:pPr>
+              <w:spacing w:after="40"/>
+            </w:pPr>
+            <w:r>
+              <w:rPr>
+                <w:b/>
+                <w:bCs/>
+                <w:sz w:val="18"/>
+                <w:szCs w:val="18"/>
+              </w:rPr>
+              <w:t xml:space="preserve">Marking &amp; information</w:t>
+            </w:r>
+          </w:p>
+        </w:tc>
+        <w:tc>
+          <w:tcPr>
+            <w:tcW w:type="dxa" w:w="7338"/>
+            <w:tcBorders>
+              <w:top w:val="single" w:color="BFBFBF" w:sz="4"/>
+              <w:left w:val="single" w:color="BFBFBF" w:sz="4"/>
+              <w:bottom w:val="single" w:color="BFBFBF" w:sz="4"/>
+              <w:right w:val="single" w:color="BFBFBF" w:sz="4"/>
+            </w:tcBorders>
+            <w:tcMar>
+              <w:top w:type="dxa" w:w="60"/>
+              <w:left w:type="dxa" w:w="100"/>
+              <w:bottom w:type="dxa" w:w="60"/>
+              <w:right w:type="dxa" w:w="100"/>
+            </w:tcMar>
+            <w:vAlign w:val="top"/>
+          </w:tcPr>
+          <w:p>
+            <w:pPr>
+              <w:spacing w:after="40"/>
+            </w:pPr>
+            <w:r>
+              <w:rPr>
+                <w:sz w:val="18"/>
+                <w:szCs w:val="18"/>
+              </w:rPr>
+              <w:t xml:space="preserve">CE marking + </w:t>
+            </w:r>
+            <w:r>
+              <w:rPr>
+                <w:b/>
+                <w:bCs/>
+                <w:sz w:val="18"/>
+                <w:szCs w:val="18"/>
+              </w:rPr>
+              <w:t xml:space="preserve">NB identification number</w:t>
+            </w:r>
+            <w:r>
+              <w:rPr>
+                <w:sz w:val="18"/>
+                <w:szCs w:val="18"/>
+              </w:rPr>
+              <w:t xml:space="preserve">.</w:t>
+            </w:r>
+          </w:p>
+          <w:p>
+            <w:pPr>
+              <w:spacing w:after="40"/>
+            </w:pPr>
+            <w:r>
+              <w:rPr>
+                <w:sz w:val="18"/>
+                <w:szCs w:val="18"/>
+              </w:rPr>
+              <w:t xml:space="preserve">Data plate: manufacturer and address, trade name/model, appliance category, gas type and supply pressure, </w:t>
+            </w:r>
+            <w:r>
+              <w:rPr>
+                <w:b/>
+                <w:bCs/>
+                <w:sz w:val="18"/>
+                <w:szCs w:val="18"/>
+              </w:rPr>
+              <w:t xml:space="preserve">destination country codes</w:t>
+            </w:r>
+            <w:r>
+              <w:rPr>
+                <w:sz w:val="18"/>
+                <w:szCs w:val="18"/>
+              </w:rPr>
+              <w:t xml:space="preserve">, nominal heat input (kW, and g/h for LPG), injector size where relevant, electricity supply if any.</w:t>
+            </w:r>
+          </w:p>
+          <w:p>
+            <w:pPr>
+              <w:spacing w:after="40"/>
+            </w:pPr>
+            <w:r>
+              <w:rPr>
+                <w:sz w:val="18"/>
+                <w:szCs w:val="18"/>
+              </w:rPr>
+              <w:t xml:space="preserve">Warnings on appliance and packaging: e.g. “Use outdoors only”, “Read the instructions before use”, plus any warnings required by the standard.</w:t>
+            </w:r>
+          </w:p>
+          <w:p>
+            <w:pPr>
+              <w:spacing w:after="40"/>
+            </w:pPr>
+            <w:r>
+              <w:rPr>
+                <w:sz w:val="18"/>
+                <w:szCs w:val="18"/>
+              </w:rPr>
+              <w:t xml:space="preserve">Instructions for installation, use and maintenance in the official language(s) of the destination Member State; EU DoC (or simplified DoC with a web address).</w:t>
+            </w:r>
+          </w:p>
+        </w:tc>
+      </w:tr>
+      <w:tr>
+        <w:trPr>
+          <w:cantSplit w:val="false"/>
+        </w:trPr>
+        <w:tc>
+          <w:tcPr>
+            <w:tcW w:type="dxa" w:w="2300"/>
+            <w:tcBorders>
+              <w:top w:val="single" w:color="BFBFBF" w:sz="4"/>
+              <w:left w:val="single" w:color="BFBFBF" w:sz="4"/>
+              <w:bottom w:val="single" w:color="BFBFBF" w:sz="4"/>
+              <w:right w:val="single" w:color="BFBFBF" w:sz="4"/>
+            </w:tcBorders>
+            <w:shd w:fill="E8EDF5" w:color="auto" w:val="clear"/>
+            <w:tcMar>
+              <w:top w:type="dxa" w:w="60"/>
+              <w:left w:type="dxa" w:w="100"/>
+              <w:bottom w:type="dxa" w:w="60"/>
+              <w:right w:type="dxa" w:w="100"/>
+            </w:tcMar>
+            <w:vAlign w:val="top"/>
+          </w:tcPr>
+          <w:p>
+            <w:pPr>
+              <w:spacing w:after="40"/>
+            </w:pPr>
+            <w:r>
+              <w:rPr>
+                <w:b/>
+                <w:bCs/>
+                <w:sz w:val="18"/>
+                <w:szCs w:val="18"/>
+              </w:rPr>
+              <w:t xml:space="preserve">Common harmonised standards</w:t>
+            </w:r>
+          </w:p>
+        </w:tc>
+        <w:tc>
+          <w:tcPr>
+            <w:tcW w:type="dxa" w:w="7338"/>
+            <w:tcBorders>
+              <w:top w:val="single" w:color="BFBFBF" w:sz="4"/>
+              <w:left w:val="single" w:color="BFBFBF" w:sz="4"/>
+              <w:bottom w:val="single" w:color="BFBFBF" w:sz="4"/>
+              <w:right w:val="single" w:color="BFBFBF" w:sz="4"/>
+            </w:tcBorders>
+            <w:tcMar>
+              <w:top w:type="dxa" w:w="60"/>
+              <w:left w:type="dxa" w:w="100"/>
+              <w:bottom w:type="dxa" w:w="60"/>
+              <w:right w:type="dxa" w:w="100"/>
+            </w:tcMar>
+            <w:vAlign w:val="top"/>
+          </w:tcPr>
+          <w:p>
+            <w:pPr>
+              <w:spacing w:after="40"/>
+            </w:pPr>
+            <w:r>
+              <w:rPr>
+                <w:sz w:val="18"/>
+                <w:szCs w:val="18"/>
+              </w:rPr>
+              <w:t xml:space="preserve">EN 498 (dedicated LPG barbecues for outdoor use) · EN 484 (independent LPG hotplates/grills for outdoor use) · EN 14543 (LPG parasol patio heaters) · EN 521 (portable vapour-pressure LPG appliances, e.g. camping stoves) · EN 449 (flueless LPG space heaters) · EN 16129 (LPG pressure regulators) · EN 16436 (LPG hoses). Gas fire pits / fire tables have no dedicated hEN: the NB assesses them directly against Annex I essential requirements, often using parts of EN 498 / EN 14543 ⚑ VERIFY.</w:t>
+            </w:r>
+          </w:p>
+        </w:tc>
+      </w:tr>
+      <w:tr>
+        <w:trPr>
+          <w:cantSplit w:val="false"/>
+        </w:trPr>
+        <w:tc>
+          <w:tcPr>
+            <w:tcW w:type="dxa" w:w="2300"/>
+            <w:tcBorders>
+              <w:top w:val="single" w:color="BFBFBF" w:sz="4"/>
+              <w:left w:val="single" w:color="BFBFBF" w:sz="4"/>
+              <w:bottom w:val="single" w:color="BFBFBF" w:sz="4"/>
+              <w:right w:val="single" w:color="BFBFBF" w:sz="4"/>
+            </w:tcBorders>
+            <w:shd w:fill="E8EDF5" w:color="auto" w:val="clear"/>
+            <w:tcMar>
+              <w:top w:type="dxa" w:w="60"/>
+              <w:left w:type="dxa" w:w="100"/>
+              <w:bottom w:type="dxa" w:w="60"/>
+              <w:right w:type="dxa" w:w="100"/>
+            </w:tcMar>
+            <w:vAlign w:val="top"/>
+          </w:tcPr>
+          <w:p>
+            <w:pPr>
+              <w:spacing w:after="40"/>
+            </w:pPr>
+            <w:r>
+              <w:rPr>
+                <w:b/>
+                <w:bCs/>
+                <w:sz w:val="18"/>
+                <w:szCs w:val="18"/>
+              </w:rPr>
+              <w:t xml:space="preserve">Related legislation</w:t>
+            </w:r>
+          </w:p>
+        </w:tc>
+        <w:tc>
+          <w:tcPr>
+            <w:tcW w:type="dxa" w:w="7338"/>
+            <w:tcBorders>
+              <w:top w:val="single" w:color="BFBFBF" w:sz="4"/>
+              <w:left w:val="single" w:color="BFBFBF" w:sz="4"/>
+              <w:bottom w:val="single" w:color="BFBFBF" w:sz="4"/>
+              <w:right w:val="single" w:color="BFBFBF" w:sz="4"/>
+            </w:tcBorders>
+            <w:tcMar>
+              <w:top w:type="dxa" w:w="60"/>
+              <w:left w:type="dxa" w:w="100"/>
+              <w:bottom w:type="dxa" w:w="60"/>
+              <w:right w:type="dxa" w:w="100"/>
+            </w:tcMar>
+            <w:vAlign w:val="top"/>
+          </w:tcPr>
+          <w:p>
+            <w:pPr>
+              <w:spacing w:after="40"/>
+            </w:pPr>
+            <w:r>
+              <w:rPr>
+                <w:sz w:val="18"/>
+                <w:szCs w:val="18"/>
+              </w:rPr>
+              <w:t xml:space="preserve">Hoses and regulators supplied with the appliance: check EN 16436 / EN 16129 evidence and the country-specific connection type. LPG cylinders: Transportable Pressure Equipment Directive 2010/35/EU (π marking) — only if we supply cylinders. Indoor gas local space heaters: Ecodesign (EU) 2015/1188 (efficiency, NOx). Electric ignition or lighting: add LVD/EMC, RoHS, Batteries.</w:t>
+            </w:r>
+          </w:p>
+        </w:tc>
+      </w:tr>
+      <w:tr>
+        <w:trPr>
+          <w:cantSplit w:val="false"/>
+        </w:trPr>
+        <w:tc>
+          <w:tcPr>
+            <w:tcW w:type="dxa" w:w="2300"/>
+            <w:tcBorders>
+              <w:top w:val="single" w:color="BFBFBF" w:sz="4"/>
+              <w:left w:val="single" w:color="BFBFBF" w:sz="4"/>
+              <w:bottom w:val="single" w:color="BFBFBF" w:sz="4"/>
+              <w:right w:val="single" w:color="BFBFBF" w:sz="4"/>
+            </w:tcBorders>
+            <w:shd w:fill="E8EDF5" w:color="auto" w:val="clear"/>
+            <w:tcMar>
+              <w:top w:type="dxa" w:w="60"/>
+              <w:left w:type="dxa" w:w="100"/>
+              <w:bottom w:type="dxa" w:w="60"/>
+              <w:right w:type="dxa" w:w="100"/>
+            </w:tcMar>
+            <w:vAlign w:val="top"/>
+          </w:tcPr>
+          <w:p>
+            <w:pPr>
+              <w:spacing w:after="40"/>
+            </w:pPr>
+            <w:r>
+              <w:rPr>
+                <w:b/>
+                <w:bCs/>
+                <w:sz w:val="18"/>
+                <w:szCs w:val="18"/>
+              </w:rPr>
+              <w:t xml:space="preserve">QS evidence check</w:t>
+            </w:r>
+          </w:p>
+        </w:tc>
+        <w:tc>
+          <w:tcPr>
+            <w:tcW w:type="dxa" w:w="7338"/>
+            <w:tcBorders>
+              <w:top w:val="single" w:color="BFBFBF" w:sz="4"/>
+              <w:left w:val="single" w:color="BFBFBF" w:sz="4"/>
+              <w:bottom w:val="single" w:color="BFBFBF" w:sz="4"/>
+              <w:right w:val="single" w:color="BFBFBF" w:sz="4"/>
+            </w:tcBorders>
+            <w:tcMar>
+              <w:top w:type="dxa" w:w="60"/>
+              <w:left w:type="dxa" w:w="100"/>
+              <w:bottom w:type="dxa" w:w="60"/>
+              <w:right w:type="dxa" w:w="100"/>
+            </w:tcMar>
+            <w:vAlign w:val="top"/>
+          </w:tcPr>
+          <w:p>
+            <w:pPr>
+              <w:spacing w:after="40"/>
+            </w:pPr>
+            <w:r>
+              <w:rPr>
+                <w:sz w:val="18"/>
+                <w:szCs w:val="18"/>
+              </w:rPr>
+              <w:t xml:space="preserve">EU type-examination certificate valid on the shipment date, issued by an NB notified for (EU) 2016/426 (check NANDO), and covering the model, heat input, gas categories and </w:t>
+            </w:r>
+            <w:r>
+              <w:rPr>
+                <w:b/>
+                <w:bCs/>
+                <w:sz w:val="18"/>
+                <w:szCs w:val="18"/>
+              </w:rPr>
+              <w:t xml:space="preserve">every destination country</w:t>
+            </w:r>
+            <w:r>
+              <w:rPr>
+                <w:sz w:val="18"/>
+                <w:szCs w:val="18"/>
+              </w:rPr>
+              <w:t xml:space="preserve">.</w:t>
+            </w:r>
+          </w:p>
+          <w:p>
+            <w:pPr>
+              <w:spacing w:after="40"/>
+            </w:pPr>
+            <w:r>
+              <w:rPr>
+                <w:sz w:val="18"/>
+                <w:szCs w:val="18"/>
+              </w:rPr>
+              <w:t xml:space="preserve">Module C2/D/E/F certificate or surveillance report current for the production site.</w:t>
+            </w:r>
+          </w:p>
+          <w:p>
+            <w:pPr>
+              <w:spacing w:after="40"/>
+            </w:pPr>
+            <w:r>
+              <w:rPr>
+                <w:sz w:val="18"/>
+                <w:szCs w:val="18"/>
+              </w:rPr>
+              <w:t xml:space="preserve">Test report to the current EN edition, including leak tightness, combustion (CO), flame stability, surface temperatures and flame-failure device (where required).</w:t>
+            </w:r>
+          </w:p>
+          <w:p>
+            <w:pPr>
+              <w:spacing w:after="40"/>
+            </w:pPr>
+            <w:r>
+              <w:rPr>
+                <w:sz w:val="18"/>
+                <w:szCs w:val="18"/>
+              </w:rPr>
+              <w:t xml:space="preserve">Data plate artwork, regulator pressure and injector size match the certificate for each country SKU.</w:t>
+            </w:r>
+          </w:p>
+          <w:p>
+            <w:pPr>
+              <w:spacing w:after="40"/>
+            </w:pPr>
+            <w:r>
+              <w:rPr>
+                <w:sz w:val="18"/>
+                <w:szCs w:val="18"/>
+              </w:rPr>
+              <w:t xml:space="preserve">On-site FRI: 100 % gas leak test in the production line (QCP), sample check of the regulator and hose, data plate, warnings, ignition and flame-failure device function.</w:t>
+            </w:r>
+          </w:p>
+        </w:tc>
+      </w:tr>
+      <w:tr>
+        <w:trPr>
+          <w:cantSplit w:val="false"/>
+        </w:trPr>
+        <w:tc>
+          <w:tcPr>
+            <w:tcW w:type="dxa" w:w="2300"/>
+            <w:tcBorders>
+              <w:top w:val="single" w:color="BFBFBF" w:sz="4"/>
+              <w:left w:val="single" w:color="BFBFBF" w:sz="4"/>
+              <w:bottom w:val="single" w:color="BFBFBF" w:sz="4"/>
+              <w:right w:val="single" w:color="BFBFBF" w:sz="4"/>
+            </w:tcBorders>
+            <w:shd w:fill="E8EDF5" w:color="auto" w:val="clear"/>
+            <w:tcMar>
+              <w:top w:type="dxa" w:w="60"/>
+              <w:left w:type="dxa" w:w="100"/>
+              <w:bottom w:type="dxa" w:w="60"/>
+              <w:right w:type="dxa" w:w="100"/>
+            </w:tcMar>
+            <w:vAlign w:val="top"/>
+          </w:tcPr>
+          <w:p>
+            <w:pPr>
+              <w:spacing w:after="40"/>
+            </w:pPr>
+            <w:r>
+              <w:rPr>
+                <w:b/>
+                <w:bCs/>
+                <w:sz w:val="18"/>
+                <w:szCs w:val="18"/>
+              </w:rPr>
+              <w:t xml:space="preserve">Common pitfalls</w:t>
+            </w:r>
+          </w:p>
+        </w:tc>
+        <w:tc>
+          <w:tcPr>
+            <w:tcW w:type="dxa" w:w="7338"/>
+            <w:tcBorders>
+              <w:top w:val="single" w:color="BFBFBF" w:sz="4"/>
+              <w:left w:val="single" w:color="BFBFBF" w:sz="4"/>
+              <w:bottom w:val="single" w:color="BFBFBF" w:sz="4"/>
+              <w:right w:val="single" w:color="BFBFBF" w:sz="4"/>
+            </w:tcBorders>
+            <w:tcMar>
+              <w:top w:type="dxa" w:w="60"/>
+              <w:left w:type="dxa" w:w="100"/>
+              <w:bottom w:type="dxa" w:w="60"/>
+              <w:right w:type="dxa" w:w="100"/>
+            </w:tcMar>
+            <w:vAlign w:val="top"/>
+          </w:tcPr>
+          <w:p>
+            <w:pPr>
+              <w:spacing w:after="40"/>
+            </w:pPr>
+            <w:r>
+              <w:rPr>
+                <w:sz w:val="18"/>
+                <w:szCs w:val="18"/>
+              </w:rPr>
+              <w:t xml:space="preserve">Certificate covers DE/AT (50 mbar) but goods are shipped to FR with a 50 mbar regulator; country codes missing on the data plate; heat input on the plate differs from the certificate; EN 498 certificate used for a fire table or patio heater; certificate issued under the old Directive 2009/142/EC and not renewed; a hose or regulator substituted by the factory without NB re-assessment; instructions missing the required language.</w:t>
             </w:r>
           </w:p>
         </w:tc>
@@ -16198,7 +17268,278 @@
         <w:pStyle w:val="Heading2"/>
       </w:pPr>
       <w:r>
-        <w:t xml:space="preserve">4.10 Chemicals and materials</w:t>
+        <w:t xml:space="preserve">4.10 Toys</w:t>
+      </w:r>
+    </w:p>
+    <w:tbl>
+      <w:tblPr>
+        <w:tblW w:type="dxa" w:w="9638"/>
+        <w:tblBorders>
+          <w:top w:val="single" w:color="auto" w:sz="4"/>
+          <w:left w:val="single" w:color="auto" w:sz="4"/>
+          <w:bottom w:val="single" w:color="auto" w:sz="4"/>
+          <w:right w:val="single" w:color="auto" w:sz="4"/>
+          <w:insideH w:val="single" w:color="auto" w:sz="4"/>
+          <w:insideV w:val="single" w:color="auto" w:sz="4"/>
+        </w:tblBorders>
+      </w:tblPr>
+      <w:tblGrid>
+        <w:gridCol w:w="2300"/>
+        <w:gridCol w:w="7338"/>
+      </w:tblGrid>
+      <w:tr>
+        <w:tc>
+          <w:tcPr>
+            <w:tcW w:type="dxa" w:w="9638"/>
+            <w:gridSpan w:val="2"/>
+            <w:tcBorders>
+              <w:top w:val="single" w:color="BFBFBF" w:sz="4"/>
+              <w:left w:val="single" w:color="BFBFBF" w:sz="4"/>
+              <w:bottom w:val="single" w:color="BFBFBF" w:sz="4"/>
+              <w:right w:val="single" w:color="BFBFBF" w:sz="4"/>
+            </w:tcBorders>
+            <w:shd w:fill="1F3864" w:color="auto" w:val="clear"/>
+            <w:tcMar>
+              <w:top w:type="dxa" w:w="60"/>
+              <w:left w:type="dxa" w:w="100"/>
+              <w:bottom w:type="dxa" w:w="60"/>
+              <w:right w:type="dxa" w:w="100"/>
+            </w:tcMar>
+            <w:vAlign w:val="top"/>
+          </w:tcPr>
+          <w:p>
+            <w:pPr>
+              <w:spacing w:after="40"/>
+            </w:pPr>
+            <w:r>
+              <w:rPr>
+                <w:b/>
+                <w:bCs/>
+                <w:color w:val="FFFFFF"/>
+                <w:sz w:val="18"/>
+                <w:szCs w:val="18"/>
+              </w:rPr>
+              <w:t xml:space="preserve">Directive 2009/48/EC → Regulation (EU) 2025/2509</w:t>
+            </w:r>
+          </w:p>
+        </w:tc>
+      </w:tr>
+      <w:tr>
+        <w:trPr>
+          <w:cantSplit w:val="false"/>
+        </w:trPr>
+        <w:tc>
+          <w:tcPr>
+            <w:tcW w:type="dxa" w:w="2300"/>
+            <w:tcBorders>
+              <w:top w:val="single" w:color="BFBFBF" w:sz="4"/>
+              <w:left w:val="single" w:color="BFBFBF" w:sz="4"/>
+              <w:bottom w:val="single" w:color="BFBFBF" w:sz="4"/>
+              <w:right w:val="single" w:color="BFBFBF" w:sz="4"/>
+            </w:tcBorders>
+            <w:shd w:fill="E8EDF5" w:color="auto" w:val="clear"/>
+            <w:tcMar>
+              <w:top w:type="dxa" w:w="60"/>
+              <w:left w:type="dxa" w:w="100"/>
+              <w:bottom w:type="dxa" w:w="60"/>
+              <w:right w:type="dxa" w:w="100"/>
+            </w:tcMar>
+            <w:vAlign w:val="top"/>
+          </w:tcPr>
+          <w:p>
+            <w:pPr>
+              <w:spacing w:after="40"/>
+            </w:pPr>
+            <w:r>
+              <w:rPr>
+                <w:b/>
+                <w:bCs/>
+                <w:sz w:val="18"/>
+                <w:szCs w:val="18"/>
+              </w:rPr>
+              <w:t xml:space="preserve">Relevance</w:t>
+            </w:r>
+          </w:p>
+        </w:tc>
+        <w:tc>
+          <w:tcPr>
+            <w:tcW w:type="dxa" w:w="7338"/>
+            <w:tcBorders>
+              <w:top w:val="single" w:color="BFBFBF" w:sz="4"/>
+              <w:left w:val="single" w:color="BFBFBF" w:sz="4"/>
+              <w:bottom w:val="single" w:color="BFBFBF" w:sz="4"/>
+              <w:right w:val="single" w:color="BFBFBF" w:sz="4"/>
+            </w:tcBorders>
+            <w:tcMar>
+              <w:top w:type="dxa" w:w="60"/>
+              <w:left w:type="dxa" w:w="100"/>
+              <w:bottom w:type="dxa" w:w="60"/>
+              <w:right w:type="dxa" w:w="100"/>
+            </w:tcMar>
+            <w:vAlign w:val="top"/>
+          </w:tcPr>
+          <w:p>
+            <w:pPr>
+              <w:spacing w:after="40"/>
+            </w:pPr>
+            <w:r>
+              <w:rPr>
+                <w:sz w:val="18"/>
+                <w:szCs w:val="18"/>
+              </w:rPr>
+              <w:t xml:space="preserve">DECO and GARDEN items that may be considered toys (children’s garden tools, decorative figures, Christmas decorations attractive to children, sandpits, swings). Decide via the toy definition (designed or intended for play by children &lt; 14 years) and the Commission guidance documents.</w:t>
+            </w:r>
+          </w:p>
+        </w:tc>
+      </w:tr>
+      <w:tr>
+        <w:trPr>
+          <w:cantSplit w:val="false"/>
+        </w:trPr>
+        <w:tc>
+          <w:tcPr>
+            <w:tcW w:type="dxa" w:w="2300"/>
+            <w:tcBorders>
+              <w:top w:val="single" w:color="BFBFBF" w:sz="4"/>
+              <w:left w:val="single" w:color="BFBFBF" w:sz="4"/>
+              <w:bottom w:val="single" w:color="BFBFBF" w:sz="4"/>
+              <w:right w:val="single" w:color="BFBFBF" w:sz="4"/>
+            </w:tcBorders>
+            <w:shd w:fill="E8EDF5" w:color="auto" w:val="clear"/>
+            <w:tcMar>
+              <w:top w:type="dxa" w:w="60"/>
+              <w:left w:type="dxa" w:w="100"/>
+              <w:bottom w:type="dxa" w:w="60"/>
+              <w:right w:type="dxa" w:w="100"/>
+            </w:tcMar>
+            <w:vAlign w:val="top"/>
+          </w:tcPr>
+          <w:p>
+            <w:pPr>
+              <w:spacing w:after="40"/>
+            </w:pPr>
+            <w:r>
+              <w:rPr>
+                <w:b/>
+                <w:bCs/>
+                <w:sz w:val="18"/>
+                <w:szCs w:val="18"/>
+              </w:rPr>
+              <w:t xml:space="preserve">Key points</w:t>
+            </w:r>
+          </w:p>
+        </w:tc>
+        <w:tc>
+          <w:tcPr>
+            <w:tcW w:type="dxa" w:w="7338"/>
+            <w:tcBorders>
+              <w:top w:val="single" w:color="BFBFBF" w:sz="4"/>
+              <w:left w:val="single" w:color="BFBFBF" w:sz="4"/>
+              <w:bottom w:val="single" w:color="BFBFBF" w:sz="4"/>
+              <w:right w:val="single" w:color="BFBFBF" w:sz="4"/>
+            </w:tcBorders>
+            <w:tcMar>
+              <w:top w:type="dxa" w:w="60"/>
+              <w:left w:type="dxa" w:w="100"/>
+              <w:bottom w:type="dxa" w:w="60"/>
+              <w:right w:type="dxa" w:w="100"/>
+            </w:tcMar>
+            <w:vAlign w:val="top"/>
+          </w:tcPr>
+          <w:p>
+            <w:pPr>
+              <w:spacing w:after="40"/>
+            </w:pPr>
+            <w:r>
+              <w:rPr>
+                <w:sz w:val="18"/>
+                <w:szCs w:val="18"/>
+              </w:rPr>
+              <w:t xml:space="preserve">EN 71 series; chemical limits incl. nitrosamines, allergenic fragrances; new Regulation (published Dec 2025) introduces a Digital Product Passport and a general ban of CMR/endocrine-disruptor/PFAS substances, with a multi-year transition ⚑ VERIFY application date.</w:t>
+            </w:r>
+          </w:p>
+        </w:tc>
+      </w:tr>
+      <w:tr>
+        <w:trPr>
+          <w:cantSplit w:val="false"/>
+        </w:trPr>
+        <w:tc>
+          <w:tcPr>
+            <w:tcW w:type="dxa" w:w="2300"/>
+            <w:tcBorders>
+              <w:top w:val="single" w:color="BFBFBF" w:sz="4"/>
+              <w:left w:val="single" w:color="BFBFBF" w:sz="4"/>
+              <w:bottom w:val="single" w:color="BFBFBF" w:sz="4"/>
+              <w:right w:val="single" w:color="BFBFBF" w:sz="4"/>
+            </w:tcBorders>
+            <w:shd w:fill="E8EDF5" w:color="auto" w:val="clear"/>
+            <w:tcMar>
+              <w:top w:type="dxa" w:w="60"/>
+              <w:left w:type="dxa" w:w="100"/>
+              <w:bottom w:type="dxa" w:w="60"/>
+              <w:right w:type="dxa" w:w="100"/>
+            </w:tcMar>
+            <w:vAlign w:val="top"/>
+          </w:tcPr>
+          <w:p>
+            <w:pPr>
+              <w:spacing w:after="40"/>
+            </w:pPr>
+            <w:r>
+              <w:rPr>
+                <w:b/>
+                <w:bCs/>
+                <w:sz w:val="18"/>
+                <w:szCs w:val="18"/>
+              </w:rPr>
+              <w:t xml:space="preserve">Escalation</w:t>
+            </w:r>
+          </w:p>
+        </w:tc>
+        <w:tc>
+          <w:tcPr>
+            <w:tcW w:type="dxa" w:w="7338"/>
+            <w:tcBorders>
+              <w:top w:val="single" w:color="BFBFBF" w:sz="4"/>
+              <w:left w:val="single" w:color="BFBFBF" w:sz="4"/>
+              <w:bottom w:val="single" w:color="BFBFBF" w:sz="4"/>
+              <w:right w:val="single" w:color="BFBFBF" w:sz="4"/>
+            </w:tcBorders>
+            <w:tcMar>
+              <w:top w:type="dxa" w:w="60"/>
+              <w:left w:type="dxa" w:w="100"/>
+              <w:bottom w:type="dxa" w:w="60"/>
+              <w:right w:type="dxa" w:w="100"/>
+            </w:tcMar>
+            <w:vAlign w:val="top"/>
+          </w:tcPr>
+          <w:p>
+            <w:pPr>
+              <w:spacing w:after="40"/>
+            </w:pPr>
+            <w:r>
+              <w:rPr>
+                <w:sz w:val="18"/>
+                <w:szCs w:val="18"/>
+              </w:rPr>
+              <w:t xml:space="preserve">Any toy or borderline item → CQAD decision before G2.</w:t>
+            </w:r>
+          </w:p>
+        </w:tc>
+      </w:tr>
+    </w:tbl>
+    <w:p>
+      <w:pPr>
+        <w:spacing w:after="60"/>
+      </w:pPr>
+    </w:p>
+    <w:p>
+      <w:pPr>
+        <w:pStyle w:val="Heading2"/>
+      </w:pPr>
+      <w:r>
+        <w:t xml:space="preserve">4.11 Chemicals and materials</w:t>
       </w:r>
     </w:p>
     <w:tbl>
@@ -16931,7 +18272,7 @@
         <w:pStyle w:val="Heading2"/>
       </w:pPr>
       <w:r>
-        <w:t xml:space="preserve">4.11 Packaging — PPWR (EU) 2025/40</w:t>
+        <w:t xml:space="preserve">4.12 Packaging — PPWR (EU) 2025/40</w:t>
       </w:r>
     </w:p>
     <w:tbl>
@@ -17314,7 +18655,7 @@
         <w:pStyle w:val="Heading2"/>
       </w:pPr>
       <w:r>
-        <w:t xml:space="preserve">4.12 EU Deforestation Regulation — EUDR (EU) 2023/1115</w:t>
+        <w:t xml:space="preserve">4.13 EU Deforestation Regulation — EUDR (EU) 2023/1115</w:t>
       </w:r>
     </w:p>
     <w:tbl>
@@ -17701,7 +19042,7 @@
         <w:pStyle w:val="Heading2"/>
       </w:pPr>
       <w:r>
-        <w:t xml:space="preserve">4.13 Carbon Border Adjustment Mechanism — CBAM (EU) 2023/956</w:t>
+        <w:t xml:space="preserve">4.14 Carbon Border Adjustment Mechanism — CBAM (EU) 2023/956</w:t>
       </w:r>
     </w:p>
     <w:tbl>
@@ -18088,7 +19429,7 @@
         <w:pStyle w:val="Heading2"/>
       </w:pPr>
       <w:r>
-        <w:t xml:space="preserve">4.14 EEA-3 and Switzerland</w:t>
+        <w:t xml:space="preserve">4.15 EEA-3 and Switzerland</w:t>
       </w:r>
     </w:p>
     <w:p>
@@ -18134,7 +19475,7 @@
         <w:t xml:space="preserve">Switzerland:</w:t>
       </w:r>
       <w:r>
-        <w:t xml:space="preserve"> Product Safety Act (PrSG/LSPro) and sector ordinances aligned with EU directives; EU–CH MRA covers many sectors (but no longer Medical Devices). Chemicals under ChemRRV/ORRChim (not REACH directly); batteries under ChemRRV Annex 2.15 — not the EU Battery Regulation. CE-marked products are generally accepted; labelling in DE/FR/IT according to the language region.</w:t>
+        <w:t xml:space="preserve"> Product Safety Act (PrSG/LSPro) and sector ordinances aligned with EU directives; EU–CH MRA covers many sectors (but no longer Medical Devices). Chemicals under ChemRRV/ORRChim (not REACH directly); batteries under ChemRRV Annex 2.15 — not the EU Battery Regulation. Gas appliances: covered by the EU–CH MRA (EU type-examination accepted); Swiss gas conditions are LPG 50 mbar — SVGW/SSIGE requirements may apply for installation ⚑ VERIFY. CE-marked products are generally accepted; labelling in DE/FR/IT according to the language region.</w:t>
       </w:r>
     </w:p>
     <w:p>
@@ -18155,7 +19496,7 @@
         <w:pStyle w:val="Heading2"/>
       </w:pPr>
       <w:r>
-        <w:t xml:space="preserve">4.15 United States</w:t>
+        <w:t xml:space="preserve">4.16 United States</w:t>
       </w:r>
     </w:p>
     <w:tbl>
@@ -18673,7 +20014,7 @@
                 <w:sz w:val="18"/>
                 <w:szCs w:val="18"/>
               </w:rPr>
-              <w:t xml:space="preserve">Wood / forced labour</w:t>
+              <w:t xml:space="preserve">Gas appliances</w:t>
             </w:r>
           </w:p>
         </w:tc>
@@ -18703,7 +20044,7 @@
                 <w:sz w:val="18"/>
                 <w:szCs w:val="18"/>
               </w:rPr>
-              <w:t xml:space="preserve">Lacey Act (PPQ 505 declaration — genus, species, country of harvest); UFLPA (rebuttable presumption for Xinjiang inputs) — trace cotton, PVC, aluminium, polysilicon.</w:t>
+              <w:t xml:space="preserve">Certification by an accredited body (CSA, ETL/Intertek, IAPMO): ANSI Z21.58/CSA 1.6 (outdoor cooking gas appliances), ANSI Z83.26/CSA 2.37 (outdoor gas patio heaters), ANSI Z21.97/CSA 2.41 (outdoor decorative gas appliances — fire pits); propane cylinders to DOT 49 CFR with OPD valve ⚑ VERIFY.</w:t>
             </w:r>
           </w:p>
         </w:tc>
@@ -18739,7 +20080,7 @@
                 <w:sz w:val="18"/>
                 <w:szCs w:val="18"/>
               </w:rPr>
-              <w:t xml:space="preserve">PPE</w:t>
+              <w:t xml:space="preserve">Wood / forced labour</w:t>
             </w:r>
           </w:p>
         </w:tc>
@@ -18770,7 +20111,7 @@
                 <w:sz w:val="18"/>
                 <w:szCs w:val="18"/>
               </w:rPr>
-              <w:t xml:space="preserve">OSHA references ANSI/ISEA standards (Z87.1 eyewear, ISEA 105 gloves); NIOSH approval for respirators.</w:t>
+              <w:t xml:space="preserve">Lacey Act (PPQ 505 declaration — genus, species, country of harvest); UFLPA (rebuttable presumption for Xinjiang inputs) — trace cotton, PVC, aluminium, polysilicon.</w:t>
             </w:r>
           </w:p>
         </w:tc>
@@ -18805,6 +20146,72 @@
                 <w:sz w:val="18"/>
                 <w:szCs w:val="18"/>
               </w:rPr>
+              <w:t xml:space="preserve">PPE</w:t>
+            </w:r>
+          </w:p>
+        </w:tc>
+        <w:tc>
+          <w:tcPr>
+            <w:tcW w:type="dxa" w:w="7438"/>
+            <w:tcBorders>
+              <w:top w:val="single" w:color="BFBFBF" w:sz="4"/>
+              <w:left w:val="single" w:color="BFBFBF" w:sz="4"/>
+              <w:bottom w:val="single" w:color="BFBFBF" w:sz="4"/>
+              <w:right w:val="single" w:color="BFBFBF" w:sz="4"/>
+            </w:tcBorders>
+            <w:tcMar>
+              <w:top w:type="dxa" w:w="60"/>
+              <w:left w:type="dxa" w:w="100"/>
+              <w:bottom w:type="dxa" w:w="60"/>
+              <w:right w:type="dxa" w:w="100"/>
+            </w:tcMar>
+            <w:vAlign w:val="top"/>
+          </w:tcPr>
+          <w:p>
+            <w:pPr>
+              <w:spacing w:after="40"/>
+            </w:pPr>
+            <w:r>
+              <w:rPr>
+                <w:sz w:val="18"/>
+                <w:szCs w:val="18"/>
+              </w:rPr>
+              <w:t xml:space="preserve">OSHA references ANSI/ISEA standards (Z87.1 eyewear, ISEA 105 gloves); NIOSH approval for respirators.</w:t>
+            </w:r>
+          </w:p>
+        </w:tc>
+      </w:tr>
+      <w:tr>
+        <w:trPr>
+          <w:cantSplit/>
+        </w:trPr>
+        <w:tc>
+          <w:tcPr>
+            <w:tcW w:type="dxa" w:w="2200"/>
+            <w:tcBorders>
+              <w:top w:val="single" w:color="BFBFBF" w:sz="4"/>
+              <w:left w:val="single" w:color="BFBFBF" w:sz="4"/>
+              <w:bottom w:val="single" w:color="BFBFBF" w:sz="4"/>
+              <w:right w:val="single" w:color="BFBFBF" w:sz="4"/>
+            </w:tcBorders>
+            <w:shd w:fill="F5F7FA" w:color="auto" w:val="clear"/>
+            <w:tcMar>
+              <w:top w:type="dxa" w:w="60"/>
+              <w:left w:type="dxa" w:w="100"/>
+              <w:bottom w:type="dxa" w:w="60"/>
+              <w:right w:type="dxa" w:w="100"/>
+            </w:tcMar>
+            <w:vAlign w:val="top"/>
+          </w:tcPr>
+          <w:p>
+            <w:pPr>
+              <w:spacing w:after="40"/>
+            </w:pPr>
+            <w:r>
+              <w:rPr>
+                <w:sz w:val="18"/>
+                <w:szCs w:val="18"/>
+              </w:rPr>
               <w:t xml:space="preserve">Labelling</w:t>
             </w:r>
           </w:p>
@@ -18818,6 +20225,7 @@
               <w:bottom w:val="single" w:color="BFBFBF" w:sz="4"/>
               <w:right w:val="single" w:color="BFBFBF" w:sz="4"/>
             </w:tcBorders>
+            <w:shd w:fill="F5F7FA" w:color="auto" w:val="clear"/>
             <w:tcMar>
               <w:top w:type="dxa" w:w="60"/>
               <w:left w:type="dxa" w:w="100"/>
@@ -18851,7 +20259,7 @@
         <w:pStyle w:val="Heading2"/>
       </w:pPr>
       <w:r>
-        <w:t xml:space="preserve">4.16 Canada</w:t>
+        <w:t xml:space="preserve">4.17 Canada</w:t>
       </w:r>
     </w:p>
     <w:tbl>
@@ -19335,6 +20743,71 @@
                 <w:szCs w:val="18"/>
               </w:rPr>
               <w:t xml:space="preserve">Provincial EPR / stewardship programs; TDG for transport (UN 38.3).</w:t>
+            </w:r>
+          </w:p>
+        </w:tc>
+      </w:tr>
+      <w:tr>
+        <w:trPr>
+          <w:cantSplit/>
+        </w:trPr>
+        <w:tc>
+          <w:tcPr>
+            <w:tcW w:type="dxa" w:w="2200"/>
+            <w:tcBorders>
+              <w:top w:val="single" w:color="BFBFBF" w:sz="4"/>
+              <w:left w:val="single" w:color="BFBFBF" w:sz="4"/>
+              <w:bottom w:val="single" w:color="BFBFBF" w:sz="4"/>
+              <w:right w:val="single" w:color="BFBFBF" w:sz="4"/>
+            </w:tcBorders>
+            <w:tcMar>
+              <w:top w:type="dxa" w:w="60"/>
+              <w:left w:type="dxa" w:w="100"/>
+              <w:bottom w:type="dxa" w:w="60"/>
+              <w:right w:type="dxa" w:w="100"/>
+            </w:tcMar>
+            <w:vAlign w:val="top"/>
+          </w:tcPr>
+          <w:p>
+            <w:pPr>
+              <w:spacing w:after="40"/>
+            </w:pPr>
+            <w:r>
+              <w:rPr>
+                <w:sz w:val="18"/>
+                <w:szCs w:val="18"/>
+              </w:rPr>
+              <w:t xml:space="preserve">Gas appliances</w:t>
+            </w:r>
+          </w:p>
+        </w:tc>
+        <w:tc>
+          <w:tcPr>
+            <w:tcW w:type="dxa" w:w="7438"/>
+            <w:tcBorders>
+              <w:top w:val="single" w:color="BFBFBF" w:sz="4"/>
+              <w:left w:val="single" w:color="BFBFBF" w:sz="4"/>
+              <w:bottom w:val="single" w:color="BFBFBF" w:sz="4"/>
+              <w:right w:val="single" w:color="BFBFBF" w:sz="4"/>
+            </w:tcBorders>
+            <w:tcMar>
+              <w:top w:type="dxa" w:w="60"/>
+              <w:left w:type="dxa" w:w="100"/>
+              <w:bottom w:type="dxa" w:w="60"/>
+              <w:right w:type="dxa" w:w="100"/>
+            </w:tcMar>
+            <w:vAlign w:val="top"/>
+          </w:tcPr>
+          <w:p>
+            <w:pPr>
+              <w:spacing w:after="40"/>
+            </w:pPr>
+            <w:r>
+              <w:rPr>
+                <w:sz w:val="18"/>
+                <w:szCs w:val="18"/>
+              </w:rPr>
+              <w:t xml:space="preserve">Certification mandatory under provincial gas codes (e.g. TSSA in Ontario) by an SCC-accredited body — CSA/ANSI bi-national standards as for the US; CSA B149 installation code; bilingual warnings.</w:t>
             </w:r>
           </w:p>
         </w:tc>
@@ -22960,7 +24433,7 @@
                 <w:sz w:val="18"/>
                 <w:szCs w:val="18"/>
               </w:rPr>
-              <w:t xml:space="preserve">Hi-pot failure, sharp edge, missing guard, wrong/missing CE or NB number, missing battery label elements, unsafe plug, missing mandatory warnings</w:t>
+              <w:t xml:space="preserve">Hi-pot or gas leak-test failure, wrong gas regulator/pressure for destination country, sharp edge, missing guard, wrong/missing CE or NB number, missing battery label elements, unsafe plug, missing mandatory warnings</w:t>
             </w:r>
           </w:p>
         </w:tc>
@@ -24246,7 +25719,7 @@
         <w:spacing w:after="60"/>
       </w:pPr>
       <w:r>
-        <w:t xml:space="preserve">For CPR: FPC manual and NB certificates; for PPE: EU-TEC and Module C2/D; for batteries: cell supplier list with UN 38.3 &amp; IEC 62133-2 reports.</w:t>
+        <w:t xml:space="preserve">For CPR: FPC manual and NB certificates; for PPE: EU-TEC and Module C2/D; for gas appliances: GAR EU-TEC and Module C2/D/E/F certificate; for batteries: cell supplier list with UN 38.3 &amp; IEC 62133-2 reports.</w:t>
       </w:r>
     </w:p>
     <w:p>
@@ -25076,7 +26549,7 @@
                 <w:sz w:val="18"/>
                 <w:szCs w:val="18"/>
               </w:rPr>
-              <w:t xml:space="preserve">Technical documentation, DoC (Machinery, LVD, EMC, RED, RoHS, PPE, Toys, Batteries)</w:t>
+              <w:t xml:space="preserve">Technical documentation, DoC (Machinery, LVD, EMC, RED, RoHS, PPE, Gas Appliances, Toys, Batteries)</w:t>
             </w:r>
           </w:p>
         </w:tc>
@@ -27567,7 +29040,7 @@
                 <w:sz w:val="18"/>
                 <w:szCs w:val="18"/>
               </w:rPr>
-              <w:t xml:space="preserve">Can a DoP declare “NPD” for every essential characteristic? Explain.</w:t>
+              <w:t xml:space="preserve">Can a gas barbecue be placed on the EU market on the basis of the manufacturer’s self-declaration? Which modules apply?</w:t>
             </w:r>
           </w:p>
         </w:tc>
@@ -27662,7 +29135,7 @@
                 <w:sz w:val="18"/>
                 <w:szCs w:val="18"/>
               </w:rPr>
-              <w:t xml:space="preserve">What is the formaldehyde emission limit for furniture under REACH Annex XVII entry 77 and from when?</w:t>
+              <w:t xml:space="preserve">A gas patio heater certified for DE/AT is ordered for France. What must the QS check before shipment?</w:t>
             </w:r>
           </w:p>
         </w:tc>
@@ -27760,7 +29233,7 @@
                 <w:sz w:val="18"/>
                 <w:szCs w:val="18"/>
               </w:rPr>
-              <w:t xml:space="preserve">What geolocation data does the EUDR require and how long must records be kept?</w:t>
+              <w:t xml:space="preserve">Can a DoP declare “NPD” for every essential characteristic? Explain.</w:t>
             </w:r>
           </w:p>
         </w:tc>
@@ -27855,7 +29328,7 @@
                 <w:sz w:val="18"/>
                 <w:szCs w:val="18"/>
               </w:rPr>
-              <w:t xml:space="preserve">What is the CBAM de-minimis threshold in the definitive period?</w:t>
+              <w:t xml:space="preserve">What is the formaldehyde emission limit for furniture under REACH Annex XVII entry 77 and from when?</w:t>
             </w:r>
           </w:p>
         </w:tc>
@@ -27953,7 +29426,7 @@
                 <w:sz w:val="18"/>
                 <w:szCs w:val="18"/>
               </w:rPr>
-              <w:t xml:space="preserve">When does PPWR apply and what is the heavy-metal limit in packaging?</w:t>
+              <w:t xml:space="preserve">What geolocation data does the EUDR require and how long must records be kept?</w:t>
             </w:r>
           </w:p>
         </w:tc>
@@ -28018,7 +29491,7 @@
                 <w:sz w:val="18"/>
                 <w:szCs w:val="18"/>
               </w:rPr>
-              <w:t xml:space="preserve">C</w:t>
+              <w:t xml:space="preserve">B</w:t>
             </w:r>
           </w:p>
         </w:tc>
@@ -28048,7 +29521,7 @@
                 <w:sz w:val="18"/>
                 <w:szCs w:val="18"/>
               </w:rPr>
-              <w:t xml:space="preserve">Which Swiss instrument governs batteries and chemical restrictions instead of EU law?</w:t>
+              <w:t xml:space="preserve">What is the CBAM de-minimis threshold in the definitive period?</w:t>
             </w:r>
           </w:p>
         </w:tc>
@@ -28115,7 +29588,7 @@
                 <w:sz w:val="18"/>
                 <w:szCs w:val="18"/>
               </w:rPr>
-              <w:t xml:space="preserve">C</w:t>
+              <w:t xml:space="preserve">B</w:t>
             </w:r>
           </w:p>
         </w:tc>
@@ -28146,7 +29619,7 @@
                 <w:sz w:val="18"/>
                 <w:szCs w:val="18"/>
               </w:rPr>
-              <w:t xml:space="preserve">What is the US lead limit in substrate for children’s products and which certificate is required?</w:t>
+              <w:t xml:space="preserve">When does PPWR apply and what is the heavy-metal limit in packaging?</w:t>
             </w:r>
           </w:p>
         </w:tc>
@@ -28241,7 +29714,7 @@
                 <w:sz w:val="18"/>
                 <w:szCs w:val="18"/>
               </w:rPr>
-              <w:t xml:space="preserve">Which Canadian law requires incident reporting within 2 days?</w:t>
+              <w:t xml:space="preserve">Which Swiss instrument governs batteries and chemical restrictions instead of EU law?</w:t>
             </w:r>
           </w:p>
         </w:tc>
@@ -28278,6 +29751,199 @@
                 <w:szCs w:val="18"/>
               </w:rPr>
               <w:t xml:space="preserve">20</w:t>
+            </w:r>
+          </w:p>
+        </w:tc>
+        <w:tc>
+          <w:tcPr>
+            <w:tcW w:type="dxa" w:w="900"/>
+            <w:tcBorders>
+              <w:top w:val="single" w:color="BFBFBF" w:sz="4"/>
+              <w:left w:val="single" w:color="BFBFBF" w:sz="4"/>
+              <w:bottom w:val="single" w:color="BFBFBF" w:sz="4"/>
+              <w:right w:val="single" w:color="BFBFBF" w:sz="4"/>
+            </w:tcBorders>
+            <w:shd w:fill="F5F7FA" w:color="auto" w:val="clear"/>
+            <w:tcMar>
+              <w:top w:type="dxa" w:w="60"/>
+              <w:left w:type="dxa" w:w="100"/>
+              <w:bottom w:type="dxa" w:w="60"/>
+              <w:right w:type="dxa" w:w="100"/>
+            </w:tcMar>
+            <w:vAlign w:val="top"/>
+          </w:tcPr>
+          <w:p>
+            <w:pPr>
+              <w:spacing w:after="40"/>
+            </w:pPr>
+            <w:r>
+              <w:rPr>
+                <w:sz w:val="18"/>
+                <w:szCs w:val="18"/>
+              </w:rPr>
+              <w:t xml:space="preserve">C</w:t>
+            </w:r>
+          </w:p>
+        </w:tc>
+        <w:tc>
+          <w:tcPr>
+            <w:tcW w:type="dxa" w:w="8138"/>
+            <w:tcBorders>
+              <w:top w:val="single" w:color="BFBFBF" w:sz="4"/>
+              <w:left w:val="single" w:color="BFBFBF" w:sz="4"/>
+              <w:bottom w:val="single" w:color="BFBFBF" w:sz="4"/>
+              <w:right w:val="single" w:color="BFBFBF" w:sz="4"/>
+            </w:tcBorders>
+            <w:shd w:fill="F5F7FA" w:color="auto" w:val="clear"/>
+            <w:tcMar>
+              <w:top w:type="dxa" w:w="60"/>
+              <w:left w:type="dxa" w:w="100"/>
+              <w:bottom w:type="dxa" w:w="60"/>
+              <w:right w:type="dxa" w:w="100"/>
+            </w:tcMar>
+            <w:vAlign w:val="top"/>
+          </w:tcPr>
+          <w:p>
+            <w:pPr>
+              <w:spacing w:after="40"/>
+            </w:pPr>
+            <w:r>
+              <w:rPr>
+                <w:sz w:val="18"/>
+                <w:szCs w:val="18"/>
+              </w:rPr>
+              <w:t xml:space="preserve">What is the US lead limit in substrate for children’s products and which certificate is required?</w:t>
+            </w:r>
+          </w:p>
+        </w:tc>
+      </w:tr>
+      <w:tr>
+        <w:trPr>
+          <w:cantSplit/>
+        </w:trPr>
+        <w:tc>
+          <w:tcPr>
+            <w:tcW w:type="dxa" w:w="600"/>
+            <w:tcBorders>
+              <w:top w:val="single" w:color="BFBFBF" w:sz="4"/>
+              <w:left w:val="single" w:color="BFBFBF" w:sz="4"/>
+              <w:bottom w:val="single" w:color="BFBFBF" w:sz="4"/>
+              <w:right w:val="single" w:color="BFBFBF" w:sz="4"/>
+            </w:tcBorders>
+            <w:tcMar>
+              <w:top w:type="dxa" w:w="60"/>
+              <w:left w:type="dxa" w:w="100"/>
+              <w:bottom w:type="dxa" w:w="60"/>
+              <w:right w:type="dxa" w:w="100"/>
+            </w:tcMar>
+            <w:vAlign w:val="top"/>
+          </w:tcPr>
+          <w:p>
+            <w:pPr>
+              <w:spacing w:after="40"/>
+            </w:pPr>
+            <w:r>
+              <w:rPr>
+                <w:sz w:val="18"/>
+                <w:szCs w:val="18"/>
+              </w:rPr>
+              <w:t xml:space="preserve">21</w:t>
+            </w:r>
+          </w:p>
+        </w:tc>
+        <w:tc>
+          <w:tcPr>
+            <w:tcW w:type="dxa" w:w="900"/>
+            <w:tcBorders>
+              <w:top w:val="single" w:color="BFBFBF" w:sz="4"/>
+              <w:left w:val="single" w:color="BFBFBF" w:sz="4"/>
+              <w:bottom w:val="single" w:color="BFBFBF" w:sz="4"/>
+              <w:right w:val="single" w:color="BFBFBF" w:sz="4"/>
+            </w:tcBorders>
+            <w:tcMar>
+              <w:top w:type="dxa" w:w="60"/>
+              <w:left w:type="dxa" w:w="100"/>
+              <w:bottom w:type="dxa" w:w="60"/>
+              <w:right w:type="dxa" w:w="100"/>
+            </w:tcMar>
+            <w:vAlign w:val="top"/>
+          </w:tcPr>
+          <w:p>
+            <w:pPr>
+              <w:spacing w:after="40"/>
+            </w:pPr>
+            <w:r>
+              <w:rPr>
+                <w:sz w:val="18"/>
+                <w:szCs w:val="18"/>
+              </w:rPr>
+              <w:t xml:space="preserve">C</w:t>
+            </w:r>
+          </w:p>
+        </w:tc>
+        <w:tc>
+          <w:tcPr>
+            <w:tcW w:type="dxa" w:w="8138"/>
+            <w:tcBorders>
+              <w:top w:val="single" w:color="BFBFBF" w:sz="4"/>
+              <w:left w:val="single" w:color="BFBFBF" w:sz="4"/>
+              <w:bottom w:val="single" w:color="BFBFBF" w:sz="4"/>
+              <w:right w:val="single" w:color="BFBFBF" w:sz="4"/>
+            </w:tcBorders>
+            <w:tcMar>
+              <w:top w:type="dxa" w:w="60"/>
+              <w:left w:type="dxa" w:w="100"/>
+              <w:bottom w:type="dxa" w:w="60"/>
+              <w:right w:type="dxa" w:w="100"/>
+            </w:tcMar>
+            <w:vAlign w:val="top"/>
+          </w:tcPr>
+          <w:p>
+            <w:pPr>
+              <w:spacing w:after="40"/>
+            </w:pPr>
+            <w:r>
+              <w:rPr>
+                <w:sz w:val="18"/>
+                <w:szCs w:val="18"/>
+              </w:rPr>
+              <w:t xml:space="preserve">Which Canadian law requires incident reporting within 2 days?</w:t>
+            </w:r>
+          </w:p>
+        </w:tc>
+      </w:tr>
+      <w:tr>
+        <w:trPr>
+          <w:cantSplit/>
+        </w:trPr>
+        <w:tc>
+          <w:tcPr>
+            <w:tcW w:type="dxa" w:w="600"/>
+            <w:tcBorders>
+              <w:top w:val="single" w:color="BFBFBF" w:sz="4"/>
+              <w:left w:val="single" w:color="BFBFBF" w:sz="4"/>
+              <w:bottom w:val="single" w:color="BFBFBF" w:sz="4"/>
+              <w:right w:val="single" w:color="BFBFBF" w:sz="4"/>
+            </w:tcBorders>
+            <w:shd w:fill="F5F7FA" w:color="auto" w:val="clear"/>
+            <w:tcMar>
+              <w:top w:type="dxa" w:w="60"/>
+              <w:left w:type="dxa" w:w="100"/>
+              <w:bottom w:type="dxa" w:w="60"/>
+              <w:right w:type="dxa" w:w="100"/>
+            </w:tcMar>
+            <w:vAlign w:val="top"/>
+          </w:tcPr>
+          <w:p>
+            <w:pPr>
+              <w:spacing w:after="40"/>
+            </w:pPr>
+            <w:r>
+              <w:rPr>
+                <w:sz w:val="18"/>
+                <w:szCs w:val="18"/>
+              </w:rPr>
+              <w:t xml:space="preserve">22</w:t>
             </w:r>
           </w:p>
         </w:tc>
@@ -28735,7 +30401,7 @@
                 <w:sz w:val="18"/>
                 <w:szCs w:val="18"/>
               </w:rPr>
-              <w:t xml:space="preserve">Review a PPE file (gloves EN 388 + EN ISO 21420) and a CPR file (decking / tile adhesive DoP).</w:t>
+              <w:t xml:space="preserve">Review a PPE file (gloves EN 388 + EN ISO 21420), a CPR file (decking / tile adhesive DoP) and a gas barbecue file (EN 498 EU-TEC, data plate, regulator for 3 destination countries).</w:t>
             </w:r>
           </w:p>
         </w:tc>
@@ -28765,7 +30431,7 @@
                 <w:sz w:val="18"/>
                 <w:szCs w:val="18"/>
               </w:rPr>
-              <w:t xml:space="preserve">Category/route and AVCP system correct; DoP/DoPC errors listed</w:t>
+              <w:t xml:space="preserve">Category/route and AVCP system correct; DoP/DoPC errors listed; gas category/country mismatches found</w:t>
             </w:r>
           </w:p>
         </w:tc>
@@ -31976,7 +33642,7 @@
                 <w:sz w:val="18"/>
                 <w:szCs w:val="18"/>
               </w:rPr>
-              <w:t xml:space="preserve">No. NPD is not allowed for characteristics where the destination Member State has legal requirements for the intended use, nor for characteristics with threshold levels; at least one essential characteristic must be declared.</w:t>
+              <w:t xml:space="preserve">No. A Notified Body is always required under (EU) 2016/426: Module B (EU type-examination, max. 10 years) + Module C2, D, E or F.</w:t>
             </w:r>
           </w:p>
         </w:tc>
@@ -32041,7 +33707,7 @@
                 <w:sz w:val="18"/>
                 <w:szCs w:val="18"/>
               </w:rPr>
-              <w:t xml:space="preserve">0.062 mg/m³ (formaldehyde emission in test chamber) for furniture and wood-based articles from 6 August 2026 (road vehicles from 6 Aug 2027).</w:t>
+              <w:t xml:space="preserve">That the EU-TEC covers France (gas category I3+ 28-30/37 mbar), that the regulator, injectors and heat input match the French configuration, that the data plate shows FR, and that instructions and warnings are in French ⚑ VERIFY the current OJEU gas conditions.</w:t>
             </w:r>
           </w:p>
         </w:tc>
@@ -32108,7 +33774,7 @@
                 <w:sz w:val="18"/>
                 <w:szCs w:val="18"/>
               </w:rPr>
-              <w:t xml:space="preserve">Geolocation of all plots of land (point for ≤ 4 ha, polygon above 4 ha) with date/time range of production; records kept 5 years.</w:t>
+              <w:t xml:space="preserve">No. NPD is not allowed for characteristics where the destination Member State has legal requirements for the intended use, nor for characteristics with threshold levels; at least one essential characteristic must be declared.</w:t>
             </w:r>
           </w:p>
         </w:tc>
@@ -32173,7 +33839,7 @@
                 <w:sz w:val="18"/>
                 <w:szCs w:val="18"/>
               </w:rPr>
-              <w:t xml:space="preserve">50 tonnes per importer per year (aggregate CBAM goods; electricity and hydrogen excluded from the mass threshold).</w:t>
+              <w:t xml:space="preserve">0.062 mg/m³ (formaldehyde emission in test chamber) for furniture and wood-based articles from 6 August 2026 (road vehicles from 6 Aug 2027).</w:t>
             </w:r>
           </w:p>
         </w:tc>
@@ -32240,7 +33906,7 @@
                 <w:sz w:val="18"/>
                 <w:szCs w:val="18"/>
               </w:rPr>
-              <w:t xml:space="preserve">12 August 2026; Pb + Cd + Hg + Cr VI ≤ 100 mg/kg.</w:t>
+              <w:t xml:space="preserve">Geolocation of all plots of land (point for ≤ 4 ha, polygon above 4 ha) with date/time range of production; records kept 5 years.</w:t>
             </w:r>
           </w:p>
         </w:tc>
@@ -32305,7 +33971,7 @@
                 <w:sz w:val="18"/>
                 <w:szCs w:val="18"/>
               </w:rPr>
-              <w:t xml:space="preserve">ChemRRV / ORRChim (Chemical Risk Reduction Ordinance), incl. Annex 2.15 for batteries.</w:t>
+              <w:t xml:space="preserve">50 tonnes per importer per year (aggregate CBAM goods; electricity and hydrogen excluded from the mass threshold).</w:t>
             </w:r>
           </w:p>
         </w:tc>
@@ -32372,7 +34038,7 @@
                 <w:sz w:val="18"/>
                 <w:szCs w:val="18"/>
               </w:rPr>
-              <w:t xml:space="preserve">100 ppm; Children’s Product Certificate (CPC) based on CPSC-accepted third-party lab testing.</w:t>
+              <w:t xml:space="preserve">12 August 2026; Pb + Cd + Hg + Cr VI ≤ 100 mg/kg.</w:t>
             </w:r>
           </w:p>
         </w:tc>
@@ -32437,7 +34103,7 @@
                 <w:sz w:val="18"/>
                 <w:szCs w:val="18"/>
               </w:rPr>
-              <w:t xml:space="preserve">Canada Consumer Product Safety Act (CCPSA), s.14.</w:t>
+              <w:t xml:space="preserve">ChemRRV / ORRChim (Chemical Risk Reduction Ordinance), incl. Annex 2.15 for batteries.</w:t>
             </w:r>
           </w:p>
         </w:tc>
@@ -32474,6 +34140,138 @@
                 <w:szCs w:val="18"/>
               </w:rPr>
               <w:t xml:space="preserve">20</w:t>
+            </w:r>
+          </w:p>
+        </w:tc>
+        <w:tc>
+          <w:tcPr>
+            <w:tcW w:type="dxa" w:w="9038"/>
+            <w:tcBorders>
+              <w:top w:val="single" w:color="BFBFBF" w:sz="4"/>
+              <w:left w:val="single" w:color="BFBFBF" w:sz="4"/>
+              <w:bottom w:val="single" w:color="BFBFBF" w:sz="4"/>
+              <w:right w:val="single" w:color="BFBFBF" w:sz="4"/>
+            </w:tcBorders>
+            <w:shd w:fill="F5F7FA" w:color="auto" w:val="clear"/>
+            <w:tcMar>
+              <w:top w:type="dxa" w:w="60"/>
+              <w:left w:type="dxa" w:w="100"/>
+              <w:bottom w:type="dxa" w:w="60"/>
+              <w:right w:type="dxa" w:w="100"/>
+            </w:tcMar>
+            <w:vAlign w:val="top"/>
+          </w:tcPr>
+          <w:p>
+            <w:pPr>
+              <w:spacing w:after="40"/>
+            </w:pPr>
+            <w:r>
+              <w:rPr>
+                <w:sz w:val="18"/>
+                <w:szCs w:val="18"/>
+              </w:rPr>
+              <w:t xml:space="preserve">100 ppm; Children’s Product Certificate (CPC) based on CPSC-accepted third-party lab testing.</w:t>
+            </w:r>
+          </w:p>
+        </w:tc>
+      </w:tr>
+      <w:tr>
+        <w:trPr>
+          <w:cantSplit/>
+        </w:trPr>
+        <w:tc>
+          <w:tcPr>
+            <w:tcW w:type="dxa" w:w="600"/>
+            <w:tcBorders>
+              <w:top w:val="single" w:color="BFBFBF" w:sz="4"/>
+              <w:left w:val="single" w:color="BFBFBF" w:sz="4"/>
+              <w:bottom w:val="single" w:color="BFBFBF" w:sz="4"/>
+              <w:right w:val="single" w:color="BFBFBF" w:sz="4"/>
+            </w:tcBorders>
+            <w:tcMar>
+              <w:top w:type="dxa" w:w="60"/>
+              <w:left w:type="dxa" w:w="100"/>
+              <w:bottom w:type="dxa" w:w="60"/>
+              <w:right w:type="dxa" w:w="100"/>
+            </w:tcMar>
+            <w:vAlign w:val="top"/>
+          </w:tcPr>
+          <w:p>
+            <w:pPr>
+              <w:spacing w:after="40"/>
+            </w:pPr>
+            <w:r>
+              <w:rPr>
+                <w:sz w:val="18"/>
+                <w:szCs w:val="18"/>
+              </w:rPr>
+              <w:t xml:space="preserve">21</w:t>
+            </w:r>
+          </w:p>
+        </w:tc>
+        <w:tc>
+          <w:tcPr>
+            <w:tcW w:type="dxa" w:w="9038"/>
+            <w:tcBorders>
+              <w:top w:val="single" w:color="BFBFBF" w:sz="4"/>
+              <w:left w:val="single" w:color="BFBFBF" w:sz="4"/>
+              <w:bottom w:val="single" w:color="BFBFBF" w:sz="4"/>
+              <w:right w:val="single" w:color="BFBFBF" w:sz="4"/>
+            </w:tcBorders>
+            <w:tcMar>
+              <w:top w:type="dxa" w:w="60"/>
+              <w:left w:type="dxa" w:w="100"/>
+              <w:bottom w:type="dxa" w:w="60"/>
+              <w:right w:type="dxa" w:w="100"/>
+            </w:tcMar>
+            <w:vAlign w:val="top"/>
+          </w:tcPr>
+          <w:p>
+            <w:pPr>
+              <w:spacing w:after="40"/>
+            </w:pPr>
+            <w:r>
+              <w:rPr>
+                <w:sz w:val="18"/>
+                <w:szCs w:val="18"/>
+              </w:rPr>
+              <w:t xml:space="preserve">Canada Consumer Product Safety Act (CCPSA), s.14.</w:t>
+            </w:r>
+          </w:p>
+        </w:tc>
+      </w:tr>
+      <w:tr>
+        <w:trPr>
+          <w:cantSplit/>
+        </w:trPr>
+        <w:tc>
+          <w:tcPr>
+            <w:tcW w:type="dxa" w:w="600"/>
+            <w:tcBorders>
+              <w:top w:val="single" w:color="BFBFBF" w:sz="4"/>
+              <w:left w:val="single" w:color="BFBFBF" w:sz="4"/>
+              <w:bottom w:val="single" w:color="BFBFBF" w:sz="4"/>
+              <w:right w:val="single" w:color="BFBFBF" w:sz="4"/>
+            </w:tcBorders>
+            <w:shd w:fill="F5F7FA" w:color="auto" w:val="clear"/>
+            <w:tcMar>
+              <w:top w:type="dxa" w:w="60"/>
+              <w:left w:type="dxa" w:w="100"/>
+              <w:bottom w:type="dxa" w:w="60"/>
+              <w:right w:type="dxa" w:w="100"/>
+            </w:tcMar>
+            <w:vAlign w:val="top"/>
+          </w:tcPr>
+          <w:p>
+            <w:pPr>
+              <w:spacing w:after="40"/>
+            </w:pPr>
+            <w:r>
+              <w:rPr>
+                <w:sz w:val="18"/>
+                <w:szCs w:val="18"/>
+              </w:rPr>
+              <w:t xml:space="preserve">22</w:t>
             </w:r>
           </w:p>
         </w:tc>
@@ -35106,7 +36904,7 @@
                 <w:sz w:val="18"/>
                 <w:szCs w:val="18"/>
               </w:rPr>
-              <w:t xml:space="preserve">(EU) 305/2011 → (EU) 2024/3110</w:t>
+              <w:t xml:space="preserve">(EU) 2016/426</w:t>
             </w:r>
           </w:p>
         </w:tc>
@@ -35137,7 +36935,7 @@
                 <w:sz w:val="18"/>
                 <w:szCs w:val="18"/>
               </w:rPr>
-              <w:t xml:space="preserve">Construction Products</w:t>
+              <w:t xml:space="preserve">Gas Appliances</w:t>
             </w:r>
           </w:p>
         </w:tc>
@@ -35168,7 +36966,7 @@
                 <w:sz w:val="18"/>
                 <w:szCs w:val="18"/>
               </w:rPr>
-              <w:t xml:space="preserve">New CPR from 8 Jan 2026; transition ⚑</w:t>
+              <w:t xml:space="preserve">21 Apr 2018</w:t>
             </w:r>
           </w:p>
         </w:tc>
@@ -35203,7 +37001,7 @@
                 <w:sz w:val="18"/>
                 <w:szCs w:val="18"/>
               </w:rPr>
-              <w:t xml:space="preserve">2009/48/EC → (EU) 2025/2509</w:t>
+              <w:t xml:space="preserve">(EU) 305/2011 → (EU) 2024/3110</w:t>
             </w:r>
           </w:p>
         </w:tc>
@@ -35233,7 +37031,7 @@
                 <w:sz w:val="18"/>
                 <w:szCs w:val="18"/>
               </w:rPr>
-              <w:t xml:space="preserve">Toy safety</w:t>
+              <w:t xml:space="preserve">Construction Products</w:t>
             </w:r>
           </w:p>
         </w:tc>
@@ -35263,7 +37061,7 @@
                 <w:sz w:val="18"/>
                 <w:szCs w:val="18"/>
               </w:rPr>
-              <w:t xml:space="preserve">New Regulation transitional ⚑</w:t>
+              <w:t xml:space="preserve">New CPR from 8 Jan 2026; transition ⚑</w:t>
             </w:r>
           </w:p>
         </w:tc>
@@ -35299,7 +37097,7 @@
                 <w:sz w:val="18"/>
                 <w:szCs w:val="18"/>
               </w:rPr>
-              <w:t xml:space="preserve">(EC) 1907/2006 · (EU) 2019/1021 · (EC) 1272/2008</w:t>
+              <w:t xml:space="preserve">2009/48/EC → (EU) 2025/2509</w:t>
             </w:r>
           </w:p>
         </w:tc>
@@ -35330,7 +37128,7 @@
                 <w:sz w:val="18"/>
                 <w:szCs w:val="18"/>
               </w:rPr>
-              <w:t xml:space="preserve">REACH · POPs · CLP</w:t>
+              <w:t xml:space="preserve">Toy safety</w:t>
             </w:r>
           </w:p>
         </w:tc>
@@ -35361,7 +37159,7 @@
                 <w:sz w:val="18"/>
                 <w:szCs w:val="18"/>
               </w:rPr>
-              <w:t xml:space="preserve">In force</w:t>
+              <w:t xml:space="preserve">New Regulation transitional ⚑</w:t>
             </w:r>
           </w:p>
         </w:tc>
@@ -35396,7 +37194,7 @@
                 <w:sz w:val="18"/>
                 <w:szCs w:val="18"/>
               </w:rPr>
-              <w:t xml:space="preserve">(EC) 1935/2004 · (EU) 10/2011</w:t>
+              <w:t xml:space="preserve">(EC) 1907/2006 · (EU) 2019/1021 · (EC) 1272/2008</w:t>
             </w:r>
           </w:p>
         </w:tc>
@@ -35426,7 +37224,7 @@
                 <w:sz w:val="18"/>
                 <w:szCs w:val="18"/>
               </w:rPr>
-              <w:t xml:space="preserve">Food contact materials</w:t>
+              <w:t xml:space="preserve">REACH · POPs · CLP</w:t>
             </w:r>
           </w:p>
         </w:tc>
@@ -35492,7 +37290,7 @@
                 <w:sz w:val="18"/>
                 <w:szCs w:val="18"/>
               </w:rPr>
-              <w:t xml:space="preserve">(EU) 2025/40</w:t>
+              <w:t xml:space="preserve">(EC) 1935/2004 · (EU) 10/2011</w:t>
             </w:r>
           </w:p>
         </w:tc>
@@ -35523,7 +37321,7 @@
                 <w:sz w:val="18"/>
                 <w:szCs w:val="18"/>
               </w:rPr>
-              <w:t xml:space="preserve">Packaging &amp; Packaging Waste</w:t>
+              <w:t xml:space="preserve">Food contact materials</w:t>
             </w:r>
           </w:p>
         </w:tc>
@@ -35554,7 +37352,7 @@
                 <w:sz w:val="18"/>
                 <w:szCs w:val="18"/>
               </w:rPr>
-              <w:t xml:space="preserve">12 Aug 2026</w:t>
+              <w:t xml:space="preserve">In force</w:t>
             </w:r>
           </w:p>
         </w:tc>
@@ -35589,7 +37387,7 @@
                 <w:sz w:val="18"/>
                 <w:szCs w:val="18"/>
               </w:rPr>
-              <w:t xml:space="preserve">(EU) 2023/1115</w:t>
+              <w:t xml:space="preserve">(EU) 2025/40</w:t>
             </w:r>
           </w:p>
         </w:tc>
@@ -35619,7 +37417,7 @@
                 <w:sz w:val="18"/>
                 <w:szCs w:val="18"/>
               </w:rPr>
-              <w:t xml:space="preserve">Deforestation-free products</w:t>
+              <w:t xml:space="preserve">Packaging &amp; Packaging Waste</w:t>
             </w:r>
           </w:p>
         </w:tc>
@@ -35649,7 +37447,7 @@
                 <w:sz w:val="18"/>
                 <w:szCs w:val="18"/>
               </w:rPr>
-              <w:t xml:space="preserve">30 Dec 2026 / 30 Jun 2027 ⚑</w:t>
+              <w:t xml:space="preserve">12 Aug 2026</w:t>
             </w:r>
           </w:p>
         </w:tc>
@@ -35685,7 +37483,7 @@
                 <w:sz w:val="18"/>
                 <w:szCs w:val="18"/>
               </w:rPr>
-              <w:t xml:space="preserve">(EU) 2023/956</w:t>
+              <w:t xml:space="preserve">(EU) 2023/1115</w:t>
             </w:r>
           </w:p>
         </w:tc>
@@ -35716,7 +37514,7 @@
                 <w:sz w:val="18"/>
                 <w:szCs w:val="18"/>
               </w:rPr>
-              <w:t xml:space="preserve">CBAM</w:t>
+              <w:t xml:space="preserve">Deforestation-free products</w:t>
             </w:r>
           </w:p>
         </w:tc>
@@ -35747,7 +37545,7 @@
                 <w:sz w:val="18"/>
                 <w:szCs w:val="18"/>
               </w:rPr>
-              <w:t xml:space="preserve">Definitive period 1 Jan 2026</w:t>
+              <w:t xml:space="preserve">30 Dec 2026 / 30 Jun 2027 ⚑</w:t>
             </w:r>
           </w:p>
         </w:tc>
@@ -35782,7 +37580,7 @@
                 <w:sz w:val="18"/>
                 <w:szCs w:val="18"/>
               </w:rPr>
-              <w:t xml:space="preserve">(EU) 2024/1781</w:t>
+              <w:t xml:space="preserve">(EU) 2023/956</w:t>
             </w:r>
           </w:p>
         </w:tc>
@@ -35812,7 +37610,7 @@
                 <w:sz w:val="18"/>
                 <w:szCs w:val="18"/>
               </w:rPr>
-              <w:t xml:space="preserve">Ecodesign for Sustainable Products</w:t>
+              <w:t xml:space="preserve">CBAM</w:t>
             </w:r>
           </w:p>
         </w:tc>
@@ -35842,7 +37640,7 @@
                 <w:sz w:val="18"/>
                 <w:szCs w:val="18"/>
               </w:rPr>
-              <w:t xml:space="preserve">Delegated acts per product group ⚑</w:t>
+              <w:t xml:space="preserve">Definitive period 1 Jan 2026</w:t>
             </w:r>
           </w:p>
         </w:tc>
@@ -35878,7 +37676,7 @@
                 <w:sz w:val="18"/>
                 <w:szCs w:val="18"/>
               </w:rPr>
-              <w:t xml:space="preserve">US: CPSA, CPSIA, 16 CFR 1263, FCC 47 CFR 15, TSCA VI, Prop 65, Lacey Act</w:t>
+              <w:t xml:space="preserve">(EU) 2024/1781</w:t>
             </w:r>
           </w:p>
         </w:tc>
@@ -35909,7 +37707,7 @@
                 <w:sz w:val="18"/>
                 <w:szCs w:val="18"/>
               </w:rPr>
-              <w:t xml:space="preserve">US federal/state</w:t>
+              <w:t xml:space="preserve">Ecodesign for Sustainable Products</w:t>
             </w:r>
           </w:p>
         </w:tc>
@@ -35940,7 +37738,7 @@
                 <w:sz w:val="18"/>
                 <w:szCs w:val="18"/>
               </w:rPr>
-              <w:t xml:space="preserve">In force</w:t>
+              <w:t xml:space="preserve">Delegated acts per product group ⚑</w:t>
             </w:r>
           </w:p>
         </w:tc>
@@ -35975,7 +37773,7 @@
                 <w:sz w:val="18"/>
                 <w:szCs w:val="18"/>
               </w:rPr>
-              <w:t xml:space="preserve">CA: CCPSA, SOR/2016-193, SOR/2018-83, SOR/2021-148, CCCR 2001, CPLA, ICES-003</w:t>
+              <w:t xml:space="preserve">US: CPSA, CPSIA, 16 CFR 1263, FCC 47 CFR 15, TSCA VI, Prop 65, Lacey Act, ANSI Z21/Z83 gas</w:t>
             </w:r>
           </w:p>
         </w:tc>
@@ -36005,7 +37803,7 @@
                 <w:sz w:val="18"/>
                 <w:szCs w:val="18"/>
               </w:rPr>
-              <w:t xml:space="preserve">Canada</w:t>
+              <w:t xml:space="preserve">US federal/state</w:t>
             </w:r>
           </w:p>
         </w:tc>
@@ -36071,6 +37869,103 @@
                 <w:sz w:val="18"/>
                 <w:szCs w:val="18"/>
               </w:rPr>
+              <w:t xml:space="preserve">CA: CCPSA, SOR/2016-193, SOR/2018-83, SOR/2021-148, CCCR 2001, CPLA, ICES-003, CSA gas standards</w:t>
+            </w:r>
+          </w:p>
+        </w:tc>
+        <w:tc>
+          <w:tcPr>
+            <w:tcW w:type="dxa" w:w="3238"/>
+            <w:tcBorders>
+              <w:top w:val="single" w:color="BFBFBF" w:sz="4"/>
+              <w:left w:val="single" w:color="BFBFBF" w:sz="4"/>
+              <w:bottom w:val="single" w:color="BFBFBF" w:sz="4"/>
+              <w:right w:val="single" w:color="BFBFBF" w:sz="4"/>
+            </w:tcBorders>
+            <w:shd w:fill="F5F7FA" w:color="auto" w:val="clear"/>
+            <w:tcMar>
+              <w:top w:type="dxa" w:w="60"/>
+              <w:left w:type="dxa" w:w="100"/>
+              <w:bottom w:type="dxa" w:w="60"/>
+              <w:right w:type="dxa" w:w="100"/>
+            </w:tcMar>
+            <w:vAlign w:val="top"/>
+          </w:tcPr>
+          <w:p>
+            <w:pPr>
+              <w:spacing w:after="40"/>
+            </w:pPr>
+            <w:r>
+              <w:rPr>
+                <w:sz w:val="18"/>
+                <w:szCs w:val="18"/>
+              </w:rPr>
+              <w:t xml:space="preserve">Canada</w:t>
+            </w:r>
+          </w:p>
+        </w:tc>
+        <w:tc>
+          <w:tcPr>
+            <w:tcW w:type="dxa" w:w="2600"/>
+            <w:tcBorders>
+              <w:top w:val="single" w:color="BFBFBF" w:sz="4"/>
+              <w:left w:val="single" w:color="BFBFBF" w:sz="4"/>
+              <w:bottom w:val="single" w:color="BFBFBF" w:sz="4"/>
+              <w:right w:val="single" w:color="BFBFBF" w:sz="4"/>
+            </w:tcBorders>
+            <w:shd w:fill="F5F7FA" w:color="auto" w:val="clear"/>
+            <w:tcMar>
+              <w:top w:type="dxa" w:w="60"/>
+              <w:left w:type="dxa" w:w="100"/>
+              <w:bottom w:type="dxa" w:w="60"/>
+              <w:right w:type="dxa" w:w="100"/>
+            </w:tcMar>
+            <w:vAlign w:val="top"/>
+          </w:tcPr>
+          <w:p>
+            <w:pPr>
+              <w:spacing w:after="40"/>
+            </w:pPr>
+            <w:r>
+              <w:rPr>
+                <w:sz w:val="18"/>
+                <w:szCs w:val="18"/>
+              </w:rPr>
+              <w:t xml:space="preserve">In force</w:t>
+            </w:r>
+          </w:p>
+        </w:tc>
+      </w:tr>
+      <w:tr>
+        <w:trPr>
+          <w:cantSplit/>
+        </w:trPr>
+        <w:tc>
+          <w:tcPr>
+            <w:tcW w:type="dxa" w:w="3800"/>
+            <w:tcBorders>
+              <w:top w:val="single" w:color="BFBFBF" w:sz="4"/>
+              <w:left w:val="single" w:color="BFBFBF" w:sz="4"/>
+              <w:bottom w:val="single" w:color="BFBFBF" w:sz="4"/>
+              <w:right w:val="single" w:color="BFBFBF" w:sz="4"/>
+            </w:tcBorders>
+            <w:tcMar>
+              <w:top w:type="dxa" w:w="60"/>
+              <w:left w:type="dxa" w:w="100"/>
+              <w:bottom w:type="dxa" w:w="60"/>
+              <w:right w:type="dxa" w:w="100"/>
+            </w:tcMar>
+            <w:vAlign w:val="top"/>
+          </w:tcPr>
+          <w:p>
+            <w:pPr>
+              <w:spacing w:after="40"/>
+            </w:pPr>
+            <w:r>
+              <w:rPr>
+                <w:sz w:val="18"/>
+                <w:szCs w:val="18"/>
+              </w:rPr>
               <w:t xml:space="preserve">CH: PrSG, PrSV, ChemRRV</w:t>
             </w:r>
           </w:p>
@@ -36084,7 +37979,6 @@
               <w:bottom w:val="single" w:color="BFBFBF" w:sz="4"/>
               <w:right w:val="single" w:color="BFBFBF" w:sz="4"/>
             </w:tcBorders>
-            <w:shd w:fill="F5F7FA" w:color="auto" w:val="clear"/>
             <w:tcMar>
               <w:top w:type="dxa" w:w="60"/>
               <w:left w:type="dxa" w:w="100"/>
@@ -36115,7 +38009,6 @@
               <w:bottom w:val="single" w:color="BFBFBF" w:sz="4"/>
               <w:right w:val="single" w:color="BFBFBF" w:sz="4"/>
             </w:tcBorders>
-            <w:shd w:fill="F5F7FA" w:color="auto" w:val="clear"/>
             <w:tcMar>
               <w:top w:type="dxa" w:w="60"/>
               <w:left w:type="dxa" w:w="100"/>
@@ -36497,6 +38390,105 @@
         <w:t xml:space="preserve">FPC manual, records and last audit.</w:t>
       </w:r>
     </w:p>
+    <w:p>
+      <w:pPr>
+        <w:pStyle w:val="Heading2"/>
+      </w:pPr>
+      <w:r>
+        <w:t xml:space="preserve">C.5 Gas appliance file</w:t>
+      </w:r>
+    </w:p>
+    <w:p>
+      <w:pPr>
+        <w:pStyle w:val="ListParagraph"/>
+        <w:numPr>
+          <w:ilvl w:val="0"/>
+          <w:numId w:val="2"/>
+        </w:numPr>
+        <w:spacing w:after="60"/>
+      </w:pPr>
+      <w:r>
+        <w:t xml:space="preserve">Product within (EU) 2016/426 scope; harmonised standard identified (EN 498 / 484 / 14543 / 521…) or Annex I direct assessment.</w:t>
+      </w:r>
+    </w:p>
+    <w:p>
+      <w:pPr>
+        <w:pStyle w:val="ListParagraph"/>
+        <w:numPr>
+          <w:ilvl w:val="0"/>
+          <w:numId w:val="2"/>
+        </w:numPr>
+        <w:spacing w:after="60"/>
+      </w:pPr>
+      <w:r>
+        <w:t xml:space="preserve">EU type-examination certificate (≤ 10 yrs) from an NB notified for GAR, covering the model, heat input, gas categories and every destination country.</w:t>
+      </w:r>
+    </w:p>
+    <w:p>
+      <w:pPr>
+        <w:pStyle w:val="ListParagraph"/>
+        <w:numPr>
+          <w:ilvl w:val="0"/>
+          <w:numId w:val="2"/>
+        </w:numPr>
+        <w:spacing w:after="60"/>
+      </w:pPr>
+      <w:r>
+        <w:t xml:space="preserve">Module C2 / D / E / F certificate or surveillance current for the factory.</w:t>
+      </w:r>
+    </w:p>
+    <w:p>
+      <w:pPr>
+        <w:pStyle w:val="ListParagraph"/>
+        <w:numPr>
+          <w:ilvl w:val="0"/>
+          <w:numId w:val="2"/>
+        </w:numPr>
+        <w:spacing w:after="60"/>
+      </w:pPr>
+      <w:r>
+        <w:t xml:space="preserve">Regulator, hose (EN 16129 / EN 16436) and injector size match each country SKU.</w:t>
+      </w:r>
+    </w:p>
+    <w:p>
+      <w:pPr>
+        <w:pStyle w:val="ListParagraph"/>
+        <w:numPr>
+          <w:ilvl w:val="0"/>
+          <w:numId w:val="2"/>
+        </w:numPr>
+        <w:spacing w:after="60"/>
+      </w:pPr>
+      <w:r>
+        <w:t xml:space="preserve">Data plate: CE + NB no., category, pressure, country codes, heat input; warnings “Use outdoors only”.</w:t>
+      </w:r>
+    </w:p>
+    <w:p>
+      <w:pPr>
+        <w:pStyle w:val="ListParagraph"/>
+        <w:numPr>
+          <w:ilvl w:val="0"/>
+          <w:numId w:val="2"/>
+        </w:numPr>
+        <w:spacing w:after="60"/>
+      </w:pPr>
+      <w:r>
+        <w:t xml:space="preserve">Instructions in all destination languages; DoC lists GAR (+ LVD/EMC/RoHS/Batteries if electric ignition or lighting).</w:t>
+      </w:r>
+    </w:p>
+    <w:p>
+      <w:pPr>
+        <w:pStyle w:val="ListParagraph"/>
+        <w:numPr>
+          <w:ilvl w:val="0"/>
+          <w:numId w:val="2"/>
+        </w:numPr>
+        <w:spacing w:after="60"/>
+      </w:pPr>
+      <w:r>
+        <w:t xml:space="preserve">QCP includes 100 % leak test; FRI includes leak, ignition and flame-failure device checks.</w:t>
+      </w:r>
+    </w:p>
     <w:sectPr>
       <w:headerReference w:type="default" r:id="rId7"/>
       <w:footerReference w:type="default" r:id="rId8"/>
@@ -36650,7 +38642,7 @@
         <w:sz w:val="16"/>
         <w:szCs w:val="16"/>
       </w:rPr>
-      <w:t xml:space="preserve">ARENA-VN-QA-TRN-001 Rev. 00  ·  QS Onboarding Training Manual</w:t>
+      <w:t xml:space="preserve">ARENA-VN-QA-TRN-001 Rev. 01  ·  QS Onboarding Training Manual</w:t>
     </w:r>
   </w:p>
 </w:hdr>

</xml_diff>

<commit_message>
QS training manual Rev. 02: regulatory cross-check as at 15 Oct 2026
Corrected battery label trigger (Art. 13: later of 18 Aug 2026 or +18 months
after implementing act), Toy Regulation (EU) 2025/2509 application 1 Aug 2030,
PPWR heavy-metal limit as a sum. Confirmed and referenced EUDR (2025/2650),
battery due diligence (2025/1561), CBAM (2025/2083), CPR transition to 2040,
REACH entries 77/79, RED EN 18031 (2025/138), Prop 65. Added Annex D
verification log with sources.

Co-Authored-By: Claude Opus 5.5 <noreply@anthropic.com>
Claude-Session: https://claude.ai/code/session_011KC3NwuhUa3muSLWD4tvxq
</commit_message>
<xml_diff>
--- a/training/QS-Onboarding-Training-Manual.docx
+++ b/training/QS-Onboarding-Training-Manual.docx
@@ -219,7 +219,7 @@
                 <w:sz w:val="18"/>
                 <w:szCs w:val="18"/>
               </w:rPr>
-              <w:t xml:space="preserve">01 — draft for approval</w:t>
+              <w:t xml:space="preserve">02 — draft for approval</w:t>
             </w:r>
           </w:p>
         </w:tc>
@@ -558,7 +558,7 @@
                 <w:sz w:val="18"/>
                 <w:szCs w:val="18"/>
               </w:rPr>
-              <w:t xml:space="preserve">Legislation as known at 15 Oct 2026 — items flagged ⚑ VERIFY are subject to recent amendment or pending acts</w:t>
+              <w:t xml:space="preserve">Legislation cross-checked on 15 Oct 2026 (see Annex D verification log). Items still flagged ⚑ VERIFY depend on pending acts or could not be confirmed from an official source.</w:t>
             </w:r>
           </w:p>
         </w:tc>
@@ -1525,6 +1525,131 @@
               <w:right w:val="single" w:color="BFBFBF" w:sz="4"/>
             </w:tcBorders>
             <w:shd w:fill="F5F7FA" w:color="auto" w:val="clear"/>
+            <w:tcMar>
+              <w:top w:type="dxa" w:w="60"/>
+              <w:left w:type="dxa" w:w="100"/>
+              <w:bottom w:type="dxa" w:w="60"/>
+              <w:right w:type="dxa" w:w="100"/>
+            </w:tcMar>
+            <w:vAlign w:val="top"/>
+          </w:tcPr>
+          <w:p>
+            <w:pPr>
+              <w:spacing w:after="40"/>
+            </w:pPr>
+            <w:r>
+              <w:rPr>
+                <w:sz w:val="18"/>
+                <w:szCs w:val="18"/>
+              </w:rPr>
+              <w:t xml:space="preserve">CQAD office</w:t>
+            </w:r>
+          </w:p>
+        </w:tc>
+      </w:tr>
+      <w:tr>
+        <w:trPr>
+          <w:cantSplit/>
+        </w:trPr>
+        <w:tc>
+          <w:tcPr>
+            <w:tcW w:type="dxa" w:w="800"/>
+            <w:tcBorders>
+              <w:top w:val="single" w:color="BFBFBF" w:sz="4"/>
+              <w:left w:val="single" w:color="BFBFBF" w:sz="4"/>
+              <w:bottom w:val="single" w:color="BFBFBF" w:sz="4"/>
+              <w:right w:val="single" w:color="BFBFBF" w:sz="4"/>
+            </w:tcBorders>
+            <w:tcMar>
+              <w:top w:type="dxa" w:w="60"/>
+              <w:left w:type="dxa" w:w="100"/>
+              <w:bottom w:type="dxa" w:w="60"/>
+              <w:right w:type="dxa" w:w="100"/>
+            </w:tcMar>
+            <w:vAlign w:val="top"/>
+          </w:tcPr>
+          <w:p>
+            <w:pPr>
+              <w:spacing w:after="40"/>
+            </w:pPr>
+            <w:r>
+              <w:rPr>
+                <w:sz w:val="18"/>
+                <w:szCs w:val="18"/>
+              </w:rPr>
+              <w:t xml:space="preserve">02</w:t>
+            </w:r>
+          </w:p>
+        </w:tc>
+        <w:tc>
+          <w:tcPr>
+            <w:tcW w:type="dxa" w:w="1400"/>
+            <w:tcBorders>
+              <w:top w:val="single" w:color="BFBFBF" w:sz="4"/>
+              <w:left w:val="single" w:color="BFBFBF" w:sz="4"/>
+              <w:bottom w:val="single" w:color="BFBFBF" w:sz="4"/>
+              <w:right w:val="single" w:color="BFBFBF" w:sz="4"/>
+            </w:tcBorders>
+            <w:tcMar>
+              <w:top w:type="dxa" w:w="60"/>
+              <w:left w:type="dxa" w:w="100"/>
+              <w:bottom w:type="dxa" w:w="60"/>
+              <w:right w:type="dxa" w:w="100"/>
+            </w:tcMar>
+            <w:vAlign w:val="top"/>
+          </w:tcPr>
+          <w:p>
+            <w:pPr>
+              <w:spacing w:after="40"/>
+            </w:pPr>
+            <w:r>
+              <w:rPr>
+                <w:sz w:val="18"/>
+                <w:szCs w:val="18"/>
+              </w:rPr>
+              <w:t xml:space="preserve">2026-10-15</w:t>
+            </w:r>
+          </w:p>
+        </w:tc>
+        <w:tc>
+          <w:tcPr>
+            <w:tcW w:type="dxa" w:w="5638"/>
+            <w:tcBorders>
+              <w:top w:val="single" w:color="BFBFBF" w:sz="4"/>
+              <w:left w:val="single" w:color="BFBFBF" w:sz="4"/>
+              <w:bottom w:val="single" w:color="BFBFBF" w:sz="4"/>
+              <w:right w:val="single" w:color="BFBFBF" w:sz="4"/>
+            </w:tcBorders>
+            <w:tcMar>
+              <w:top w:type="dxa" w:w="60"/>
+              <w:left w:type="dxa" w:w="100"/>
+              <w:bottom w:type="dxa" w:w="60"/>
+              <w:right w:type="dxa" w:w="100"/>
+            </w:tcMar>
+            <w:vAlign w:val="top"/>
+          </w:tcPr>
+          <w:p>
+            <w:pPr>
+              <w:spacing w:after="40"/>
+            </w:pPr>
+            <w:r>
+              <w:rPr>
+                <w:sz w:val="18"/>
+                <w:szCs w:val="18"/>
+              </w:rPr>
+              <w:t xml:space="preserve">Regulatory cross-check (Annex D). Corrected: battery label trigger date, Toy Regulation application date (1 Aug 2030), PPWR heavy-metal limit as a sum. Confirmed and referenced: EUDR, CBAM, CPR, REACH 77/79, battery due diligence, RED EN 18031, Prop 65.</w:t>
+            </w:r>
+          </w:p>
+        </w:tc>
+        <w:tc>
+          <w:tcPr>
+            <w:tcW w:type="dxa" w:w="1800"/>
+            <w:tcBorders>
+              <w:top w:val="single" w:color="BFBFBF" w:sz="4"/>
+              <w:left w:val="single" w:color="BFBFBF" w:sz="4"/>
+              <w:bottom w:val="single" w:color="BFBFBF" w:sz="4"/>
+              <w:right w:val="single" w:color="BFBFBF" w:sz="4"/>
+            </w:tcBorders>
             <w:tcMar>
               <w:top w:type="dxa" w:w="60"/>
               <w:left w:type="dxa" w:w="100"/>
@@ -12727,7 +12852,23 @@
                 <w:sz w:val="18"/>
                 <w:szCs w:val="18"/>
               </w:rPr>
-              <w:t xml:space="preserve">Products placed on the market up to 19 Jan 2027 may use the Directive; from 20 Jan 2027 the Regulation applies. New DoC references, cybersecurity and AI-safety-function provisions must be planned now for items shipping in 2027.</w:t>
+              <w:t xml:space="preserve">Products placed on the market up to 19 Jan 2027 may use the Directive; from </w:t>
+            </w:r>
+            <w:r>
+              <w:rPr>
+                <w:b/>
+                <w:bCs/>
+                <w:sz w:val="18"/>
+                <w:szCs w:val="18"/>
+              </w:rPr>
+              <w:t xml:space="preserve">20 Jan 2027</w:t>
+            </w:r>
+            <w:r>
+              <w:rPr>
+                <w:sz w:val="18"/>
+                <w:szCs w:val="18"/>
+              </w:rPr>
+              <w:t xml:space="preserve"> the Regulation applies — date confirmed binding at 15 Oct 2026. Industry has asked to postpone the cybersecurity provisions to align with the Cyber Resilience Act (11 Dec 2027); no postponement adopted so far ⚑ VERIFY. Omnibus IV proposes mandatory digital DoCs ⚑ VERIFY. Plan new DoC references and cybersecurity/safety-function evidence now for items shipping in 2027.</w:t>
             </w:r>
           </w:p>
         </w:tc>
@@ -13221,7 +13362,23 @@
                 <w:sz w:val="18"/>
                 <w:szCs w:val="18"/>
               </w:rPr>
-              <w:t xml:space="preserve">Covers safety and EMC too (DoC cites RED, not LVD/EMC). Cybersecurity delegated act (EU) 2022/30 applicable since 1 Aug 2025 — EN 18031-1/-2/-3 for internet-connected equipment (cited with restrictions ⚑ VERIFY). Common-charger rules (USB-C) for listed small devices.</w:t>
+              <w:t xml:space="preserve">Covers safety and EMC too (DoC cites RED, not LVD/EMC). Cybersecurity delegated act (EU) 2022/30 applicable since 1 Aug 2025 — EN 18031-1/-2/-3:2024 for internet-connected equipment, cited in the OJEU by Implementing Decision (EU) 2025/138 </w:t>
+            </w:r>
+            <w:r>
+              <w:rPr>
+                <w:b/>
+                <w:bCs/>
+                <w:sz w:val="18"/>
+                <w:szCs w:val="18"/>
+              </w:rPr>
+              <w:t xml:space="preserve">with restrictions</w:t>
+            </w:r>
+            <w:r>
+              <w:rPr>
+                <w:sz w:val="18"/>
+                <w:szCs w:val="18"/>
+              </w:rPr>
+              <w:t xml:space="preserve"> (e.g. password, parental-control and monetary-transfer clauses): where a restriction applies, a Notified Body EU type-examination is needed. Common-charger rules (USB-C) for listed small devices.</w:t>
             </w:r>
           </w:p>
         </w:tc>
@@ -13996,26 +14153,26 @@
                 <w:sz w:val="18"/>
                 <w:szCs w:val="18"/>
               </w:rPr>
-              <w:t xml:space="preserve">18 Aug 2026</w:t>
-            </w:r>
-            <w:r>
-              <w:rPr>
-                <w:sz w:val="18"/>
-                <w:szCs w:val="18"/>
-              </w:rPr>
-              <w:t xml:space="preserve">.</w:t>
-            </w:r>
-          </w:p>
-          <w:p>
-            <w:pPr>
-              <w:spacing w:after="40"/>
-            </w:pPr>
-            <w:r>
-              <w:rPr>
-                <w:sz w:val="18"/>
-                <w:szCs w:val="18"/>
-              </w:rPr>
-              <w:t xml:space="preserve">Capacity label for portable &amp; SLI; minimum average duration for non-rechargeable portable batteries.</w:t>
+              <w:t xml:space="preserve">18 Aug 2026 or 18 months after the Commission labelling implementing act enters into force, whichever is later</w:t>
+            </w:r>
+            <w:r>
+              <w:rPr>
+                <w:sz w:val="18"/>
+                <w:szCs w:val="18"/>
+              </w:rPr>
+              <w:t xml:space="preserve"> (Art. 13(1)). At 15 Oct 2026 the implementing act was still in draft (published Apr 2026), so the obligation has not yet started ⚑ VERIFY. A.R.E.N.A. rule: design new artwork to the draft act now.</w:t>
+            </w:r>
+          </w:p>
+          <w:p>
+            <w:pPr>
+              <w:spacing w:after="40"/>
+            </w:pPr>
+            <w:r>
+              <w:rPr>
+                <w:sz w:val="18"/>
+                <w:szCs w:val="18"/>
+              </w:rPr>
+              <w:t xml:space="preserve">Capacity label for rechargeable portable, LMT &amp; SLI; minimum average duration for non-rechargeable portable batteries — same trigger date as the general label.</w:t>
             </w:r>
           </w:p>
           <w:p>
@@ -14363,7 +14520,7 @@
                 <w:sz w:val="18"/>
                 <w:szCs w:val="18"/>
               </w:rPr>
-              <w:t xml:space="preserve"> by Omnibus ⚑ VERIFY; applies above turnover threshold.</w:t>
+              <w:t xml:space="preserve"> by Regulation (EU) 2025/1561 (‘stop-the-clock’, OJ 30 Jul 2025). SMEs below the turnover threshold are exempt; a further narrowing of scope is under discussion ⚑ VERIFY. Commission guidelines due by 26 Jul 2026.</w:t>
             </w:r>
           </w:p>
         </w:tc>
@@ -15573,7 +15730,23 @@
                 <w:sz w:val="18"/>
                 <w:szCs w:val="18"/>
               </w:rPr>
-              <w:t xml:space="preserve">. The old CPR 305/2011 is repealed but continues to apply to product families whose harmonised standards (hENs) have not yet been replaced by new standards cited under the new CPR; a long transitional period applies (up to 2040) ⚑ VERIFY per product family.</w:t>
+              <w:t xml:space="preserve">. CPR 305/2011 is repealed from that date, except certain articles that continue to apply until </w:t>
+            </w:r>
+            <w:r>
+              <w:rPr>
+                <w:b/>
+                <w:bCs/>
+                <w:sz w:val="18"/>
+                <w:szCs w:val="18"/>
+              </w:rPr>
+              <w:t xml:space="preserve">8 Jan 2040</w:t>
+            </w:r>
+            <w:r>
+              <w:rPr>
+                <w:sz w:val="18"/>
+                <w:szCs w:val="18"/>
+              </w:rPr>
+              <w:t xml:space="preserve">: product families whose hENs have not yet been replaced by standards cited under the new CPR stay under the old-CPR system (DoP) until the new standard applies. Check the regime per product family.</w:t>
             </w:r>
           </w:p>
         </w:tc>
@@ -15937,7 +16110,7 @@
                 <w:sz w:val="18"/>
                 <w:szCs w:val="18"/>
               </w:rPr>
-              <w:t xml:space="preserve">Factory Production Control (FPC) in all systems; product-type determination; DoP/DoPC; CE marking with essential characteristics; technical documentation kept 10 years; instructions and safety information. New CPR adds: environmental sustainability characteristics (GWP first, phased by delegated acts), product information in digital form, Digital Product Passport later ⚑ VERIFY.</w:t>
+              <w:t xml:space="preserve">Factory Production Control (FPC) in all systems; product-type determination; DoP/DoPC; CE marking with essential characteristics; technical documentation kept 10 years; instructions and safety information. New CPR adds: environmental sustainability characteristics (GWP first, phased in by delegated acts — milestones around 2026, 2030 and 2032 per TÜV summary ⚑ VERIFY per family), product information in digital form, and a Digital Product Passport later.</w:t>
             </w:r>
           </w:p>
         </w:tc>
@@ -16780,7 +16953,7 @@
                 <w:sz w:val="18"/>
                 <w:szCs w:val="18"/>
               </w:rPr>
-              <w:t xml:space="preserve">, as notified by Member States and published by the Commission (OJEU). Typical LPG examples: I3B/P (30 mbar) NL, Nordics; I3B/P (50 mbar) DE, AT, CH; I3+ (28-30/37 mbar) FR, BE, IT, ES, PT, IE ⚑ VERIFY against the current OJEU list for every destination. Regulator, injector and data plate must match.</w:t>
+              <w:t xml:space="preserve">, as notified by Member States under Art. 4(1) and published by the Commission (latest notice C/2025/1714). Typical LPG examples from current NB certificates: I3B/P (30 mbar) NL and the Nordics; I3B/P (50 mbar) DE, AT, CH, LU, SK; I3+ (28-30/37 mbar) FR, BE, IT, ES, PT, IE, GR, CZ, LT, LV, SI, CY. Some countries accept more than one category ⚑ VERIFY each destination against C/2025/1714. Regulator, injector and data plate must match.</w:t>
             </w:r>
           </w:p>
         </w:tc>
@@ -17455,7 +17628,23 @@
                 <w:sz w:val="18"/>
                 <w:szCs w:val="18"/>
               </w:rPr>
-              <w:t xml:space="preserve">EN 71 series; chemical limits incl. nitrosamines, allergenic fragrances; new Regulation (published Dec 2025) introduces a Digital Product Passport and a general ban of CMR/endocrine-disruptor/PFAS substances, with a multi-year transition ⚑ VERIFY application date.</w:t>
+              <w:t xml:space="preserve">EN 71 series; chemical limits incl. nitrosamines, allergenic fragrances. New Toy Safety Regulation (EU) 2025/2509, published OJ 12 Dec 2025, in force 1 Jan 2026, </w:t>
+            </w:r>
+            <w:r>
+              <w:rPr>
+                <w:b/>
+                <w:bCs/>
+                <w:sz w:val="18"/>
+                <w:szCs w:val="18"/>
+              </w:rPr>
+              <w:t xml:space="preserve">applies from 1 Aug 2030</w:t>
+            </w:r>
+            <w:r>
+              <w:rPr>
+                <w:sz w:val="18"/>
+                <w:szCs w:val="18"/>
+              </w:rPr>
+              <w:t xml:space="preserve"> (Directive 2009/48/EC repealed then; toys placed on the market earlier remain sellable). It introduces a Digital Product Passport and a general ban of CMR, endocrine-disrupting and PFAS substances in toys.</w:t>
             </w:r>
           </w:p>
         </w:tc>
@@ -17823,7 +18012,7 @@
                 <w:sz w:val="18"/>
                 <w:szCs w:val="18"/>
               </w:rPr>
-              <w:t xml:space="preserve">Restrictions: PAHs in rubber/plastic accessible parts (entry 50: 1 mg/kg; 0.5 mg/kg for toys/childcare); lead in PVC (entry 63); nickel release (entry 27); phthalates (entry 51); Cr VI in leather (entry 47); azo dyes (entry 43); formaldehyde emission from articles (entry 77 — 0.062 mg/m³ for furniture and wood-based articles from </w:t>
+              <w:t xml:space="preserve">Restrictions: PAHs in rubber/plastic accessible parts (entry 50: 1 mg/kg; 0.5 mg/kg for toys/childcare); lead in PVC (entry 63); nickel release (entry 27); phthalates (entry 51); Cr VI in leather (entry 47); azo dyes (entry 43); formaldehyde emission from articles (entry 77, Reg. (EU) 2023/1464 — 0.062 mg/m³ for furniture and wood-based articles, 0.080 mg/m³ for other articles, </w:t>
             </w:r>
             <w:r>
               <w:rPr>
@@ -17832,14 +18021,14 @@
                 <w:sz w:val="18"/>
                 <w:szCs w:val="18"/>
               </w:rPr>
-              <w:t xml:space="preserve">6 Aug 2026</w:t>
-            </w:r>
-            <w:r>
-              <w:rPr>
-                <w:sz w:val="18"/>
-                <w:szCs w:val="18"/>
-              </w:rPr>
-              <w:t xml:space="preserve">; road vehicles from 6 Aug 2027); microplastics (entry 78); PFHxA (entry 79) ⚑ VERIFY dates per use.</w:t>
+              <w:t xml:space="preserve">applicable since 6 Aug 2026</w:t>
+            </w:r>
+            <w:r>
+              <w:rPr>
+                <w:sz w:val="18"/>
+                <w:szCs w:val="18"/>
+              </w:rPr>
+              <w:t xml:space="preserve">; road-vehicle interiors from 6 Aug 2027; articles exclusively for outdoor use exempt); microplastics (entry 78); PFHxA (entry 79, Reg. (EU) 2024/2462 — 25 ppb / 1000 ppb; from 10 Oct 2026 for clothing, footwear, consumer mixtures, paper/board FCM; 10 Oct 2027 for other consumer textiles and leather).</w:t>
             </w:r>
           </w:p>
         </w:tc>
@@ -18032,7 +18221,7 @@
                 <w:sz w:val="18"/>
                 <w:szCs w:val="18"/>
               </w:rPr>
-              <w:t xml:space="preserve">Classification, labelling and packaging of mixtures; revised by (EU) 2024/2865 (label formatting, online sales) ⚑ VERIFY.</w:t>
+              <w:t xml:space="preserve">Classification, labelling and packaging of mixtures; revised by (EU) 2024/2865 — most changes from 1 Jul 2026, label formatting (font size, spacing) from 1 Jan 2027. Commission proposal COM(2025) 526 would defer formatting and some other provisions to 1 Jan 2028 — adoption not confirmed ⚑ VERIFY.</w:t>
             </w:r>
           </w:p>
         </w:tc>
@@ -18475,31 +18664,47 @@
                 <w:sz w:val="18"/>
                 <w:szCs w:val="18"/>
               </w:rPr>
-              <w:t xml:space="preserve">Heavy metals (Pb+Cd+Hg+Cr VI) ≤ 100 mg/kg in packaging — applies now.</w:t>
-            </w:r>
-          </w:p>
-          <w:p>
-            <w:pPr>
-              <w:spacing w:after="40"/>
-            </w:pPr>
-            <w:r>
-              <w:rPr>
-                <w:sz w:val="18"/>
-                <w:szCs w:val="18"/>
-              </w:rPr>
-              <w:t xml:space="preserve">Substances of concern minimisation; PFAS restriction for food-contact packaging from 12 Aug 2026.</w:t>
-            </w:r>
-          </w:p>
-          <w:p>
-            <w:pPr>
-              <w:spacing w:after="40"/>
-            </w:pPr>
-            <w:r>
-              <w:rPr>
-                <w:sz w:val="18"/>
-                <w:szCs w:val="18"/>
-              </w:rPr>
-              <w:t xml:space="preserve">Harmonised sorting labels from 12 Aug 2028 (+ implementing act) ⚑ VERIFY; recyclability performance grades from 2030; recycled content in plastic packaging from 2030; empty space ratio ≤ 50 % for grouped/transport/e-commerce packaging from 2030.</w:t>
+              <w:t xml:space="preserve">Heavy metals: </w:t>
+            </w:r>
+            <w:r>
+              <w:rPr>
+                <w:b/>
+                <w:bCs/>
+                <w:sz w:val="18"/>
+                <w:szCs w:val="18"/>
+              </w:rPr>
+              <w:t xml:space="preserve">sum</w:t>
+            </w:r>
+            <w:r>
+              <w:rPr>
+                <w:sz w:val="18"/>
+                <w:szCs w:val="18"/>
+              </w:rPr>
+              <w:t xml:space="preserve"> of Pb + Cd + Hg + Cr VI ≤ 100 mg/kg in packaging and packaging components (Art. 5) — applicable since 12 Aug 2026.</w:t>
+            </w:r>
+          </w:p>
+          <w:p>
+            <w:pPr>
+              <w:spacing w:after="40"/>
+            </w:pPr>
+            <w:r>
+              <w:rPr>
+                <w:sz w:val="18"/>
+                <w:szCs w:val="18"/>
+              </w:rPr>
+              <w:t xml:space="preserve">Substances of concern minimisation; PFAS in food-contact packaging restricted from 12 Aug 2026 (25 ppb any targeted PFAS, 250 ppb sum, 50 ppm total fluorine).</w:t>
+            </w:r>
+          </w:p>
+          <w:p>
+            <w:pPr>
+              <w:spacing w:after="40"/>
+            </w:pPr>
+            <w:r>
+              <w:rPr>
+                <w:sz w:val="18"/>
+                <w:szCs w:val="18"/>
+              </w:rPr>
+              <w:t xml:space="preserve">Harmonised material-composition labels from 12 Aug 2028 or 24 months after the implementing act, whichever is later; recyclability performance grades from 2030; recycled content in plastic packaging from 2030; empty space ratio ≤ 50 % for grouped/transport/e-commerce packaging from 2030.</w:t>
             </w:r>
           </w:p>
           <w:p>
@@ -18874,7 +19079,39 @@
                 <w:sz w:val="18"/>
                 <w:szCs w:val="18"/>
               </w:rPr>
-              <w:t xml:space="preserve">30 Dec 2026 for large and medium operators; 30 Jun 2027 for micro and small operators (after the 2025 amendments) ⚑ VERIFY — a review of further simplification is pending.</w:t>
+              <w:t xml:space="preserve">Per amending Regulation (EU) 2025/2650: </w:t>
+            </w:r>
+            <w:r>
+              <w:rPr>
+                <w:b/>
+                <w:bCs/>
+                <w:sz w:val="18"/>
+                <w:szCs w:val="18"/>
+              </w:rPr>
+              <w:t xml:space="preserve">30 Dec 2026</w:t>
+            </w:r>
+            <w:r>
+              <w:rPr>
+                <w:sz w:val="18"/>
+                <w:szCs w:val="18"/>
+              </w:rPr>
+              <w:t xml:space="preserve"> for large and medium operators; </w:t>
+            </w:r>
+            <w:r>
+              <w:rPr>
+                <w:b/>
+                <w:bCs/>
+                <w:sz w:val="18"/>
+                <w:szCs w:val="18"/>
+              </w:rPr>
+              <w:t xml:space="preserve">30 Jun 2027</w:t>
+            </w:r>
+            <w:r>
+              <w:rPr>
+                <w:sz w:val="18"/>
+                <w:szCs w:val="18"/>
+              </w:rPr>
+              <w:t xml:space="preserve"> for micro and small operators established by 31 Dec 2024 (but 30 Dec 2026 for their timber products already covered by the EU Timber Regulation). The Commission’s May 2026 simplification package left these dates unchanged. Due diligence sits with the operator first placing the product on the EU market.</w:t>
             </w:r>
           </w:p>
         </w:tc>
@@ -19261,7 +19498,23 @@
                 <w:sz w:val="18"/>
                 <w:szCs w:val="18"/>
               </w:rPr>
-              <w:t xml:space="preserve"> of CBAM goods (simplification Regulation (EU) 2025/2083); annual declaration and surrender of CBAM certificates for 2026 imports in 2027 ⚑ VERIFY.</w:t>
+              <w:t xml:space="preserve"> (cumulative across iron &amp; steel, aluminium, fertilisers, cement; not electricity or hydrogen; exceeding it at any point brings the whole year into scope) — simplification Regulation (EU) 2025/2083. Certificate sales on the central platform start </w:t>
+            </w:r>
+            <w:r>
+              <w:rPr>
+                <w:b/>
+                <w:bCs/>
+                <w:sz w:val="18"/>
+                <w:szCs w:val="18"/>
+              </w:rPr>
+              <w:t xml:space="preserve">1 Feb 2027</w:t>
+            </w:r>
+            <w:r>
+              <w:rPr>
+                <w:sz w:val="18"/>
+                <w:szCs w:val="18"/>
+              </w:rPr>
+              <w:t xml:space="preserve"> for 2026 imports, priced at the 2026 quarterly EU ETS average; annual declaration and surrender in 2027.</w:t>
             </w:r>
           </w:p>
         </w:tc>
@@ -19979,7 +20232,7 @@
                 <w:sz w:val="18"/>
                 <w:szCs w:val="18"/>
               </w:rPr>
-              <w:t xml:space="preserve">California Prop 65 (clear and reasonable warning, short-form rules updated 2025 ⚑ VERIFY); TSCA Title VI formaldehyde (composite wood — TSCA Title VI label); TSCA PFAS reporting; state PFAS/flame-retardant laws (ME, MN, NY, WA…).</w:t>
+              <w:t xml:space="preserve">California Prop 65 (clear and reasonable warning; amended short-form warning effective 1 Jan 2025 must name at least one chemical — old short-form allowed for products manufactured and labelled before 1 Jan 2028); TSCA Title VI formaldehyde (composite wood — TSCA Title VI label); TSCA PFAS reporting; state PFAS/flame-retardant laws (ME, MN, NY, WA…).</w:t>
             </w:r>
           </w:p>
         </w:tc>
@@ -28363,7 +28616,7 @@
                 <w:sz w:val="18"/>
                 <w:szCs w:val="18"/>
               </w:rPr>
-              <w:t xml:space="preserve">Name four elements of the Battery Regulation general information label applicable from 18 Aug 2026.</w:t>
+              <w:t xml:space="preserve">Name four elements of the Battery Regulation general information label (Art. 13(1)).</w:t>
             </w:r>
           </w:p>
         </w:tc>
@@ -33179,7 +33432,7 @@
                 <w:sz w:val="18"/>
                 <w:szCs w:val="18"/>
               </w:rPr>
-              <w:t xml:space="preserve">Any four of: manufacturer info, battery category, chemistry, weight, capacity, date of manufacture, hazardous substances (other than Hg/Cd/Pb), critical raw materials, place of manufacture.</w:t>
+              <w:t xml:space="preserve">Any four of: manufacturer info, battery category, chemistry, weight, capacity, date of manufacture, hazardous substances (other than Hg/Cd/Pb), critical raw materials, place of manufacture. Note: applies from 18 Aug 2026 or 18 months after the labelling implementing act, whichever is later.</w:t>
             </w:r>
           </w:p>
         </w:tc>
@@ -33971,7 +34224,7 @@
                 <w:sz w:val="18"/>
                 <w:szCs w:val="18"/>
               </w:rPr>
-              <w:t xml:space="preserve">50 tonnes per importer per year (aggregate CBAM goods; electricity and hydrogen excluded from the mass threshold).</w:t>
+              <w:t xml:space="preserve">50 tonnes per importer per year (aggregate CBAM goods; electricity and hydrogen excluded) — Regulation (EU) 2025/2083.</w:t>
             </w:r>
           </w:p>
         </w:tc>
@@ -36711,7 +36964,7 @@
                 <w:sz w:val="18"/>
                 <w:szCs w:val="18"/>
               </w:rPr>
-              <w:t xml:space="preserve">(EU) 2023/1542</w:t>
+              <w:t xml:space="preserve">(EU) 2023/1542; (EU) 2025/1561</w:t>
             </w:r>
           </w:p>
         </w:tc>
@@ -36742,7 +36995,7 @@
                 <w:sz w:val="18"/>
                 <w:szCs w:val="18"/>
               </w:rPr>
-              <w:t xml:space="preserve">Batteries</w:t>
+              <w:t xml:space="preserve">Batteries; due-diligence stop-the-clock</w:t>
             </w:r>
           </w:p>
         </w:tc>
@@ -36773,7 +37026,7 @@
                 <w:sz w:val="18"/>
                 <w:szCs w:val="18"/>
               </w:rPr>
-              <w:t xml:space="preserve">18 Feb 2024, phased to 2027+ ⚑</w:t>
+              <w:t xml:space="preserve">18 Feb 2024, phased to 2027+ (labels ⚑)</w:t>
             </w:r>
           </w:p>
         </w:tc>
@@ -37061,7 +37314,7 @@
                 <w:sz w:val="18"/>
                 <w:szCs w:val="18"/>
               </w:rPr>
-              <w:t xml:space="preserve">New CPR from 8 Jan 2026; transition ⚑</w:t>
+              <w:t xml:space="preserve">New CPR from 8 Jan 2026; transition to 8 Jan 2040</w:t>
             </w:r>
           </w:p>
         </w:tc>
@@ -37159,7 +37412,7 @@
                 <w:sz w:val="18"/>
                 <w:szCs w:val="18"/>
               </w:rPr>
-              <w:t xml:space="preserve">New Regulation transitional ⚑</w:t>
+              <w:t xml:space="preserve">Regulation applies 1 Aug 2030</w:t>
             </w:r>
           </w:p>
         </w:tc>
@@ -37483,7 +37736,7 @@
                 <w:sz w:val="18"/>
                 <w:szCs w:val="18"/>
               </w:rPr>
-              <w:t xml:space="preserve">(EU) 2023/1115</w:t>
+              <w:t xml:space="preserve">(EU) 2023/1115 as amended by (EU) 2025/2650</w:t>
             </w:r>
           </w:p>
         </w:tc>
@@ -37545,7 +37798,7 @@
                 <w:sz w:val="18"/>
                 <w:szCs w:val="18"/>
               </w:rPr>
-              <w:t xml:space="preserve">30 Dec 2026 / 30 Jun 2027 ⚑</w:t>
+              <w:t xml:space="preserve">30 Dec 2026 / 30 Jun 2027</w:t>
             </w:r>
           </w:p>
         </w:tc>
@@ -37580,7 +37833,7 @@
                 <w:sz w:val="18"/>
                 <w:szCs w:val="18"/>
               </w:rPr>
-              <w:t xml:space="preserve">(EU) 2023/956</w:t>
+              <w:t xml:space="preserve">(EU) 2023/956; (EU) 2025/2083</w:t>
             </w:r>
           </w:p>
         </w:tc>
@@ -37610,7 +37863,7 @@
                 <w:sz w:val="18"/>
                 <w:szCs w:val="18"/>
               </w:rPr>
-              <w:t xml:space="preserve">CBAM</w:t>
+              <w:t xml:space="preserve">CBAM; simplification</w:t>
             </w:r>
           </w:p>
         </w:tc>
@@ -38215,7 +38468,7 @@
         <w:spacing w:after="60"/>
       </w:pPr>
       <w:r>
-        <w:t xml:space="preserve">Label: collection symbol, capacity, general information (from 18 Aug 2026), QR code (from 18 Feb 2027).</w:t>
+        <w:t xml:space="preserve">Label: collection symbol; capacity and general information (18 Aug 2026 or 18 months after implementing act, whichever later); QR code (from 18 Feb 2027).</w:t>
       </w:r>
     </w:p>
     <w:p>
@@ -38489,6 +38742,2823 @@
         <w:t xml:space="preserve">QCP includes 100 % leak test; FRI includes leak, ignition and flame-failure device checks.</w:t>
       </w:r>
     </w:p>
+    <w:p>
+      <w:pPr>
+        <w:pStyle w:val="Heading1"/>
+        <w:pageBreakBefore/>
+      </w:pPr>
+      <w:r>
+        <w:t xml:space="preserve">Annex D — Regulatory verification log (15 Oct 2026)</w:t>
+      </w:r>
+    </w:p>
+    <w:p>
+      <w:pPr>
+        <w:spacing w:after="100"/>
+      </w:pPr>
+      <w:r>
+        <w:t xml:space="preserve">Cross-check performed on 15 Oct 2026 against secondary sources: NB/lab bulletins, law-firm briefings, Commission and Parliament pages. EUR-Lex could not be reached from the verification environment, so items marked </w:t>
+      </w:r>
+      <w:r>
+        <w:rPr>
+          <w:b/>
+          <w:bCs/>
+        </w:rPr>
+        <w:t xml:space="preserve">Open</w:t>
+      </w:r>
+      <w:r>
+        <w:t xml:space="preserve"> must be confirmed on EUR-Lex / OJEU before external use.</w:t>
+      </w:r>
+    </w:p>
+    <w:tbl>
+      <w:tblPr>
+        <w:tblW w:type="dxa" w:w="9638"/>
+        <w:tblBorders>
+          <w:top w:val="single" w:color="auto" w:sz="4"/>
+          <w:left w:val="single" w:color="auto" w:sz="4"/>
+          <w:bottom w:val="single" w:color="auto" w:sz="4"/>
+          <w:right w:val="single" w:color="auto" w:sz="4"/>
+          <w:insideH w:val="single" w:color="auto" w:sz="4"/>
+          <w:insideV w:val="single" w:color="auto" w:sz="4"/>
+        </w:tblBorders>
+      </w:tblPr>
+      <w:tblGrid>
+        <w:gridCol w:w="500"/>
+        <w:gridCol w:w="2700"/>
+        <w:gridCol w:w="1500"/>
+        <w:gridCol w:w="4938"/>
+      </w:tblGrid>
+      <w:tr>
+        <w:trPr>
+          <w:tblHeader/>
+        </w:trPr>
+        <w:tc>
+          <w:tcPr>
+            <w:tcW w:type="dxa" w:w="500"/>
+            <w:tcBorders>
+              <w:top w:val="single" w:color="BFBFBF" w:sz="4"/>
+              <w:left w:val="single" w:color="BFBFBF" w:sz="4"/>
+              <w:bottom w:val="single" w:color="BFBFBF" w:sz="4"/>
+              <w:right w:val="single" w:color="BFBFBF" w:sz="4"/>
+            </w:tcBorders>
+            <w:shd w:fill="1F3864" w:color="auto" w:val="clear"/>
+            <w:tcMar>
+              <w:top w:type="dxa" w:w="60"/>
+              <w:left w:type="dxa" w:w="100"/>
+              <w:bottom w:type="dxa" w:w="60"/>
+              <w:right w:type="dxa" w:w="100"/>
+            </w:tcMar>
+            <w:vAlign w:val="top"/>
+          </w:tcPr>
+          <w:p>
+            <w:pPr>
+              <w:spacing w:after="40"/>
+            </w:pPr>
+            <w:r>
+              <w:rPr>
+                <w:b/>
+                <w:bCs/>
+                <w:color w:val="FFFFFF"/>
+                <w:sz w:val="18"/>
+                <w:szCs w:val="18"/>
+              </w:rPr>
+              <w:t xml:space="preserve">#</w:t>
+            </w:r>
+          </w:p>
+        </w:tc>
+        <w:tc>
+          <w:tcPr>
+            <w:tcW w:type="dxa" w:w="2700"/>
+            <w:tcBorders>
+              <w:top w:val="single" w:color="BFBFBF" w:sz="4"/>
+              <w:left w:val="single" w:color="BFBFBF" w:sz="4"/>
+              <w:bottom w:val="single" w:color="BFBFBF" w:sz="4"/>
+              <w:right w:val="single" w:color="BFBFBF" w:sz="4"/>
+            </w:tcBorders>
+            <w:shd w:fill="1F3864" w:color="auto" w:val="clear"/>
+            <w:tcMar>
+              <w:top w:type="dxa" w:w="60"/>
+              <w:left w:type="dxa" w:w="100"/>
+              <w:bottom w:type="dxa" w:w="60"/>
+              <w:right w:type="dxa" w:w="100"/>
+            </w:tcMar>
+            <w:vAlign w:val="top"/>
+          </w:tcPr>
+          <w:p>
+            <w:pPr>
+              <w:spacing w:after="40"/>
+            </w:pPr>
+            <w:r>
+              <w:rPr>
+                <w:b/>
+                <w:bCs/>
+                <w:color w:val="FFFFFF"/>
+                <w:sz w:val="18"/>
+                <w:szCs w:val="18"/>
+              </w:rPr>
+              <w:t xml:space="preserve">Item</w:t>
+            </w:r>
+          </w:p>
+        </w:tc>
+        <w:tc>
+          <w:tcPr>
+            <w:tcW w:type="dxa" w:w="1500"/>
+            <w:tcBorders>
+              <w:top w:val="single" w:color="BFBFBF" w:sz="4"/>
+              <w:left w:val="single" w:color="BFBFBF" w:sz="4"/>
+              <w:bottom w:val="single" w:color="BFBFBF" w:sz="4"/>
+              <w:right w:val="single" w:color="BFBFBF" w:sz="4"/>
+            </w:tcBorders>
+            <w:shd w:fill="1F3864" w:color="auto" w:val="clear"/>
+            <w:tcMar>
+              <w:top w:type="dxa" w:w="60"/>
+              <w:left w:type="dxa" w:w="100"/>
+              <w:bottom w:type="dxa" w:w="60"/>
+              <w:right w:type="dxa" w:w="100"/>
+            </w:tcMar>
+            <w:vAlign w:val="top"/>
+          </w:tcPr>
+          <w:p>
+            <w:pPr>
+              <w:spacing w:after="40"/>
+            </w:pPr>
+            <w:r>
+              <w:rPr>
+                <w:b/>
+                <w:bCs/>
+                <w:color w:val="FFFFFF"/>
+                <w:sz w:val="18"/>
+                <w:szCs w:val="18"/>
+              </w:rPr>
+              <w:t xml:space="preserve">Status</w:t>
+            </w:r>
+          </w:p>
+        </w:tc>
+        <w:tc>
+          <w:tcPr>
+            <w:tcW w:type="dxa" w:w="4938"/>
+            <w:tcBorders>
+              <w:top w:val="single" w:color="BFBFBF" w:sz="4"/>
+              <w:left w:val="single" w:color="BFBFBF" w:sz="4"/>
+              <w:bottom w:val="single" w:color="BFBFBF" w:sz="4"/>
+              <w:right w:val="single" w:color="BFBFBF" w:sz="4"/>
+            </w:tcBorders>
+            <w:shd w:fill="1F3864" w:color="auto" w:val="clear"/>
+            <w:tcMar>
+              <w:top w:type="dxa" w:w="60"/>
+              <w:left w:type="dxa" w:w="100"/>
+              <w:bottom w:type="dxa" w:w="60"/>
+              <w:right w:type="dxa" w:w="100"/>
+            </w:tcMar>
+            <w:vAlign w:val="top"/>
+          </w:tcPr>
+          <w:p>
+            <w:pPr>
+              <w:spacing w:after="40"/>
+            </w:pPr>
+            <w:r>
+              <w:rPr>
+                <w:b/>
+                <w:bCs/>
+                <w:color w:val="FFFFFF"/>
+                <w:sz w:val="18"/>
+                <w:szCs w:val="18"/>
+              </w:rPr>
+              <w:t xml:space="preserve">Finding (as at 15 Oct 2026)</w:t>
+            </w:r>
+          </w:p>
+        </w:tc>
+      </w:tr>
+      <w:tr>
+        <w:trPr>
+          <w:cantSplit/>
+        </w:trPr>
+        <w:tc>
+          <w:tcPr>
+            <w:tcW w:type="dxa" w:w="500"/>
+            <w:tcBorders>
+              <w:top w:val="single" w:color="BFBFBF" w:sz="4"/>
+              <w:left w:val="single" w:color="BFBFBF" w:sz="4"/>
+              <w:bottom w:val="single" w:color="BFBFBF" w:sz="4"/>
+              <w:right w:val="single" w:color="BFBFBF" w:sz="4"/>
+            </w:tcBorders>
+            <w:tcMar>
+              <w:top w:type="dxa" w:w="60"/>
+              <w:left w:type="dxa" w:w="100"/>
+              <w:bottom w:type="dxa" w:w="60"/>
+              <w:right w:type="dxa" w:w="100"/>
+            </w:tcMar>
+            <w:vAlign w:val="top"/>
+          </w:tcPr>
+          <w:p>
+            <w:pPr>
+              <w:spacing w:after="40"/>
+            </w:pPr>
+            <w:r>
+              <w:rPr>
+                <w:sz w:val="18"/>
+                <w:szCs w:val="18"/>
+              </w:rPr>
+              <w:t xml:space="preserve">1</w:t>
+            </w:r>
+          </w:p>
+        </w:tc>
+        <w:tc>
+          <w:tcPr>
+            <w:tcW w:type="dxa" w:w="2700"/>
+            <w:tcBorders>
+              <w:top w:val="single" w:color="BFBFBF" w:sz="4"/>
+              <w:left w:val="single" w:color="BFBFBF" w:sz="4"/>
+              <w:bottom w:val="single" w:color="BFBFBF" w:sz="4"/>
+              <w:right w:val="single" w:color="BFBFBF" w:sz="4"/>
+            </w:tcBorders>
+            <w:tcMar>
+              <w:top w:type="dxa" w:w="60"/>
+              <w:left w:type="dxa" w:w="100"/>
+              <w:bottom w:type="dxa" w:w="60"/>
+              <w:right w:type="dxa" w:w="100"/>
+            </w:tcMar>
+            <w:vAlign w:val="top"/>
+          </w:tcPr>
+          <w:p>
+            <w:pPr>
+              <w:spacing w:after="40"/>
+            </w:pPr>
+            <w:r>
+              <w:rPr>
+                <w:sz w:val="18"/>
+                <w:szCs w:val="18"/>
+              </w:rPr>
+              <w:t xml:space="preserve">EUDR application dates</w:t>
+            </w:r>
+          </w:p>
+        </w:tc>
+        <w:tc>
+          <w:tcPr>
+            <w:tcW w:type="dxa" w:w="1500"/>
+            <w:tcBorders>
+              <w:top w:val="single" w:color="BFBFBF" w:sz="4"/>
+              <w:left w:val="single" w:color="BFBFBF" w:sz="4"/>
+              <w:bottom w:val="single" w:color="BFBFBF" w:sz="4"/>
+              <w:right w:val="single" w:color="BFBFBF" w:sz="4"/>
+            </w:tcBorders>
+            <w:tcMar>
+              <w:top w:type="dxa" w:w="60"/>
+              <w:left w:type="dxa" w:w="100"/>
+              <w:bottom w:type="dxa" w:w="60"/>
+              <w:right w:type="dxa" w:w="100"/>
+            </w:tcMar>
+            <w:vAlign w:val="top"/>
+          </w:tcPr>
+          <w:p>
+            <w:pPr>
+              <w:spacing w:after="40"/>
+            </w:pPr>
+            <w:r>
+              <w:rPr>
+                <w:sz w:val="18"/>
+                <w:szCs w:val="18"/>
+              </w:rPr>
+              <w:t xml:space="preserve"/>
+            </w:r>
+            <w:r>
+              <w:rPr>
+                <w:b/>
+                <w:bCs/>
+                <w:sz w:val="18"/>
+                <w:szCs w:val="18"/>
+              </w:rPr>
+              <w:t xml:space="preserve">Confirmed</w:t>
+            </w:r>
+            <w:r>
+              <w:rPr>
+                <w:sz w:val="18"/>
+                <w:szCs w:val="18"/>
+              </w:rPr>
+              <w:t xml:space="preserve"/>
+            </w:r>
+          </w:p>
+        </w:tc>
+        <w:tc>
+          <w:tcPr>
+            <w:tcW w:type="dxa" w:w="4938"/>
+            <w:tcBorders>
+              <w:top w:val="single" w:color="BFBFBF" w:sz="4"/>
+              <w:left w:val="single" w:color="BFBFBF" w:sz="4"/>
+              <w:bottom w:val="single" w:color="BFBFBF" w:sz="4"/>
+              <w:right w:val="single" w:color="BFBFBF" w:sz="4"/>
+            </w:tcBorders>
+            <w:tcMar>
+              <w:top w:type="dxa" w:w="60"/>
+              <w:left w:type="dxa" w:w="100"/>
+              <w:bottom w:type="dxa" w:w="60"/>
+              <w:right w:type="dxa" w:w="100"/>
+            </w:tcMar>
+            <w:vAlign w:val="top"/>
+          </w:tcPr>
+          <w:p>
+            <w:pPr>
+              <w:spacing w:after="40"/>
+            </w:pPr>
+            <w:r>
+              <w:rPr>
+                <w:sz w:val="18"/>
+                <w:szCs w:val="18"/>
+              </w:rPr>
+              <w:t xml:space="preserve">30 Dec 2026 large/medium; 30 Jun 2027 micro/small — Reg. (EU) 2025/2650. May 2026 package did not change dates.</w:t>
+            </w:r>
+          </w:p>
+        </w:tc>
+      </w:tr>
+      <w:tr>
+        <w:trPr>
+          <w:cantSplit/>
+        </w:trPr>
+        <w:tc>
+          <w:tcPr>
+            <w:tcW w:type="dxa" w:w="500"/>
+            <w:tcBorders>
+              <w:top w:val="single" w:color="BFBFBF" w:sz="4"/>
+              <w:left w:val="single" w:color="BFBFBF" w:sz="4"/>
+              <w:bottom w:val="single" w:color="BFBFBF" w:sz="4"/>
+              <w:right w:val="single" w:color="BFBFBF" w:sz="4"/>
+            </w:tcBorders>
+            <w:shd w:fill="F5F7FA" w:color="auto" w:val="clear"/>
+            <w:tcMar>
+              <w:top w:type="dxa" w:w="60"/>
+              <w:left w:type="dxa" w:w="100"/>
+              <w:bottom w:type="dxa" w:w="60"/>
+              <w:right w:type="dxa" w:w="100"/>
+            </w:tcMar>
+            <w:vAlign w:val="top"/>
+          </w:tcPr>
+          <w:p>
+            <w:pPr>
+              <w:spacing w:after="40"/>
+            </w:pPr>
+            <w:r>
+              <w:rPr>
+                <w:sz w:val="18"/>
+                <w:szCs w:val="18"/>
+              </w:rPr>
+              <w:t xml:space="preserve">2</w:t>
+            </w:r>
+          </w:p>
+        </w:tc>
+        <w:tc>
+          <w:tcPr>
+            <w:tcW w:type="dxa" w:w="2700"/>
+            <w:tcBorders>
+              <w:top w:val="single" w:color="BFBFBF" w:sz="4"/>
+              <w:left w:val="single" w:color="BFBFBF" w:sz="4"/>
+              <w:bottom w:val="single" w:color="BFBFBF" w:sz="4"/>
+              <w:right w:val="single" w:color="BFBFBF" w:sz="4"/>
+            </w:tcBorders>
+            <w:shd w:fill="F5F7FA" w:color="auto" w:val="clear"/>
+            <w:tcMar>
+              <w:top w:type="dxa" w:w="60"/>
+              <w:left w:type="dxa" w:w="100"/>
+              <w:bottom w:type="dxa" w:w="60"/>
+              <w:right w:type="dxa" w:w="100"/>
+            </w:tcMar>
+            <w:vAlign w:val="top"/>
+          </w:tcPr>
+          <w:p>
+            <w:pPr>
+              <w:spacing w:after="40"/>
+            </w:pPr>
+            <w:r>
+              <w:rPr>
+                <w:sz w:val="18"/>
+                <w:szCs w:val="18"/>
+              </w:rPr>
+              <w:t xml:space="preserve">Battery due diligence</w:t>
+            </w:r>
+          </w:p>
+        </w:tc>
+        <w:tc>
+          <w:tcPr>
+            <w:tcW w:type="dxa" w:w="1500"/>
+            <w:tcBorders>
+              <w:top w:val="single" w:color="BFBFBF" w:sz="4"/>
+              <w:left w:val="single" w:color="BFBFBF" w:sz="4"/>
+              <w:bottom w:val="single" w:color="BFBFBF" w:sz="4"/>
+              <w:right w:val="single" w:color="BFBFBF" w:sz="4"/>
+            </w:tcBorders>
+            <w:shd w:fill="F5F7FA" w:color="auto" w:val="clear"/>
+            <w:tcMar>
+              <w:top w:type="dxa" w:w="60"/>
+              <w:left w:type="dxa" w:w="100"/>
+              <w:bottom w:type="dxa" w:w="60"/>
+              <w:right w:type="dxa" w:w="100"/>
+            </w:tcMar>
+            <w:vAlign w:val="top"/>
+          </w:tcPr>
+          <w:p>
+            <w:pPr>
+              <w:spacing w:after="40"/>
+            </w:pPr>
+            <w:r>
+              <w:rPr>
+                <w:sz w:val="18"/>
+                <w:szCs w:val="18"/>
+              </w:rPr>
+              <w:t xml:space="preserve"/>
+            </w:r>
+            <w:r>
+              <w:rPr>
+                <w:b/>
+                <w:bCs/>
+                <w:sz w:val="18"/>
+                <w:szCs w:val="18"/>
+              </w:rPr>
+              <w:t xml:space="preserve">Confirmed</w:t>
+            </w:r>
+            <w:r>
+              <w:rPr>
+                <w:sz w:val="18"/>
+                <w:szCs w:val="18"/>
+              </w:rPr>
+              <w:t xml:space="preserve"/>
+            </w:r>
+          </w:p>
+        </w:tc>
+        <w:tc>
+          <w:tcPr>
+            <w:tcW w:type="dxa" w:w="4938"/>
+            <w:tcBorders>
+              <w:top w:val="single" w:color="BFBFBF" w:sz="4"/>
+              <w:left w:val="single" w:color="BFBFBF" w:sz="4"/>
+              <w:bottom w:val="single" w:color="BFBFBF" w:sz="4"/>
+              <w:right w:val="single" w:color="BFBFBF" w:sz="4"/>
+            </w:tcBorders>
+            <w:shd w:fill="F5F7FA" w:color="auto" w:val="clear"/>
+            <w:tcMar>
+              <w:top w:type="dxa" w:w="60"/>
+              <w:left w:type="dxa" w:w="100"/>
+              <w:bottom w:type="dxa" w:w="60"/>
+              <w:right w:type="dxa" w:w="100"/>
+            </w:tcMar>
+            <w:vAlign w:val="top"/>
+          </w:tcPr>
+          <w:p>
+            <w:pPr>
+              <w:spacing w:after="40"/>
+            </w:pPr>
+            <w:r>
+              <w:rPr>
+                <w:sz w:val="18"/>
+                <w:szCs w:val="18"/>
+              </w:rPr>
+              <w:t xml:space="preserve">18 Aug 2027 — Reg. (EU) 2025/1561 (OJ 30 Jul 2025).</w:t>
+            </w:r>
+          </w:p>
+        </w:tc>
+      </w:tr>
+      <w:tr>
+        <w:trPr>
+          <w:cantSplit/>
+        </w:trPr>
+        <w:tc>
+          <w:tcPr>
+            <w:tcW w:type="dxa" w:w="500"/>
+            <w:tcBorders>
+              <w:top w:val="single" w:color="BFBFBF" w:sz="4"/>
+              <w:left w:val="single" w:color="BFBFBF" w:sz="4"/>
+              <w:bottom w:val="single" w:color="BFBFBF" w:sz="4"/>
+              <w:right w:val="single" w:color="BFBFBF" w:sz="4"/>
+            </w:tcBorders>
+            <w:tcMar>
+              <w:top w:type="dxa" w:w="60"/>
+              <w:left w:type="dxa" w:w="100"/>
+              <w:bottom w:type="dxa" w:w="60"/>
+              <w:right w:type="dxa" w:w="100"/>
+            </w:tcMar>
+            <w:vAlign w:val="top"/>
+          </w:tcPr>
+          <w:p>
+            <w:pPr>
+              <w:spacing w:after="40"/>
+            </w:pPr>
+            <w:r>
+              <w:rPr>
+                <w:sz w:val="18"/>
+                <w:szCs w:val="18"/>
+              </w:rPr>
+              <w:t xml:space="preserve">3</w:t>
+            </w:r>
+          </w:p>
+        </w:tc>
+        <w:tc>
+          <w:tcPr>
+            <w:tcW w:type="dxa" w:w="2700"/>
+            <w:tcBorders>
+              <w:top w:val="single" w:color="BFBFBF" w:sz="4"/>
+              <w:left w:val="single" w:color="BFBFBF" w:sz="4"/>
+              <w:bottom w:val="single" w:color="BFBFBF" w:sz="4"/>
+              <w:right w:val="single" w:color="BFBFBF" w:sz="4"/>
+            </w:tcBorders>
+            <w:tcMar>
+              <w:top w:type="dxa" w:w="60"/>
+              <w:left w:type="dxa" w:w="100"/>
+              <w:bottom w:type="dxa" w:w="60"/>
+              <w:right w:type="dxa" w:w="100"/>
+            </w:tcMar>
+            <w:vAlign w:val="top"/>
+          </w:tcPr>
+          <w:p>
+            <w:pPr>
+              <w:spacing w:after="40"/>
+            </w:pPr>
+            <w:r>
+              <w:rPr>
+                <w:sz w:val="18"/>
+                <w:szCs w:val="18"/>
+              </w:rPr>
+              <w:t xml:space="preserve">Battery general / capacity labels</w:t>
+            </w:r>
+          </w:p>
+        </w:tc>
+        <w:tc>
+          <w:tcPr>
+            <w:tcW w:type="dxa" w:w="1500"/>
+            <w:tcBorders>
+              <w:top w:val="single" w:color="BFBFBF" w:sz="4"/>
+              <w:left w:val="single" w:color="BFBFBF" w:sz="4"/>
+              <w:bottom w:val="single" w:color="BFBFBF" w:sz="4"/>
+              <w:right w:val="single" w:color="BFBFBF" w:sz="4"/>
+            </w:tcBorders>
+            <w:tcMar>
+              <w:top w:type="dxa" w:w="60"/>
+              <w:left w:type="dxa" w:w="100"/>
+              <w:bottom w:type="dxa" w:w="60"/>
+              <w:right w:type="dxa" w:w="100"/>
+            </w:tcMar>
+            <w:vAlign w:val="top"/>
+          </w:tcPr>
+          <w:p>
+            <w:pPr>
+              <w:spacing w:after="40"/>
+            </w:pPr>
+            <w:r>
+              <w:rPr>
+                <w:sz w:val="18"/>
+                <w:szCs w:val="18"/>
+              </w:rPr>
+              <w:t xml:space="preserve"/>
+            </w:r>
+            <w:r>
+              <w:rPr>
+                <w:b/>
+                <w:bCs/>
+                <w:sz w:val="18"/>
+                <w:szCs w:val="18"/>
+              </w:rPr>
+              <w:t xml:space="preserve">Corrected</w:t>
+            </w:r>
+            <w:r>
+              <w:rPr>
+                <w:sz w:val="18"/>
+                <w:szCs w:val="18"/>
+              </w:rPr>
+              <w:t xml:space="preserve"/>
+            </w:r>
+          </w:p>
+        </w:tc>
+        <w:tc>
+          <w:tcPr>
+            <w:tcW w:type="dxa" w:w="4938"/>
+            <w:tcBorders>
+              <w:top w:val="single" w:color="BFBFBF" w:sz="4"/>
+              <w:left w:val="single" w:color="BFBFBF" w:sz="4"/>
+              <w:bottom w:val="single" w:color="BFBFBF" w:sz="4"/>
+              <w:right w:val="single" w:color="BFBFBF" w:sz="4"/>
+            </w:tcBorders>
+            <w:tcMar>
+              <w:top w:type="dxa" w:w="60"/>
+              <w:left w:type="dxa" w:w="100"/>
+              <w:bottom w:type="dxa" w:w="60"/>
+              <w:right w:type="dxa" w:w="100"/>
+            </w:tcMar>
+            <w:vAlign w:val="top"/>
+          </w:tcPr>
+          <w:p>
+            <w:pPr>
+              <w:spacing w:after="40"/>
+            </w:pPr>
+            <w:r>
+              <w:rPr>
+                <w:sz w:val="18"/>
+                <w:szCs w:val="18"/>
+              </w:rPr>
+              <w:t xml:space="preserve">Art. 13: 18 Aug 2026 </w:t>
+            </w:r>
+            <w:r>
+              <w:rPr>
+                <w:b/>
+                <w:bCs/>
+                <w:sz w:val="18"/>
+                <w:szCs w:val="18"/>
+              </w:rPr>
+              <w:t xml:space="preserve">or</w:t>
+            </w:r>
+            <w:r>
+              <w:rPr>
+                <w:sz w:val="18"/>
+                <w:szCs w:val="18"/>
+              </w:rPr>
+              <w:t xml:space="preserve"> 18 months after the implementing act, whichever later. Act still draft (Apr 2026) → obligation not yet triggered. Open: adoption date.</w:t>
+            </w:r>
+          </w:p>
+        </w:tc>
+      </w:tr>
+      <w:tr>
+        <w:trPr>
+          <w:cantSplit/>
+        </w:trPr>
+        <w:tc>
+          <w:tcPr>
+            <w:tcW w:type="dxa" w:w="500"/>
+            <w:tcBorders>
+              <w:top w:val="single" w:color="BFBFBF" w:sz="4"/>
+              <w:left w:val="single" w:color="BFBFBF" w:sz="4"/>
+              <w:bottom w:val="single" w:color="BFBFBF" w:sz="4"/>
+              <w:right w:val="single" w:color="BFBFBF" w:sz="4"/>
+            </w:tcBorders>
+            <w:shd w:fill="F5F7FA" w:color="auto" w:val="clear"/>
+            <w:tcMar>
+              <w:top w:type="dxa" w:w="60"/>
+              <w:left w:type="dxa" w:w="100"/>
+              <w:bottom w:type="dxa" w:w="60"/>
+              <w:right w:type="dxa" w:w="100"/>
+            </w:tcMar>
+            <w:vAlign w:val="top"/>
+          </w:tcPr>
+          <w:p>
+            <w:pPr>
+              <w:spacing w:after="40"/>
+            </w:pPr>
+            <w:r>
+              <w:rPr>
+                <w:sz w:val="18"/>
+                <w:szCs w:val="18"/>
+              </w:rPr>
+              <w:t xml:space="preserve">4</w:t>
+            </w:r>
+          </w:p>
+        </w:tc>
+        <w:tc>
+          <w:tcPr>
+            <w:tcW w:type="dxa" w:w="2700"/>
+            <w:tcBorders>
+              <w:top w:val="single" w:color="BFBFBF" w:sz="4"/>
+              <w:left w:val="single" w:color="BFBFBF" w:sz="4"/>
+              <w:bottom w:val="single" w:color="BFBFBF" w:sz="4"/>
+              <w:right w:val="single" w:color="BFBFBF" w:sz="4"/>
+            </w:tcBorders>
+            <w:shd w:fill="F5F7FA" w:color="auto" w:val="clear"/>
+            <w:tcMar>
+              <w:top w:type="dxa" w:w="60"/>
+              <w:left w:type="dxa" w:w="100"/>
+              <w:bottom w:type="dxa" w:w="60"/>
+              <w:right w:type="dxa" w:w="100"/>
+            </w:tcMar>
+            <w:vAlign w:val="top"/>
+          </w:tcPr>
+          <w:p>
+            <w:pPr>
+              <w:spacing w:after="40"/>
+            </w:pPr>
+            <w:r>
+              <w:rPr>
+                <w:sz w:val="18"/>
+                <w:szCs w:val="18"/>
+              </w:rPr>
+              <w:t xml:space="preserve">Battery QR code, removability</w:t>
+            </w:r>
+          </w:p>
+        </w:tc>
+        <w:tc>
+          <w:tcPr>
+            <w:tcW w:type="dxa" w:w="1500"/>
+            <w:tcBorders>
+              <w:top w:val="single" w:color="BFBFBF" w:sz="4"/>
+              <w:left w:val="single" w:color="BFBFBF" w:sz="4"/>
+              <w:bottom w:val="single" w:color="BFBFBF" w:sz="4"/>
+              <w:right w:val="single" w:color="BFBFBF" w:sz="4"/>
+            </w:tcBorders>
+            <w:shd w:fill="F5F7FA" w:color="auto" w:val="clear"/>
+            <w:tcMar>
+              <w:top w:type="dxa" w:w="60"/>
+              <w:left w:type="dxa" w:w="100"/>
+              <w:bottom w:type="dxa" w:w="60"/>
+              <w:right w:type="dxa" w:w="100"/>
+            </w:tcMar>
+            <w:vAlign w:val="top"/>
+          </w:tcPr>
+          <w:p>
+            <w:pPr>
+              <w:spacing w:after="40"/>
+            </w:pPr>
+            <w:r>
+              <w:rPr>
+                <w:sz w:val="18"/>
+                <w:szCs w:val="18"/>
+              </w:rPr>
+              <w:t xml:space="preserve"/>
+            </w:r>
+            <w:r>
+              <w:rPr>
+                <w:b/>
+                <w:bCs/>
+                <w:sz w:val="18"/>
+                <w:szCs w:val="18"/>
+              </w:rPr>
+              <w:t xml:space="preserve">Confirmed</w:t>
+            </w:r>
+            <w:r>
+              <w:rPr>
+                <w:sz w:val="18"/>
+                <w:szCs w:val="18"/>
+              </w:rPr>
+              <w:t xml:space="preserve"/>
+            </w:r>
+          </w:p>
+        </w:tc>
+        <w:tc>
+          <w:tcPr>
+            <w:tcW w:type="dxa" w:w="4938"/>
+            <w:tcBorders>
+              <w:top w:val="single" w:color="BFBFBF" w:sz="4"/>
+              <w:left w:val="single" w:color="BFBFBF" w:sz="4"/>
+              <w:bottom w:val="single" w:color="BFBFBF" w:sz="4"/>
+              <w:right w:val="single" w:color="BFBFBF" w:sz="4"/>
+            </w:tcBorders>
+            <w:shd w:fill="F5F7FA" w:color="auto" w:val="clear"/>
+            <w:tcMar>
+              <w:top w:type="dxa" w:w="60"/>
+              <w:left w:type="dxa" w:w="100"/>
+              <w:bottom w:type="dxa" w:w="60"/>
+              <w:right w:type="dxa" w:w="100"/>
+            </w:tcMar>
+            <w:vAlign w:val="top"/>
+          </w:tcPr>
+          <w:p>
+            <w:pPr>
+              <w:spacing w:after="40"/>
+            </w:pPr>
+            <w:r>
+              <w:rPr>
+                <w:sz w:val="18"/>
+                <w:szCs w:val="18"/>
+              </w:rPr>
+              <w:t xml:space="preserve">18 Feb 2027 (Art. 13(6); Art. 11).</w:t>
+            </w:r>
+          </w:p>
+        </w:tc>
+      </w:tr>
+      <w:tr>
+        <w:trPr>
+          <w:cantSplit/>
+        </w:trPr>
+        <w:tc>
+          <w:tcPr>
+            <w:tcW w:type="dxa" w:w="500"/>
+            <w:tcBorders>
+              <w:top w:val="single" w:color="BFBFBF" w:sz="4"/>
+              <w:left w:val="single" w:color="BFBFBF" w:sz="4"/>
+              <w:bottom w:val="single" w:color="BFBFBF" w:sz="4"/>
+              <w:right w:val="single" w:color="BFBFBF" w:sz="4"/>
+            </w:tcBorders>
+            <w:tcMar>
+              <w:top w:type="dxa" w:w="60"/>
+              <w:left w:type="dxa" w:w="100"/>
+              <w:bottom w:type="dxa" w:w="60"/>
+              <w:right w:type="dxa" w:w="100"/>
+            </w:tcMar>
+            <w:vAlign w:val="top"/>
+          </w:tcPr>
+          <w:p>
+            <w:pPr>
+              <w:spacing w:after="40"/>
+            </w:pPr>
+            <w:r>
+              <w:rPr>
+                <w:sz w:val="18"/>
+                <w:szCs w:val="18"/>
+              </w:rPr>
+              <w:t xml:space="preserve">5</w:t>
+            </w:r>
+          </w:p>
+        </w:tc>
+        <w:tc>
+          <w:tcPr>
+            <w:tcW w:type="dxa" w:w="2700"/>
+            <w:tcBorders>
+              <w:top w:val="single" w:color="BFBFBF" w:sz="4"/>
+              <w:left w:val="single" w:color="BFBFBF" w:sz="4"/>
+              <w:bottom w:val="single" w:color="BFBFBF" w:sz="4"/>
+              <w:right w:val="single" w:color="BFBFBF" w:sz="4"/>
+            </w:tcBorders>
+            <w:tcMar>
+              <w:top w:type="dxa" w:w="60"/>
+              <w:left w:type="dxa" w:w="100"/>
+              <w:bottom w:type="dxa" w:w="60"/>
+              <w:right w:type="dxa" w:w="100"/>
+            </w:tcMar>
+            <w:vAlign w:val="top"/>
+          </w:tcPr>
+          <w:p>
+            <w:pPr>
+              <w:spacing w:after="40"/>
+            </w:pPr>
+            <w:r>
+              <w:rPr>
+                <w:sz w:val="18"/>
+                <w:szCs w:val="18"/>
+              </w:rPr>
+              <w:t xml:space="preserve">Toy Safety Regulation</w:t>
+            </w:r>
+          </w:p>
+        </w:tc>
+        <w:tc>
+          <w:tcPr>
+            <w:tcW w:type="dxa" w:w="1500"/>
+            <w:tcBorders>
+              <w:top w:val="single" w:color="BFBFBF" w:sz="4"/>
+              <w:left w:val="single" w:color="BFBFBF" w:sz="4"/>
+              <w:bottom w:val="single" w:color="BFBFBF" w:sz="4"/>
+              <w:right w:val="single" w:color="BFBFBF" w:sz="4"/>
+            </w:tcBorders>
+            <w:tcMar>
+              <w:top w:type="dxa" w:w="60"/>
+              <w:left w:type="dxa" w:w="100"/>
+              <w:bottom w:type="dxa" w:w="60"/>
+              <w:right w:type="dxa" w:w="100"/>
+            </w:tcMar>
+            <w:vAlign w:val="top"/>
+          </w:tcPr>
+          <w:p>
+            <w:pPr>
+              <w:spacing w:after="40"/>
+            </w:pPr>
+            <w:r>
+              <w:rPr>
+                <w:sz w:val="18"/>
+                <w:szCs w:val="18"/>
+              </w:rPr>
+              <w:t xml:space="preserve"/>
+            </w:r>
+            <w:r>
+              <w:rPr>
+                <w:b/>
+                <w:bCs/>
+                <w:sz w:val="18"/>
+                <w:szCs w:val="18"/>
+              </w:rPr>
+              <w:t xml:space="preserve">Corrected</w:t>
+            </w:r>
+            <w:r>
+              <w:rPr>
+                <w:sz w:val="18"/>
+                <w:szCs w:val="18"/>
+              </w:rPr>
+              <w:t xml:space="preserve"/>
+            </w:r>
+          </w:p>
+        </w:tc>
+        <w:tc>
+          <w:tcPr>
+            <w:tcW w:type="dxa" w:w="4938"/>
+            <w:tcBorders>
+              <w:top w:val="single" w:color="BFBFBF" w:sz="4"/>
+              <w:left w:val="single" w:color="BFBFBF" w:sz="4"/>
+              <w:bottom w:val="single" w:color="BFBFBF" w:sz="4"/>
+              <w:right w:val="single" w:color="BFBFBF" w:sz="4"/>
+            </w:tcBorders>
+            <w:tcMar>
+              <w:top w:type="dxa" w:w="60"/>
+              <w:left w:type="dxa" w:w="100"/>
+              <w:bottom w:type="dxa" w:w="60"/>
+              <w:right w:type="dxa" w:w="100"/>
+            </w:tcMar>
+            <w:vAlign w:val="top"/>
+          </w:tcPr>
+          <w:p>
+            <w:pPr>
+              <w:spacing w:after="40"/>
+            </w:pPr>
+            <w:r>
+              <w:rPr>
+                <w:sz w:val="18"/>
+                <w:szCs w:val="18"/>
+              </w:rPr>
+              <w:t xml:space="preserve">(EU) 2025/2509, OJ 12 Dec 2025, in force 1 Jan 2026, applies 1 Aug 2030.</w:t>
+            </w:r>
+          </w:p>
+        </w:tc>
+      </w:tr>
+      <w:tr>
+        <w:trPr>
+          <w:cantSplit/>
+        </w:trPr>
+        <w:tc>
+          <w:tcPr>
+            <w:tcW w:type="dxa" w:w="500"/>
+            <w:tcBorders>
+              <w:top w:val="single" w:color="BFBFBF" w:sz="4"/>
+              <w:left w:val="single" w:color="BFBFBF" w:sz="4"/>
+              <w:bottom w:val="single" w:color="BFBFBF" w:sz="4"/>
+              <w:right w:val="single" w:color="BFBFBF" w:sz="4"/>
+            </w:tcBorders>
+            <w:shd w:fill="F5F7FA" w:color="auto" w:val="clear"/>
+            <w:tcMar>
+              <w:top w:type="dxa" w:w="60"/>
+              <w:left w:type="dxa" w:w="100"/>
+              <w:bottom w:type="dxa" w:w="60"/>
+              <w:right w:type="dxa" w:w="100"/>
+            </w:tcMar>
+            <w:vAlign w:val="top"/>
+          </w:tcPr>
+          <w:p>
+            <w:pPr>
+              <w:spacing w:after="40"/>
+            </w:pPr>
+            <w:r>
+              <w:rPr>
+                <w:sz w:val="18"/>
+                <w:szCs w:val="18"/>
+              </w:rPr>
+              <w:t xml:space="preserve">6</w:t>
+            </w:r>
+          </w:p>
+        </w:tc>
+        <w:tc>
+          <w:tcPr>
+            <w:tcW w:type="dxa" w:w="2700"/>
+            <w:tcBorders>
+              <w:top w:val="single" w:color="BFBFBF" w:sz="4"/>
+              <w:left w:val="single" w:color="BFBFBF" w:sz="4"/>
+              <w:bottom w:val="single" w:color="BFBFBF" w:sz="4"/>
+              <w:right w:val="single" w:color="BFBFBF" w:sz="4"/>
+            </w:tcBorders>
+            <w:shd w:fill="F5F7FA" w:color="auto" w:val="clear"/>
+            <w:tcMar>
+              <w:top w:type="dxa" w:w="60"/>
+              <w:left w:type="dxa" w:w="100"/>
+              <w:bottom w:type="dxa" w:w="60"/>
+              <w:right w:type="dxa" w:w="100"/>
+            </w:tcMar>
+            <w:vAlign w:val="top"/>
+          </w:tcPr>
+          <w:p>
+            <w:pPr>
+              <w:spacing w:after="40"/>
+            </w:pPr>
+            <w:r>
+              <w:rPr>
+                <w:sz w:val="18"/>
+                <w:szCs w:val="18"/>
+              </w:rPr>
+              <w:t xml:space="preserve">CBAM threshold and certificates</w:t>
+            </w:r>
+          </w:p>
+        </w:tc>
+        <w:tc>
+          <w:tcPr>
+            <w:tcW w:type="dxa" w:w="1500"/>
+            <w:tcBorders>
+              <w:top w:val="single" w:color="BFBFBF" w:sz="4"/>
+              <w:left w:val="single" w:color="BFBFBF" w:sz="4"/>
+              <w:bottom w:val="single" w:color="BFBFBF" w:sz="4"/>
+              <w:right w:val="single" w:color="BFBFBF" w:sz="4"/>
+            </w:tcBorders>
+            <w:shd w:fill="F5F7FA" w:color="auto" w:val="clear"/>
+            <w:tcMar>
+              <w:top w:type="dxa" w:w="60"/>
+              <w:left w:type="dxa" w:w="100"/>
+              <w:bottom w:type="dxa" w:w="60"/>
+              <w:right w:type="dxa" w:w="100"/>
+            </w:tcMar>
+            <w:vAlign w:val="top"/>
+          </w:tcPr>
+          <w:p>
+            <w:pPr>
+              <w:spacing w:after="40"/>
+            </w:pPr>
+            <w:r>
+              <w:rPr>
+                <w:sz w:val="18"/>
+                <w:szCs w:val="18"/>
+              </w:rPr>
+              <w:t xml:space="preserve"/>
+            </w:r>
+            <w:r>
+              <w:rPr>
+                <w:b/>
+                <w:bCs/>
+                <w:sz w:val="18"/>
+                <w:szCs w:val="18"/>
+              </w:rPr>
+              <w:t xml:space="preserve">Confirmed</w:t>
+            </w:r>
+            <w:r>
+              <w:rPr>
+                <w:sz w:val="18"/>
+                <w:szCs w:val="18"/>
+              </w:rPr>
+              <w:t xml:space="preserve"/>
+            </w:r>
+          </w:p>
+        </w:tc>
+        <w:tc>
+          <w:tcPr>
+            <w:tcW w:type="dxa" w:w="4938"/>
+            <w:tcBorders>
+              <w:top w:val="single" w:color="BFBFBF" w:sz="4"/>
+              <w:left w:val="single" w:color="BFBFBF" w:sz="4"/>
+              <w:bottom w:val="single" w:color="BFBFBF" w:sz="4"/>
+              <w:right w:val="single" w:color="BFBFBF" w:sz="4"/>
+            </w:tcBorders>
+            <w:shd w:fill="F5F7FA" w:color="auto" w:val="clear"/>
+            <w:tcMar>
+              <w:top w:type="dxa" w:w="60"/>
+              <w:left w:type="dxa" w:w="100"/>
+              <w:bottom w:type="dxa" w:w="60"/>
+              <w:right w:type="dxa" w:w="100"/>
+            </w:tcMar>
+            <w:vAlign w:val="top"/>
+          </w:tcPr>
+          <w:p>
+            <w:pPr>
+              <w:spacing w:after="40"/>
+            </w:pPr>
+            <w:r>
+              <w:rPr>
+                <w:sz w:val="18"/>
+                <w:szCs w:val="18"/>
+              </w:rPr>
+              <w:t xml:space="preserve">50 t/yr de minimis — Reg. (EU) 2025/2083; certificate sales from 1 Feb 2027.</w:t>
+            </w:r>
+          </w:p>
+        </w:tc>
+      </w:tr>
+      <w:tr>
+        <w:trPr>
+          <w:cantSplit/>
+        </w:trPr>
+        <w:tc>
+          <w:tcPr>
+            <w:tcW w:type="dxa" w:w="500"/>
+            <w:tcBorders>
+              <w:top w:val="single" w:color="BFBFBF" w:sz="4"/>
+              <w:left w:val="single" w:color="BFBFBF" w:sz="4"/>
+              <w:bottom w:val="single" w:color="BFBFBF" w:sz="4"/>
+              <w:right w:val="single" w:color="BFBFBF" w:sz="4"/>
+            </w:tcBorders>
+            <w:tcMar>
+              <w:top w:type="dxa" w:w="60"/>
+              <w:left w:type="dxa" w:w="100"/>
+              <w:bottom w:type="dxa" w:w="60"/>
+              <w:right w:type="dxa" w:w="100"/>
+            </w:tcMar>
+            <w:vAlign w:val="top"/>
+          </w:tcPr>
+          <w:p>
+            <w:pPr>
+              <w:spacing w:after="40"/>
+            </w:pPr>
+            <w:r>
+              <w:rPr>
+                <w:sz w:val="18"/>
+                <w:szCs w:val="18"/>
+              </w:rPr>
+              <w:t xml:space="preserve">7</w:t>
+            </w:r>
+          </w:p>
+        </w:tc>
+        <w:tc>
+          <w:tcPr>
+            <w:tcW w:type="dxa" w:w="2700"/>
+            <w:tcBorders>
+              <w:top w:val="single" w:color="BFBFBF" w:sz="4"/>
+              <w:left w:val="single" w:color="BFBFBF" w:sz="4"/>
+              <w:bottom w:val="single" w:color="BFBFBF" w:sz="4"/>
+              <w:right w:val="single" w:color="BFBFBF" w:sz="4"/>
+            </w:tcBorders>
+            <w:tcMar>
+              <w:top w:type="dxa" w:w="60"/>
+              <w:left w:type="dxa" w:w="100"/>
+              <w:bottom w:type="dxa" w:w="60"/>
+              <w:right w:type="dxa" w:w="100"/>
+            </w:tcMar>
+            <w:vAlign w:val="top"/>
+          </w:tcPr>
+          <w:p>
+            <w:pPr>
+              <w:spacing w:after="40"/>
+            </w:pPr>
+            <w:r>
+              <w:rPr>
+                <w:sz w:val="18"/>
+                <w:szCs w:val="18"/>
+              </w:rPr>
+              <w:t xml:space="preserve">Machinery Regulation</w:t>
+            </w:r>
+          </w:p>
+        </w:tc>
+        <w:tc>
+          <w:tcPr>
+            <w:tcW w:type="dxa" w:w="1500"/>
+            <w:tcBorders>
+              <w:top w:val="single" w:color="BFBFBF" w:sz="4"/>
+              <w:left w:val="single" w:color="BFBFBF" w:sz="4"/>
+              <w:bottom w:val="single" w:color="BFBFBF" w:sz="4"/>
+              <w:right w:val="single" w:color="BFBFBF" w:sz="4"/>
+            </w:tcBorders>
+            <w:tcMar>
+              <w:top w:type="dxa" w:w="60"/>
+              <w:left w:type="dxa" w:w="100"/>
+              <w:bottom w:type="dxa" w:w="60"/>
+              <w:right w:type="dxa" w:w="100"/>
+            </w:tcMar>
+            <w:vAlign w:val="top"/>
+          </w:tcPr>
+          <w:p>
+            <w:pPr>
+              <w:spacing w:after="40"/>
+            </w:pPr>
+            <w:r>
+              <w:rPr>
+                <w:sz w:val="18"/>
+                <w:szCs w:val="18"/>
+              </w:rPr>
+              <w:t xml:space="preserve"/>
+            </w:r>
+            <w:r>
+              <w:rPr>
+                <w:b/>
+                <w:bCs/>
+                <w:sz w:val="18"/>
+                <w:szCs w:val="18"/>
+              </w:rPr>
+              <w:t xml:space="preserve">Confirmed / Open</w:t>
+            </w:r>
+            <w:r>
+              <w:rPr>
+                <w:sz w:val="18"/>
+                <w:szCs w:val="18"/>
+              </w:rPr>
+              <w:t xml:space="preserve"/>
+            </w:r>
+          </w:p>
+        </w:tc>
+        <w:tc>
+          <w:tcPr>
+            <w:tcW w:type="dxa" w:w="4938"/>
+            <w:tcBorders>
+              <w:top w:val="single" w:color="BFBFBF" w:sz="4"/>
+              <w:left w:val="single" w:color="BFBFBF" w:sz="4"/>
+              <w:bottom w:val="single" w:color="BFBFBF" w:sz="4"/>
+              <w:right w:val="single" w:color="BFBFBF" w:sz="4"/>
+            </w:tcBorders>
+            <w:tcMar>
+              <w:top w:type="dxa" w:w="60"/>
+              <w:left w:type="dxa" w:w="100"/>
+              <w:bottom w:type="dxa" w:w="60"/>
+              <w:right w:type="dxa" w:w="100"/>
+            </w:tcMar>
+            <w:vAlign w:val="top"/>
+          </w:tcPr>
+          <w:p>
+            <w:pPr>
+              <w:spacing w:after="40"/>
+            </w:pPr>
+            <w:r>
+              <w:rPr>
+                <w:sz w:val="18"/>
+                <w:szCs w:val="18"/>
+              </w:rPr>
+              <w:t xml:space="preserve">20 Jan 2027 binding. Cybersecurity postponement requested, not adopted; Omnibus IV digital DoC pending.</w:t>
+            </w:r>
+          </w:p>
+        </w:tc>
+      </w:tr>
+      <w:tr>
+        <w:trPr>
+          <w:cantSplit/>
+        </w:trPr>
+        <w:tc>
+          <w:tcPr>
+            <w:tcW w:type="dxa" w:w="500"/>
+            <w:tcBorders>
+              <w:top w:val="single" w:color="BFBFBF" w:sz="4"/>
+              <w:left w:val="single" w:color="BFBFBF" w:sz="4"/>
+              <w:bottom w:val="single" w:color="BFBFBF" w:sz="4"/>
+              <w:right w:val="single" w:color="BFBFBF" w:sz="4"/>
+            </w:tcBorders>
+            <w:shd w:fill="F5F7FA" w:color="auto" w:val="clear"/>
+            <w:tcMar>
+              <w:top w:type="dxa" w:w="60"/>
+              <w:left w:type="dxa" w:w="100"/>
+              <w:bottom w:type="dxa" w:w="60"/>
+              <w:right w:type="dxa" w:w="100"/>
+            </w:tcMar>
+            <w:vAlign w:val="top"/>
+          </w:tcPr>
+          <w:p>
+            <w:pPr>
+              <w:spacing w:after="40"/>
+            </w:pPr>
+            <w:r>
+              <w:rPr>
+                <w:sz w:val="18"/>
+                <w:szCs w:val="18"/>
+              </w:rPr>
+              <w:t xml:space="preserve">8</w:t>
+            </w:r>
+          </w:p>
+        </w:tc>
+        <w:tc>
+          <w:tcPr>
+            <w:tcW w:type="dxa" w:w="2700"/>
+            <w:tcBorders>
+              <w:top w:val="single" w:color="BFBFBF" w:sz="4"/>
+              <w:left w:val="single" w:color="BFBFBF" w:sz="4"/>
+              <w:bottom w:val="single" w:color="BFBFBF" w:sz="4"/>
+              <w:right w:val="single" w:color="BFBFBF" w:sz="4"/>
+            </w:tcBorders>
+            <w:shd w:fill="F5F7FA" w:color="auto" w:val="clear"/>
+            <w:tcMar>
+              <w:top w:type="dxa" w:w="60"/>
+              <w:left w:type="dxa" w:w="100"/>
+              <w:bottom w:type="dxa" w:w="60"/>
+              <w:right w:type="dxa" w:w="100"/>
+            </w:tcMar>
+            <w:vAlign w:val="top"/>
+          </w:tcPr>
+          <w:p>
+            <w:pPr>
+              <w:spacing w:after="40"/>
+            </w:pPr>
+            <w:r>
+              <w:rPr>
+                <w:sz w:val="18"/>
+                <w:szCs w:val="18"/>
+              </w:rPr>
+              <w:t xml:space="preserve">New CPR</w:t>
+            </w:r>
+          </w:p>
+        </w:tc>
+        <w:tc>
+          <w:tcPr>
+            <w:tcW w:type="dxa" w:w="1500"/>
+            <w:tcBorders>
+              <w:top w:val="single" w:color="BFBFBF" w:sz="4"/>
+              <w:left w:val="single" w:color="BFBFBF" w:sz="4"/>
+              <w:bottom w:val="single" w:color="BFBFBF" w:sz="4"/>
+              <w:right w:val="single" w:color="BFBFBF" w:sz="4"/>
+            </w:tcBorders>
+            <w:shd w:fill="F5F7FA" w:color="auto" w:val="clear"/>
+            <w:tcMar>
+              <w:top w:type="dxa" w:w="60"/>
+              <w:left w:type="dxa" w:w="100"/>
+              <w:bottom w:type="dxa" w:w="60"/>
+              <w:right w:type="dxa" w:w="100"/>
+            </w:tcMar>
+            <w:vAlign w:val="top"/>
+          </w:tcPr>
+          <w:p>
+            <w:pPr>
+              <w:spacing w:after="40"/>
+            </w:pPr>
+            <w:r>
+              <w:rPr>
+                <w:sz w:val="18"/>
+                <w:szCs w:val="18"/>
+              </w:rPr>
+              <w:t xml:space="preserve"/>
+            </w:r>
+            <w:r>
+              <w:rPr>
+                <w:b/>
+                <w:bCs/>
+                <w:sz w:val="18"/>
+                <w:szCs w:val="18"/>
+              </w:rPr>
+              <w:t xml:space="preserve">Confirmed</w:t>
+            </w:r>
+            <w:r>
+              <w:rPr>
+                <w:sz w:val="18"/>
+                <w:szCs w:val="18"/>
+              </w:rPr>
+              <w:t xml:space="preserve"/>
+            </w:r>
+          </w:p>
+        </w:tc>
+        <w:tc>
+          <w:tcPr>
+            <w:tcW w:type="dxa" w:w="4938"/>
+            <w:tcBorders>
+              <w:top w:val="single" w:color="BFBFBF" w:sz="4"/>
+              <w:left w:val="single" w:color="BFBFBF" w:sz="4"/>
+              <w:bottom w:val="single" w:color="BFBFBF" w:sz="4"/>
+              <w:right w:val="single" w:color="BFBFBF" w:sz="4"/>
+            </w:tcBorders>
+            <w:shd w:fill="F5F7FA" w:color="auto" w:val="clear"/>
+            <w:tcMar>
+              <w:top w:type="dxa" w:w="60"/>
+              <w:left w:type="dxa" w:w="100"/>
+              <w:bottom w:type="dxa" w:w="60"/>
+              <w:right w:type="dxa" w:w="100"/>
+            </w:tcMar>
+            <w:vAlign w:val="top"/>
+          </w:tcPr>
+          <w:p>
+            <w:pPr>
+              <w:spacing w:after="40"/>
+            </w:pPr>
+            <w:r>
+              <w:rPr>
+                <w:sz w:val="18"/>
+                <w:szCs w:val="18"/>
+              </w:rPr>
+              <w:t xml:space="preserve">Applies 8 Jan 2026; 305/2011 repealed save transitional articles to 8 Jan 2040; DoPC replaces DoP.</w:t>
+            </w:r>
+          </w:p>
+        </w:tc>
+      </w:tr>
+      <w:tr>
+        <w:trPr>
+          <w:cantSplit/>
+        </w:trPr>
+        <w:tc>
+          <w:tcPr>
+            <w:tcW w:type="dxa" w:w="500"/>
+            <w:tcBorders>
+              <w:top w:val="single" w:color="BFBFBF" w:sz="4"/>
+              <w:left w:val="single" w:color="BFBFBF" w:sz="4"/>
+              <w:bottom w:val="single" w:color="BFBFBF" w:sz="4"/>
+              <w:right w:val="single" w:color="BFBFBF" w:sz="4"/>
+            </w:tcBorders>
+            <w:tcMar>
+              <w:top w:type="dxa" w:w="60"/>
+              <w:left w:type="dxa" w:w="100"/>
+              <w:bottom w:type="dxa" w:w="60"/>
+              <w:right w:type="dxa" w:w="100"/>
+            </w:tcMar>
+            <w:vAlign w:val="top"/>
+          </w:tcPr>
+          <w:p>
+            <w:pPr>
+              <w:spacing w:after="40"/>
+            </w:pPr>
+            <w:r>
+              <w:rPr>
+                <w:sz w:val="18"/>
+                <w:szCs w:val="18"/>
+              </w:rPr>
+              <w:t xml:space="preserve">9</w:t>
+            </w:r>
+          </w:p>
+        </w:tc>
+        <w:tc>
+          <w:tcPr>
+            <w:tcW w:type="dxa" w:w="2700"/>
+            <w:tcBorders>
+              <w:top w:val="single" w:color="BFBFBF" w:sz="4"/>
+              <w:left w:val="single" w:color="BFBFBF" w:sz="4"/>
+              <w:bottom w:val="single" w:color="BFBFBF" w:sz="4"/>
+              <w:right w:val="single" w:color="BFBFBF" w:sz="4"/>
+            </w:tcBorders>
+            <w:tcMar>
+              <w:top w:type="dxa" w:w="60"/>
+              <w:left w:type="dxa" w:w="100"/>
+              <w:bottom w:type="dxa" w:w="60"/>
+              <w:right w:type="dxa" w:w="100"/>
+            </w:tcMar>
+            <w:vAlign w:val="top"/>
+          </w:tcPr>
+          <w:p>
+            <w:pPr>
+              <w:spacing w:after="40"/>
+            </w:pPr>
+            <w:r>
+              <w:rPr>
+                <w:sz w:val="18"/>
+                <w:szCs w:val="18"/>
+              </w:rPr>
+              <w:t xml:space="preserve">REACH entry 77 formaldehyde</w:t>
+            </w:r>
+          </w:p>
+        </w:tc>
+        <w:tc>
+          <w:tcPr>
+            <w:tcW w:type="dxa" w:w="1500"/>
+            <w:tcBorders>
+              <w:top w:val="single" w:color="BFBFBF" w:sz="4"/>
+              <w:left w:val="single" w:color="BFBFBF" w:sz="4"/>
+              <w:bottom w:val="single" w:color="BFBFBF" w:sz="4"/>
+              <w:right w:val="single" w:color="BFBFBF" w:sz="4"/>
+            </w:tcBorders>
+            <w:tcMar>
+              <w:top w:type="dxa" w:w="60"/>
+              <w:left w:type="dxa" w:w="100"/>
+              <w:bottom w:type="dxa" w:w="60"/>
+              <w:right w:type="dxa" w:w="100"/>
+            </w:tcMar>
+            <w:vAlign w:val="top"/>
+          </w:tcPr>
+          <w:p>
+            <w:pPr>
+              <w:spacing w:after="40"/>
+            </w:pPr>
+            <w:r>
+              <w:rPr>
+                <w:sz w:val="18"/>
+                <w:szCs w:val="18"/>
+              </w:rPr>
+              <w:t xml:space="preserve"/>
+            </w:r>
+            <w:r>
+              <w:rPr>
+                <w:b/>
+                <w:bCs/>
+                <w:sz w:val="18"/>
+                <w:szCs w:val="18"/>
+              </w:rPr>
+              <w:t xml:space="preserve">Confirmed</w:t>
+            </w:r>
+            <w:r>
+              <w:rPr>
+                <w:sz w:val="18"/>
+                <w:szCs w:val="18"/>
+              </w:rPr>
+              <w:t xml:space="preserve"/>
+            </w:r>
+          </w:p>
+        </w:tc>
+        <w:tc>
+          <w:tcPr>
+            <w:tcW w:type="dxa" w:w="4938"/>
+            <w:tcBorders>
+              <w:top w:val="single" w:color="BFBFBF" w:sz="4"/>
+              <w:left w:val="single" w:color="BFBFBF" w:sz="4"/>
+              <w:bottom w:val="single" w:color="BFBFBF" w:sz="4"/>
+              <w:right w:val="single" w:color="BFBFBF" w:sz="4"/>
+            </w:tcBorders>
+            <w:tcMar>
+              <w:top w:type="dxa" w:w="60"/>
+              <w:left w:type="dxa" w:w="100"/>
+              <w:bottom w:type="dxa" w:w="60"/>
+              <w:right w:type="dxa" w:w="100"/>
+            </w:tcMar>
+            <w:vAlign w:val="top"/>
+          </w:tcPr>
+          <w:p>
+            <w:pPr>
+              <w:spacing w:after="40"/>
+            </w:pPr>
+            <w:r>
+              <w:rPr>
+                <w:sz w:val="18"/>
+                <w:szCs w:val="18"/>
+              </w:rPr>
+              <w:t xml:space="preserve">0.062 / 0.080 mg/m³; since 6 Aug 2026; vehicles 6 Aug 2027; outdoor-only articles exempt.</w:t>
+            </w:r>
+          </w:p>
+        </w:tc>
+      </w:tr>
+      <w:tr>
+        <w:trPr>
+          <w:cantSplit/>
+        </w:trPr>
+        <w:tc>
+          <w:tcPr>
+            <w:tcW w:type="dxa" w:w="500"/>
+            <w:tcBorders>
+              <w:top w:val="single" w:color="BFBFBF" w:sz="4"/>
+              <w:left w:val="single" w:color="BFBFBF" w:sz="4"/>
+              <w:bottom w:val="single" w:color="BFBFBF" w:sz="4"/>
+              <w:right w:val="single" w:color="BFBFBF" w:sz="4"/>
+            </w:tcBorders>
+            <w:shd w:fill="F5F7FA" w:color="auto" w:val="clear"/>
+            <w:tcMar>
+              <w:top w:type="dxa" w:w="60"/>
+              <w:left w:type="dxa" w:w="100"/>
+              <w:bottom w:type="dxa" w:w="60"/>
+              <w:right w:type="dxa" w:w="100"/>
+            </w:tcMar>
+            <w:vAlign w:val="top"/>
+          </w:tcPr>
+          <w:p>
+            <w:pPr>
+              <w:spacing w:after="40"/>
+            </w:pPr>
+            <w:r>
+              <w:rPr>
+                <w:sz w:val="18"/>
+                <w:szCs w:val="18"/>
+              </w:rPr>
+              <w:t xml:space="preserve">10</w:t>
+            </w:r>
+          </w:p>
+        </w:tc>
+        <w:tc>
+          <w:tcPr>
+            <w:tcW w:type="dxa" w:w="2700"/>
+            <w:tcBorders>
+              <w:top w:val="single" w:color="BFBFBF" w:sz="4"/>
+              <w:left w:val="single" w:color="BFBFBF" w:sz="4"/>
+              <w:bottom w:val="single" w:color="BFBFBF" w:sz="4"/>
+              <w:right w:val="single" w:color="BFBFBF" w:sz="4"/>
+            </w:tcBorders>
+            <w:shd w:fill="F5F7FA" w:color="auto" w:val="clear"/>
+            <w:tcMar>
+              <w:top w:type="dxa" w:w="60"/>
+              <w:left w:type="dxa" w:w="100"/>
+              <w:bottom w:type="dxa" w:w="60"/>
+              <w:right w:type="dxa" w:w="100"/>
+            </w:tcMar>
+            <w:vAlign w:val="top"/>
+          </w:tcPr>
+          <w:p>
+            <w:pPr>
+              <w:spacing w:after="40"/>
+            </w:pPr>
+            <w:r>
+              <w:rPr>
+                <w:sz w:val="18"/>
+                <w:szCs w:val="18"/>
+              </w:rPr>
+              <w:t xml:space="preserve">REACH entry 79 PFHxA</w:t>
+            </w:r>
+          </w:p>
+        </w:tc>
+        <w:tc>
+          <w:tcPr>
+            <w:tcW w:type="dxa" w:w="1500"/>
+            <w:tcBorders>
+              <w:top w:val="single" w:color="BFBFBF" w:sz="4"/>
+              <w:left w:val="single" w:color="BFBFBF" w:sz="4"/>
+              <w:bottom w:val="single" w:color="BFBFBF" w:sz="4"/>
+              <w:right w:val="single" w:color="BFBFBF" w:sz="4"/>
+            </w:tcBorders>
+            <w:shd w:fill="F5F7FA" w:color="auto" w:val="clear"/>
+            <w:tcMar>
+              <w:top w:type="dxa" w:w="60"/>
+              <w:left w:type="dxa" w:w="100"/>
+              <w:bottom w:type="dxa" w:w="60"/>
+              <w:right w:type="dxa" w:w="100"/>
+            </w:tcMar>
+            <w:vAlign w:val="top"/>
+          </w:tcPr>
+          <w:p>
+            <w:pPr>
+              <w:spacing w:after="40"/>
+            </w:pPr>
+            <w:r>
+              <w:rPr>
+                <w:sz w:val="18"/>
+                <w:szCs w:val="18"/>
+              </w:rPr>
+              <w:t xml:space="preserve"/>
+            </w:r>
+            <w:r>
+              <w:rPr>
+                <w:b/>
+                <w:bCs/>
+                <w:sz w:val="18"/>
+                <w:szCs w:val="18"/>
+              </w:rPr>
+              <w:t xml:space="preserve">Confirmed</w:t>
+            </w:r>
+            <w:r>
+              <w:rPr>
+                <w:sz w:val="18"/>
+                <w:szCs w:val="18"/>
+              </w:rPr>
+              <w:t xml:space="preserve"/>
+            </w:r>
+          </w:p>
+        </w:tc>
+        <w:tc>
+          <w:tcPr>
+            <w:tcW w:type="dxa" w:w="4938"/>
+            <w:tcBorders>
+              <w:top w:val="single" w:color="BFBFBF" w:sz="4"/>
+              <w:left w:val="single" w:color="BFBFBF" w:sz="4"/>
+              <w:bottom w:val="single" w:color="BFBFBF" w:sz="4"/>
+              <w:right w:val="single" w:color="BFBFBF" w:sz="4"/>
+            </w:tcBorders>
+            <w:shd w:fill="F5F7FA" w:color="auto" w:val="clear"/>
+            <w:tcMar>
+              <w:top w:type="dxa" w:w="60"/>
+              <w:left w:type="dxa" w:w="100"/>
+              <w:bottom w:type="dxa" w:w="60"/>
+              <w:right w:type="dxa" w:w="100"/>
+            </w:tcMar>
+            <w:vAlign w:val="top"/>
+          </w:tcPr>
+          <w:p>
+            <w:pPr>
+              <w:spacing w:after="40"/>
+            </w:pPr>
+            <w:r>
+              <w:rPr>
+                <w:sz w:val="18"/>
+                <w:szCs w:val="18"/>
+              </w:rPr>
+              <w:t xml:space="preserve">10 Oct 2026 / 10 Oct 2027 by use; 25 ppb / 1000 ppb.</w:t>
+            </w:r>
+          </w:p>
+        </w:tc>
+      </w:tr>
+      <w:tr>
+        <w:trPr>
+          <w:cantSplit/>
+        </w:trPr>
+        <w:tc>
+          <w:tcPr>
+            <w:tcW w:type="dxa" w:w="500"/>
+            <w:tcBorders>
+              <w:top w:val="single" w:color="BFBFBF" w:sz="4"/>
+              <w:left w:val="single" w:color="BFBFBF" w:sz="4"/>
+              <w:bottom w:val="single" w:color="BFBFBF" w:sz="4"/>
+              <w:right w:val="single" w:color="BFBFBF" w:sz="4"/>
+            </w:tcBorders>
+            <w:tcMar>
+              <w:top w:type="dxa" w:w="60"/>
+              <w:left w:type="dxa" w:w="100"/>
+              <w:bottom w:type="dxa" w:w="60"/>
+              <w:right w:type="dxa" w:w="100"/>
+            </w:tcMar>
+            <w:vAlign w:val="top"/>
+          </w:tcPr>
+          <w:p>
+            <w:pPr>
+              <w:spacing w:after="40"/>
+            </w:pPr>
+            <w:r>
+              <w:rPr>
+                <w:sz w:val="18"/>
+                <w:szCs w:val="18"/>
+              </w:rPr>
+              <w:t xml:space="preserve">11</w:t>
+            </w:r>
+          </w:p>
+        </w:tc>
+        <w:tc>
+          <w:tcPr>
+            <w:tcW w:type="dxa" w:w="2700"/>
+            <w:tcBorders>
+              <w:top w:val="single" w:color="BFBFBF" w:sz="4"/>
+              <w:left w:val="single" w:color="BFBFBF" w:sz="4"/>
+              <w:bottom w:val="single" w:color="BFBFBF" w:sz="4"/>
+              <w:right w:val="single" w:color="BFBFBF" w:sz="4"/>
+            </w:tcBorders>
+            <w:tcMar>
+              <w:top w:type="dxa" w:w="60"/>
+              <w:left w:type="dxa" w:w="100"/>
+              <w:bottom w:type="dxa" w:w="60"/>
+              <w:right w:type="dxa" w:w="100"/>
+            </w:tcMar>
+            <w:vAlign w:val="top"/>
+          </w:tcPr>
+          <w:p>
+            <w:pPr>
+              <w:spacing w:after="40"/>
+            </w:pPr>
+            <w:r>
+              <w:rPr>
+                <w:sz w:val="18"/>
+                <w:szCs w:val="18"/>
+              </w:rPr>
+              <w:t xml:space="preserve">PPWR</w:t>
+            </w:r>
+          </w:p>
+        </w:tc>
+        <w:tc>
+          <w:tcPr>
+            <w:tcW w:type="dxa" w:w="1500"/>
+            <w:tcBorders>
+              <w:top w:val="single" w:color="BFBFBF" w:sz="4"/>
+              <w:left w:val="single" w:color="BFBFBF" w:sz="4"/>
+              <w:bottom w:val="single" w:color="BFBFBF" w:sz="4"/>
+              <w:right w:val="single" w:color="BFBFBF" w:sz="4"/>
+            </w:tcBorders>
+            <w:tcMar>
+              <w:top w:type="dxa" w:w="60"/>
+              <w:left w:type="dxa" w:w="100"/>
+              <w:bottom w:type="dxa" w:w="60"/>
+              <w:right w:type="dxa" w:w="100"/>
+            </w:tcMar>
+            <w:vAlign w:val="top"/>
+          </w:tcPr>
+          <w:p>
+            <w:pPr>
+              <w:spacing w:after="40"/>
+            </w:pPr>
+            <w:r>
+              <w:rPr>
+                <w:sz w:val="18"/>
+                <w:szCs w:val="18"/>
+              </w:rPr>
+              <w:t xml:space="preserve"/>
+            </w:r>
+            <w:r>
+              <w:rPr>
+                <w:b/>
+                <w:bCs/>
+                <w:sz w:val="18"/>
+                <w:szCs w:val="18"/>
+              </w:rPr>
+              <w:t xml:space="preserve">Corrected</w:t>
+            </w:r>
+            <w:r>
+              <w:rPr>
+                <w:sz w:val="18"/>
+                <w:szCs w:val="18"/>
+              </w:rPr>
+              <w:t xml:space="preserve"/>
+            </w:r>
+          </w:p>
+        </w:tc>
+        <w:tc>
+          <w:tcPr>
+            <w:tcW w:type="dxa" w:w="4938"/>
+            <w:tcBorders>
+              <w:top w:val="single" w:color="BFBFBF" w:sz="4"/>
+              <w:left w:val="single" w:color="BFBFBF" w:sz="4"/>
+              <w:bottom w:val="single" w:color="BFBFBF" w:sz="4"/>
+              <w:right w:val="single" w:color="BFBFBF" w:sz="4"/>
+            </w:tcBorders>
+            <w:tcMar>
+              <w:top w:type="dxa" w:w="60"/>
+              <w:left w:type="dxa" w:w="100"/>
+              <w:bottom w:type="dxa" w:w="60"/>
+              <w:right w:type="dxa" w:w="100"/>
+            </w:tcMar>
+            <w:vAlign w:val="top"/>
+          </w:tcPr>
+          <w:p>
+            <w:pPr>
+              <w:spacing w:after="40"/>
+            </w:pPr>
+            <w:r>
+              <w:rPr>
+                <w:sz w:val="18"/>
+                <w:szCs w:val="18"/>
+              </w:rPr>
+              <w:t xml:space="preserve">Applies 12 Aug 2026; heavy metals = </w:t>
+            </w:r>
+            <w:r>
+              <w:rPr>
+                <w:b/>
+                <w:bCs/>
+                <w:sz w:val="18"/>
+                <w:szCs w:val="18"/>
+              </w:rPr>
+              <w:t xml:space="preserve">sum</w:t>
+            </w:r>
+            <w:r>
+              <w:rPr>
+                <w:sz w:val="18"/>
+                <w:szCs w:val="18"/>
+              </w:rPr>
+              <w:t xml:space="preserve"> ≤ 100 mg/kg; PFAS FCM limits; labels 12 Aug 2028 or +24 months after implementing act.</w:t>
+            </w:r>
+          </w:p>
+        </w:tc>
+      </w:tr>
+      <w:tr>
+        <w:trPr>
+          <w:cantSplit/>
+        </w:trPr>
+        <w:tc>
+          <w:tcPr>
+            <w:tcW w:type="dxa" w:w="500"/>
+            <w:tcBorders>
+              <w:top w:val="single" w:color="BFBFBF" w:sz="4"/>
+              <w:left w:val="single" w:color="BFBFBF" w:sz="4"/>
+              <w:bottom w:val="single" w:color="BFBFBF" w:sz="4"/>
+              <w:right w:val="single" w:color="BFBFBF" w:sz="4"/>
+            </w:tcBorders>
+            <w:shd w:fill="F5F7FA" w:color="auto" w:val="clear"/>
+            <w:tcMar>
+              <w:top w:type="dxa" w:w="60"/>
+              <w:left w:type="dxa" w:w="100"/>
+              <w:bottom w:type="dxa" w:w="60"/>
+              <w:right w:type="dxa" w:w="100"/>
+            </w:tcMar>
+            <w:vAlign w:val="top"/>
+          </w:tcPr>
+          <w:p>
+            <w:pPr>
+              <w:spacing w:after="40"/>
+            </w:pPr>
+            <w:r>
+              <w:rPr>
+                <w:sz w:val="18"/>
+                <w:szCs w:val="18"/>
+              </w:rPr>
+              <w:t xml:space="preserve">12</w:t>
+            </w:r>
+          </w:p>
+        </w:tc>
+        <w:tc>
+          <w:tcPr>
+            <w:tcW w:type="dxa" w:w="2700"/>
+            <w:tcBorders>
+              <w:top w:val="single" w:color="BFBFBF" w:sz="4"/>
+              <w:left w:val="single" w:color="BFBFBF" w:sz="4"/>
+              <w:bottom w:val="single" w:color="BFBFBF" w:sz="4"/>
+              <w:right w:val="single" w:color="BFBFBF" w:sz="4"/>
+            </w:tcBorders>
+            <w:shd w:fill="F5F7FA" w:color="auto" w:val="clear"/>
+            <w:tcMar>
+              <w:top w:type="dxa" w:w="60"/>
+              <w:left w:type="dxa" w:w="100"/>
+              <w:bottom w:type="dxa" w:w="60"/>
+              <w:right w:type="dxa" w:w="100"/>
+            </w:tcMar>
+            <w:vAlign w:val="top"/>
+          </w:tcPr>
+          <w:p>
+            <w:pPr>
+              <w:spacing w:after="40"/>
+            </w:pPr>
+            <w:r>
+              <w:rPr>
+                <w:sz w:val="18"/>
+                <w:szCs w:val="18"/>
+              </w:rPr>
+              <w:t xml:space="preserve">CLP revision</w:t>
+            </w:r>
+          </w:p>
+        </w:tc>
+        <w:tc>
+          <w:tcPr>
+            <w:tcW w:type="dxa" w:w="1500"/>
+            <w:tcBorders>
+              <w:top w:val="single" w:color="BFBFBF" w:sz="4"/>
+              <w:left w:val="single" w:color="BFBFBF" w:sz="4"/>
+              <w:bottom w:val="single" w:color="BFBFBF" w:sz="4"/>
+              <w:right w:val="single" w:color="BFBFBF" w:sz="4"/>
+            </w:tcBorders>
+            <w:shd w:fill="F5F7FA" w:color="auto" w:val="clear"/>
+            <w:tcMar>
+              <w:top w:type="dxa" w:w="60"/>
+              <w:left w:type="dxa" w:w="100"/>
+              <w:bottom w:type="dxa" w:w="60"/>
+              <w:right w:type="dxa" w:w="100"/>
+            </w:tcMar>
+            <w:vAlign w:val="top"/>
+          </w:tcPr>
+          <w:p>
+            <w:pPr>
+              <w:spacing w:after="40"/>
+            </w:pPr>
+            <w:r>
+              <w:rPr>
+                <w:sz w:val="18"/>
+                <w:szCs w:val="18"/>
+              </w:rPr>
+              <w:t xml:space="preserve"/>
+            </w:r>
+            <w:r>
+              <w:rPr>
+                <w:b/>
+                <w:bCs/>
+                <w:sz w:val="18"/>
+                <w:szCs w:val="18"/>
+              </w:rPr>
+              <w:t xml:space="preserve">Open</w:t>
+            </w:r>
+            <w:r>
+              <w:rPr>
+                <w:sz w:val="18"/>
+                <w:szCs w:val="18"/>
+              </w:rPr>
+              <w:t xml:space="preserve"/>
+            </w:r>
+          </w:p>
+        </w:tc>
+        <w:tc>
+          <w:tcPr>
+            <w:tcW w:type="dxa" w:w="4938"/>
+            <w:tcBorders>
+              <w:top w:val="single" w:color="BFBFBF" w:sz="4"/>
+              <w:left w:val="single" w:color="BFBFBF" w:sz="4"/>
+              <w:bottom w:val="single" w:color="BFBFBF" w:sz="4"/>
+              <w:right w:val="single" w:color="BFBFBF" w:sz="4"/>
+            </w:tcBorders>
+            <w:shd w:fill="F5F7FA" w:color="auto" w:val="clear"/>
+            <w:tcMar>
+              <w:top w:type="dxa" w:w="60"/>
+              <w:left w:type="dxa" w:w="100"/>
+              <w:bottom w:type="dxa" w:w="60"/>
+              <w:right w:type="dxa" w:w="100"/>
+            </w:tcMar>
+            <w:vAlign w:val="top"/>
+          </w:tcPr>
+          <w:p>
+            <w:pPr>
+              <w:spacing w:after="40"/>
+            </w:pPr>
+            <w:r>
+              <w:rPr>
+                <w:sz w:val="18"/>
+                <w:szCs w:val="18"/>
+              </w:rPr>
+              <w:t xml:space="preserve">Original 1 Jul 2026 / 1 Jan 2027; proposal COM(2025) 526 to defer to 1 Jan 2028 — adoption not confirmed.</w:t>
+            </w:r>
+          </w:p>
+        </w:tc>
+      </w:tr>
+      <w:tr>
+        <w:trPr>
+          <w:cantSplit/>
+        </w:trPr>
+        <w:tc>
+          <w:tcPr>
+            <w:tcW w:type="dxa" w:w="500"/>
+            <w:tcBorders>
+              <w:top w:val="single" w:color="BFBFBF" w:sz="4"/>
+              <w:left w:val="single" w:color="BFBFBF" w:sz="4"/>
+              <w:bottom w:val="single" w:color="BFBFBF" w:sz="4"/>
+              <w:right w:val="single" w:color="BFBFBF" w:sz="4"/>
+            </w:tcBorders>
+            <w:tcMar>
+              <w:top w:type="dxa" w:w="60"/>
+              <w:left w:type="dxa" w:w="100"/>
+              <w:bottom w:type="dxa" w:w="60"/>
+              <w:right w:type="dxa" w:w="100"/>
+            </w:tcMar>
+            <w:vAlign w:val="top"/>
+          </w:tcPr>
+          <w:p>
+            <w:pPr>
+              <w:spacing w:after="40"/>
+            </w:pPr>
+            <w:r>
+              <w:rPr>
+                <w:sz w:val="18"/>
+                <w:szCs w:val="18"/>
+              </w:rPr>
+              <w:t xml:space="preserve">13</w:t>
+            </w:r>
+          </w:p>
+        </w:tc>
+        <w:tc>
+          <w:tcPr>
+            <w:tcW w:type="dxa" w:w="2700"/>
+            <w:tcBorders>
+              <w:top w:val="single" w:color="BFBFBF" w:sz="4"/>
+              <w:left w:val="single" w:color="BFBFBF" w:sz="4"/>
+              <w:bottom w:val="single" w:color="BFBFBF" w:sz="4"/>
+              <w:right w:val="single" w:color="BFBFBF" w:sz="4"/>
+            </w:tcBorders>
+            <w:tcMar>
+              <w:top w:type="dxa" w:w="60"/>
+              <w:left w:type="dxa" w:w="100"/>
+              <w:bottom w:type="dxa" w:w="60"/>
+              <w:right w:type="dxa" w:w="100"/>
+            </w:tcMar>
+            <w:vAlign w:val="top"/>
+          </w:tcPr>
+          <w:p>
+            <w:pPr>
+              <w:spacing w:after="40"/>
+            </w:pPr>
+            <w:r>
+              <w:rPr>
+                <w:sz w:val="18"/>
+                <w:szCs w:val="18"/>
+              </w:rPr>
+              <w:t xml:space="preserve">RED cybersecurity</w:t>
+            </w:r>
+          </w:p>
+        </w:tc>
+        <w:tc>
+          <w:tcPr>
+            <w:tcW w:type="dxa" w:w="1500"/>
+            <w:tcBorders>
+              <w:top w:val="single" w:color="BFBFBF" w:sz="4"/>
+              <w:left w:val="single" w:color="BFBFBF" w:sz="4"/>
+              <w:bottom w:val="single" w:color="BFBFBF" w:sz="4"/>
+              <w:right w:val="single" w:color="BFBFBF" w:sz="4"/>
+            </w:tcBorders>
+            <w:tcMar>
+              <w:top w:type="dxa" w:w="60"/>
+              <w:left w:type="dxa" w:w="100"/>
+              <w:bottom w:type="dxa" w:w="60"/>
+              <w:right w:type="dxa" w:w="100"/>
+            </w:tcMar>
+            <w:vAlign w:val="top"/>
+          </w:tcPr>
+          <w:p>
+            <w:pPr>
+              <w:spacing w:after="40"/>
+            </w:pPr>
+            <w:r>
+              <w:rPr>
+                <w:sz w:val="18"/>
+                <w:szCs w:val="18"/>
+              </w:rPr>
+              <w:t xml:space="preserve"/>
+            </w:r>
+            <w:r>
+              <w:rPr>
+                <w:b/>
+                <w:bCs/>
+                <w:sz w:val="18"/>
+                <w:szCs w:val="18"/>
+              </w:rPr>
+              <w:t xml:space="preserve">Confirmed</w:t>
+            </w:r>
+            <w:r>
+              <w:rPr>
+                <w:sz w:val="18"/>
+                <w:szCs w:val="18"/>
+              </w:rPr>
+              <w:t xml:space="preserve"/>
+            </w:r>
+          </w:p>
+        </w:tc>
+        <w:tc>
+          <w:tcPr>
+            <w:tcW w:type="dxa" w:w="4938"/>
+            <w:tcBorders>
+              <w:top w:val="single" w:color="BFBFBF" w:sz="4"/>
+              <w:left w:val="single" w:color="BFBFBF" w:sz="4"/>
+              <w:bottom w:val="single" w:color="BFBFBF" w:sz="4"/>
+              <w:right w:val="single" w:color="BFBFBF" w:sz="4"/>
+            </w:tcBorders>
+            <w:tcMar>
+              <w:top w:type="dxa" w:w="60"/>
+              <w:left w:type="dxa" w:w="100"/>
+              <w:bottom w:type="dxa" w:w="60"/>
+              <w:right w:type="dxa" w:w="100"/>
+            </w:tcMar>
+            <w:vAlign w:val="top"/>
+          </w:tcPr>
+          <w:p>
+            <w:pPr>
+              <w:spacing w:after="40"/>
+            </w:pPr>
+            <w:r>
+              <w:rPr>
+                <w:sz w:val="18"/>
+                <w:szCs w:val="18"/>
+              </w:rPr>
+              <w:t xml:space="preserve">Since 1 Aug 2025; EN 18031-1/-2/-3 cited with restrictions, Impl. Decision (EU) 2025/138.</w:t>
+            </w:r>
+          </w:p>
+        </w:tc>
+      </w:tr>
+      <w:tr>
+        <w:trPr>
+          <w:cantSplit/>
+        </w:trPr>
+        <w:tc>
+          <w:tcPr>
+            <w:tcW w:type="dxa" w:w="500"/>
+            <w:tcBorders>
+              <w:top w:val="single" w:color="BFBFBF" w:sz="4"/>
+              <w:left w:val="single" w:color="BFBFBF" w:sz="4"/>
+              <w:bottom w:val="single" w:color="BFBFBF" w:sz="4"/>
+              <w:right w:val="single" w:color="BFBFBF" w:sz="4"/>
+            </w:tcBorders>
+            <w:shd w:fill="F5F7FA" w:color="auto" w:val="clear"/>
+            <w:tcMar>
+              <w:top w:type="dxa" w:w="60"/>
+              <w:left w:type="dxa" w:w="100"/>
+              <w:bottom w:type="dxa" w:w="60"/>
+              <w:right w:type="dxa" w:w="100"/>
+            </w:tcMar>
+            <w:vAlign w:val="top"/>
+          </w:tcPr>
+          <w:p>
+            <w:pPr>
+              <w:spacing w:after="40"/>
+            </w:pPr>
+            <w:r>
+              <w:rPr>
+                <w:sz w:val="18"/>
+                <w:szCs w:val="18"/>
+              </w:rPr>
+              <w:t xml:space="preserve">14</w:t>
+            </w:r>
+          </w:p>
+        </w:tc>
+        <w:tc>
+          <w:tcPr>
+            <w:tcW w:type="dxa" w:w="2700"/>
+            <w:tcBorders>
+              <w:top w:val="single" w:color="BFBFBF" w:sz="4"/>
+              <w:left w:val="single" w:color="BFBFBF" w:sz="4"/>
+              <w:bottom w:val="single" w:color="BFBFBF" w:sz="4"/>
+              <w:right w:val="single" w:color="BFBFBF" w:sz="4"/>
+            </w:tcBorders>
+            <w:shd w:fill="F5F7FA" w:color="auto" w:val="clear"/>
+            <w:tcMar>
+              <w:top w:type="dxa" w:w="60"/>
+              <w:left w:type="dxa" w:w="100"/>
+              <w:bottom w:type="dxa" w:w="60"/>
+              <w:right w:type="dxa" w:w="100"/>
+            </w:tcMar>
+            <w:vAlign w:val="top"/>
+          </w:tcPr>
+          <w:p>
+            <w:pPr>
+              <w:spacing w:after="40"/>
+            </w:pPr>
+            <w:r>
+              <w:rPr>
+                <w:sz w:val="18"/>
+                <w:szCs w:val="18"/>
+              </w:rPr>
+              <w:t xml:space="preserve">GAR gas categories by country</w:t>
+            </w:r>
+          </w:p>
+        </w:tc>
+        <w:tc>
+          <w:tcPr>
+            <w:tcW w:type="dxa" w:w="1500"/>
+            <w:tcBorders>
+              <w:top w:val="single" w:color="BFBFBF" w:sz="4"/>
+              <w:left w:val="single" w:color="BFBFBF" w:sz="4"/>
+              <w:bottom w:val="single" w:color="BFBFBF" w:sz="4"/>
+              <w:right w:val="single" w:color="BFBFBF" w:sz="4"/>
+            </w:tcBorders>
+            <w:shd w:fill="F5F7FA" w:color="auto" w:val="clear"/>
+            <w:tcMar>
+              <w:top w:type="dxa" w:w="60"/>
+              <w:left w:type="dxa" w:w="100"/>
+              <w:bottom w:type="dxa" w:w="60"/>
+              <w:right w:type="dxa" w:w="100"/>
+            </w:tcMar>
+            <w:vAlign w:val="top"/>
+          </w:tcPr>
+          <w:p>
+            <w:pPr>
+              <w:spacing w:after="40"/>
+            </w:pPr>
+            <w:r>
+              <w:rPr>
+                <w:sz w:val="18"/>
+                <w:szCs w:val="18"/>
+              </w:rPr>
+              <w:t xml:space="preserve"/>
+            </w:r>
+            <w:r>
+              <w:rPr>
+                <w:b/>
+                <w:bCs/>
+                <w:sz w:val="18"/>
+                <w:szCs w:val="18"/>
+              </w:rPr>
+              <w:t xml:space="preserve">Open</w:t>
+            </w:r>
+            <w:r>
+              <w:rPr>
+                <w:sz w:val="18"/>
+                <w:szCs w:val="18"/>
+              </w:rPr>
+              <w:t xml:space="preserve"/>
+            </w:r>
+          </w:p>
+        </w:tc>
+        <w:tc>
+          <w:tcPr>
+            <w:tcW w:type="dxa" w:w="4938"/>
+            <w:tcBorders>
+              <w:top w:val="single" w:color="BFBFBF" w:sz="4"/>
+              <w:left w:val="single" w:color="BFBFBF" w:sz="4"/>
+              <w:bottom w:val="single" w:color="BFBFBF" w:sz="4"/>
+              <w:right w:val="single" w:color="BFBFBF" w:sz="4"/>
+            </w:tcBorders>
+            <w:shd w:fill="F5F7FA" w:color="auto" w:val="clear"/>
+            <w:tcMar>
+              <w:top w:type="dxa" w:w="60"/>
+              <w:left w:type="dxa" w:w="100"/>
+              <w:bottom w:type="dxa" w:w="60"/>
+              <w:right w:type="dxa" w:w="100"/>
+            </w:tcMar>
+            <w:vAlign w:val="top"/>
+          </w:tcPr>
+          <w:p>
+            <w:pPr>
+              <w:spacing w:after="40"/>
+            </w:pPr>
+            <w:r>
+              <w:rPr>
+                <w:sz w:val="18"/>
+                <w:szCs w:val="18"/>
+              </w:rPr>
+              <w:t xml:space="preserve">Latest Commission notice C/2025/1714 identified, not readable from verification environment; table based on current NB certificates.</w:t>
+            </w:r>
+          </w:p>
+        </w:tc>
+      </w:tr>
+      <w:tr>
+        <w:trPr>
+          <w:cantSplit/>
+        </w:trPr>
+        <w:tc>
+          <w:tcPr>
+            <w:tcW w:type="dxa" w:w="500"/>
+            <w:tcBorders>
+              <w:top w:val="single" w:color="BFBFBF" w:sz="4"/>
+              <w:left w:val="single" w:color="BFBFBF" w:sz="4"/>
+              <w:bottom w:val="single" w:color="BFBFBF" w:sz="4"/>
+              <w:right w:val="single" w:color="BFBFBF" w:sz="4"/>
+            </w:tcBorders>
+            <w:tcMar>
+              <w:top w:type="dxa" w:w="60"/>
+              <w:left w:type="dxa" w:w="100"/>
+              <w:bottom w:type="dxa" w:w="60"/>
+              <w:right w:type="dxa" w:w="100"/>
+            </w:tcMar>
+            <w:vAlign w:val="top"/>
+          </w:tcPr>
+          <w:p>
+            <w:pPr>
+              <w:spacing w:after="40"/>
+            </w:pPr>
+            <w:r>
+              <w:rPr>
+                <w:sz w:val="18"/>
+                <w:szCs w:val="18"/>
+              </w:rPr>
+              <w:t xml:space="preserve">15</w:t>
+            </w:r>
+          </w:p>
+        </w:tc>
+        <w:tc>
+          <w:tcPr>
+            <w:tcW w:type="dxa" w:w="2700"/>
+            <w:tcBorders>
+              <w:top w:val="single" w:color="BFBFBF" w:sz="4"/>
+              <w:left w:val="single" w:color="BFBFBF" w:sz="4"/>
+              <w:bottom w:val="single" w:color="BFBFBF" w:sz="4"/>
+              <w:right w:val="single" w:color="BFBFBF" w:sz="4"/>
+            </w:tcBorders>
+            <w:tcMar>
+              <w:top w:type="dxa" w:w="60"/>
+              <w:left w:type="dxa" w:w="100"/>
+              <w:bottom w:type="dxa" w:w="60"/>
+              <w:right w:type="dxa" w:w="100"/>
+            </w:tcMar>
+            <w:vAlign w:val="top"/>
+          </w:tcPr>
+          <w:p>
+            <w:pPr>
+              <w:spacing w:after="40"/>
+            </w:pPr>
+            <w:r>
+              <w:rPr>
+                <w:sz w:val="18"/>
+                <w:szCs w:val="18"/>
+              </w:rPr>
+              <w:t xml:space="preserve">Prop 65 short-form</w:t>
+            </w:r>
+          </w:p>
+        </w:tc>
+        <w:tc>
+          <w:tcPr>
+            <w:tcW w:type="dxa" w:w="1500"/>
+            <w:tcBorders>
+              <w:top w:val="single" w:color="BFBFBF" w:sz="4"/>
+              <w:left w:val="single" w:color="BFBFBF" w:sz="4"/>
+              <w:bottom w:val="single" w:color="BFBFBF" w:sz="4"/>
+              <w:right w:val="single" w:color="BFBFBF" w:sz="4"/>
+            </w:tcBorders>
+            <w:tcMar>
+              <w:top w:type="dxa" w:w="60"/>
+              <w:left w:type="dxa" w:w="100"/>
+              <w:bottom w:type="dxa" w:w="60"/>
+              <w:right w:type="dxa" w:w="100"/>
+            </w:tcMar>
+            <w:vAlign w:val="top"/>
+          </w:tcPr>
+          <w:p>
+            <w:pPr>
+              <w:spacing w:after="40"/>
+            </w:pPr>
+            <w:r>
+              <w:rPr>
+                <w:sz w:val="18"/>
+                <w:szCs w:val="18"/>
+              </w:rPr>
+              <w:t xml:space="preserve"/>
+            </w:r>
+            <w:r>
+              <w:rPr>
+                <w:b/>
+                <w:bCs/>
+                <w:sz w:val="18"/>
+                <w:szCs w:val="18"/>
+              </w:rPr>
+              <w:t xml:space="preserve">Confirmed</w:t>
+            </w:r>
+            <w:r>
+              <w:rPr>
+                <w:sz w:val="18"/>
+                <w:szCs w:val="18"/>
+              </w:rPr>
+              <w:t xml:space="preserve"/>
+            </w:r>
+          </w:p>
+        </w:tc>
+        <w:tc>
+          <w:tcPr>
+            <w:tcW w:type="dxa" w:w="4938"/>
+            <w:tcBorders>
+              <w:top w:val="single" w:color="BFBFBF" w:sz="4"/>
+              <w:left w:val="single" w:color="BFBFBF" w:sz="4"/>
+              <w:bottom w:val="single" w:color="BFBFBF" w:sz="4"/>
+              <w:right w:val="single" w:color="BFBFBF" w:sz="4"/>
+            </w:tcBorders>
+            <w:tcMar>
+              <w:top w:type="dxa" w:w="60"/>
+              <w:left w:type="dxa" w:w="100"/>
+              <w:bottom w:type="dxa" w:w="60"/>
+              <w:right w:type="dxa" w:w="100"/>
+            </w:tcMar>
+            <w:vAlign w:val="top"/>
+          </w:tcPr>
+          <w:p>
+            <w:pPr>
+              <w:spacing w:after="40"/>
+            </w:pPr>
+            <w:r>
+              <w:rPr>
+                <w:sz w:val="18"/>
+                <w:szCs w:val="18"/>
+              </w:rPr>
+              <w:t xml:space="preserve">Effective 1 Jan 2025; transition to 1 Jan 2028.</w:t>
+            </w:r>
+          </w:p>
+        </w:tc>
+      </w:tr>
+      <w:tr>
+        <w:trPr>
+          <w:cantSplit/>
+        </w:trPr>
+        <w:tc>
+          <w:tcPr>
+            <w:tcW w:type="dxa" w:w="500"/>
+            <w:tcBorders>
+              <w:top w:val="single" w:color="BFBFBF" w:sz="4"/>
+              <w:left w:val="single" w:color="BFBFBF" w:sz="4"/>
+              <w:bottom w:val="single" w:color="BFBFBF" w:sz="4"/>
+              <w:right w:val="single" w:color="BFBFBF" w:sz="4"/>
+            </w:tcBorders>
+            <w:shd w:fill="F5F7FA" w:color="auto" w:val="clear"/>
+            <w:tcMar>
+              <w:top w:type="dxa" w:w="60"/>
+              <w:left w:type="dxa" w:w="100"/>
+              <w:bottom w:type="dxa" w:w="60"/>
+              <w:right w:type="dxa" w:w="100"/>
+            </w:tcMar>
+            <w:vAlign w:val="top"/>
+          </w:tcPr>
+          <w:p>
+            <w:pPr>
+              <w:spacing w:after="40"/>
+            </w:pPr>
+            <w:r>
+              <w:rPr>
+                <w:sz w:val="18"/>
+                <w:szCs w:val="18"/>
+              </w:rPr>
+              <w:t xml:space="preserve">16</w:t>
+            </w:r>
+          </w:p>
+        </w:tc>
+        <w:tc>
+          <w:tcPr>
+            <w:tcW w:type="dxa" w:w="2700"/>
+            <w:tcBorders>
+              <w:top w:val="single" w:color="BFBFBF" w:sz="4"/>
+              <w:left w:val="single" w:color="BFBFBF" w:sz="4"/>
+              <w:bottom w:val="single" w:color="BFBFBF" w:sz="4"/>
+              <w:right w:val="single" w:color="BFBFBF" w:sz="4"/>
+            </w:tcBorders>
+            <w:shd w:fill="F5F7FA" w:color="auto" w:val="clear"/>
+            <w:tcMar>
+              <w:top w:type="dxa" w:w="60"/>
+              <w:left w:type="dxa" w:w="100"/>
+              <w:bottom w:type="dxa" w:w="60"/>
+              <w:right w:type="dxa" w:w="100"/>
+            </w:tcMar>
+            <w:vAlign w:val="top"/>
+          </w:tcPr>
+          <w:p>
+            <w:pPr>
+              <w:spacing w:after="40"/>
+            </w:pPr>
+            <w:r>
+              <w:rPr>
+                <w:sz w:val="18"/>
+                <w:szCs w:val="18"/>
+              </w:rPr>
+              <w:t xml:space="preserve">GPSR, PPE, GAR core provisions, LVD/EMC/RoHS/WEEE</w:t>
+            </w:r>
+          </w:p>
+        </w:tc>
+        <w:tc>
+          <w:tcPr>
+            <w:tcW w:type="dxa" w:w="1500"/>
+            <w:tcBorders>
+              <w:top w:val="single" w:color="BFBFBF" w:sz="4"/>
+              <w:left w:val="single" w:color="BFBFBF" w:sz="4"/>
+              <w:bottom w:val="single" w:color="BFBFBF" w:sz="4"/>
+              <w:right w:val="single" w:color="BFBFBF" w:sz="4"/>
+            </w:tcBorders>
+            <w:shd w:fill="F5F7FA" w:color="auto" w:val="clear"/>
+            <w:tcMar>
+              <w:top w:type="dxa" w:w="60"/>
+              <w:left w:type="dxa" w:w="100"/>
+              <w:bottom w:type="dxa" w:w="60"/>
+              <w:right w:type="dxa" w:w="100"/>
+            </w:tcMar>
+            <w:vAlign w:val="top"/>
+          </w:tcPr>
+          <w:p>
+            <w:pPr>
+              <w:spacing w:after="40"/>
+            </w:pPr>
+            <w:r>
+              <w:rPr>
+                <w:sz w:val="18"/>
+                <w:szCs w:val="18"/>
+              </w:rPr>
+              <w:t xml:space="preserve"/>
+            </w:r>
+            <w:r>
+              <w:rPr>
+                <w:b/>
+                <w:bCs/>
+                <w:sz w:val="18"/>
+                <w:szCs w:val="18"/>
+              </w:rPr>
+              <w:t xml:space="preserve">Stable</w:t>
+            </w:r>
+            <w:r>
+              <w:rPr>
+                <w:sz w:val="18"/>
+                <w:szCs w:val="18"/>
+              </w:rPr>
+              <w:t xml:space="preserve"/>
+            </w:r>
+          </w:p>
+        </w:tc>
+        <w:tc>
+          <w:tcPr>
+            <w:tcW w:type="dxa" w:w="4938"/>
+            <w:tcBorders>
+              <w:top w:val="single" w:color="BFBFBF" w:sz="4"/>
+              <w:left w:val="single" w:color="BFBFBF" w:sz="4"/>
+              <w:bottom w:val="single" w:color="BFBFBF" w:sz="4"/>
+              <w:right w:val="single" w:color="BFBFBF" w:sz="4"/>
+            </w:tcBorders>
+            <w:shd w:fill="F5F7FA" w:color="auto" w:val="clear"/>
+            <w:tcMar>
+              <w:top w:type="dxa" w:w="60"/>
+              <w:left w:type="dxa" w:w="100"/>
+              <w:bottom w:type="dxa" w:w="60"/>
+              <w:right w:type="dxa" w:w="100"/>
+            </w:tcMar>
+            <w:vAlign w:val="top"/>
+          </w:tcPr>
+          <w:p>
+            <w:pPr>
+              <w:spacing w:after="40"/>
+            </w:pPr>
+            <w:r>
+              <w:rPr>
+                <w:sz w:val="18"/>
+                <w:szCs w:val="18"/>
+              </w:rPr>
+              <w:t xml:space="preserve">No amendment identified affecting this manual.</w:t>
+            </w:r>
+          </w:p>
+        </w:tc>
+      </w:tr>
+      <w:tr>
+        <w:trPr>
+          <w:cantSplit/>
+        </w:trPr>
+        <w:tc>
+          <w:tcPr>
+            <w:tcW w:type="dxa" w:w="500"/>
+            <w:tcBorders>
+              <w:top w:val="single" w:color="BFBFBF" w:sz="4"/>
+              <w:left w:val="single" w:color="BFBFBF" w:sz="4"/>
+              <w:bottom w:val="single" w:color="BFBFBF" w:sz="4"/>
+              <w:right w:val="single" w:color="BFBFBF" w:sz="4"/>
+            </w:tcBorders>
+            <w:tcMar>
+              <w:top w:type="dxa" w:w="60"/>
+              <w:left w:type="dxa" w:w="100"/>
+              <w:bottom w:type="dxa" w:w="60"/>
+              <w:right w:type="dxa" w:w="100"/>
+            </w:tcMar>
+            <w:vAlign w:val="top"/>
+          </w:tcPr>
+          <w:p>
+            <w:pPr>
+              <w:spacing w:after="40"/>
+            </w:pPr>
+            <w:r>
+              <w:rPr>
+                <w:sz w:val="18"/>
+                <w:szCs w:val="18"/>
+              </w:rPr>
+              <w:t xml:space="preserve">17</w:t>
+            </w:r>
+          </w:p>
+        </w:tc>
+        <w:tc>
+          <w:tcPr>
+            <w:tcW w:type="dxa" w:w="2700"/>
+            <w:tcBorders>
+              <w:top w:val="single" w:color="BFBFBF" w:sz="4"/>
+              <w:left w:val="single" w:color="BFBFBF" w:sz="4"/>
+              <w:bottom w:val="single" w:color="BFBFBF" w:sz="4"/>
+              <w:right w:val="single" w:color="BFBFBF" w:sz="4"/>
+            </w:tcBorders>
+            <w:tcMar>
+              <w:top w:type="dxa" w:w="60"/>
+              <w:left w:type="dxa" w:w="100"/>
+              <w:bottom w:type="dxa" w:w="60"/>
+              <w:right w:type="dxa" w:w="100"/>
+            </w:tcMar>
+            <w:vAlign w:val="top"/>
+          </w:tcPr>
+          <w:p>
+            <w:pPr>
+              <w:spacing w:after="40"/>
+            </w:pPr>
+            <w:r>
+              <w:rPr>
+                <w:sz w:val="18"/>
+                <w:szCs w:val="18"/>
+              </w:rPr>
+              <w:t xml:space="preserve">EEA incorporation, Swiss specifics, ESPR delegated acts, US DOT cylinders</w:t>
+            </w:r>
+          </w:p>
+        </w:tc>
+        <w:tc>
+          <w:tcPr>
+            <w:tcW w:type="dxa" w:w="1500"/>
+            <w:tcBorders>
+              <w:top w:val="single" w:color="BFBFBF" w:sz="4"/>
+              <w:left w:val="single" w:color="BFBFBF" w:sz="4"/>
+              <w:bottom w:val="single" w:color="BFBFBF" w:sz="4"/>
+              <w:right w:val="single" w:color="BFBFBF" w:sz="4"/>
+            </w:tcBorders>
+            <w:tcMar>
+              <w:top w:type="dxa" w:w="60"/>
+              <w:left w:type="dxa" w:w="100"/>
+              <w:bottom w:type="dxa" w:w="60"/>
+              <w:right w:type="dxa" w:w="100"/>
+            </w:tcMar>
+            <w:vAlign w:val="top"/>
+          </w:tcPr>
+          <w:p>
+            <w:pPr>
+              <w:spacing w:after="40"/>
+            </w:pPr>
+            <w:r>
+              <w:rPr>
+                <w:sz w:val="18"/>
+                <w:szCs w:val="18"/>
+              </w:rPr>
+              <w:t xml:space="preserve"/>
+            </w:r>
+            <w:r>
+              <w:rPr>
+                <w:b/>
+                <w:bCs/>
+                <w:sz w:val="18"/>
+                <w:szCs w:val="18"/>
+              </w:rPr>
+              <w:t xml:space="preserve">Open</w:t>
+            </w:r>
+            <w:r>
+              <w:rPr>
+                <w:sz w:val="18"/>
+                <w:szCs w:val="18"/>
+              </w:rPr>
+              <w:t xml:space="preserve"/>
+            </w:r>
+          </w:p>
+        </w:tc>
+        <w:tc>
+          <w:tcPr>
+            <w:tcW w:type="dxa" w:w="4938"/>
+            <w:tcBorders>
+              <w:top w:val="single" w:color="BFBFBF" w:sz="4"/>
+              <w:left w:val="single" w:color="BFBFBF" w:sz="4"/>
+              <w:bottom w:val="single" w:color="BFBFBF" w:sz="4"/>
+              <w:right w:val="single" w:color="BFBFBF" w:sz="4"/>
+            </w:tcBorders>
+            <w:tcMar>
+              <w:top w:type="dxa" w:w="60"/>
+              <w:left w:type="dxa" w:w="100"/>
+              <w:bottom w:type="dxa" w:w="60"/>
+              <w:right w:type="dxa" w:w="100"/>
+            </w:tcMar>
+            <w:vAlign w:val="top"/>
+          </w:tcPr>
+          <w:p>
+            <w:pPr>
+              <w:spacing w:after="40"/>
+            </w:pPr>
+            <w:r>
+              <w:rPr>
+                <w:sz w:val="18"/>
+                <w:szCs w:val="18"/>
+              </w:rPr>
+              <w:t xml:space="preserve">Not re-checked in this pass; keep ⚑ VERIFY.</w:t>
+            </w:r>
+          </w:p>
+        </w:tc>
+      </w:tr>
+    </w:tbl>
+    <w:p>
+      <w:pPr>
+        <w:spacing w:after="60"/>
+      </w:pPr>
+    </w:p>
+    <w:p>
+      <w:pPr>
+        <w:pStyle w:val="Heading2"/>
+      </w:pPr>
+      <w:r>
+        <w:t xml:space="preserve">Sources consulted</w:t>
+      </w:r>
+    </w:p>
+    <w:p>
+      <w:pPr>
+        <w:pStyle w:val="ListParagraph"/>
+        <w:numPr>
+          <w:ilvl w:val="0"/>
+          <w:numId w:val="2"/>
+        </w:numPr>
+        <w:spacing w:after="60"/>
+      </w:pPr>
+      <w:r>
+        <w:t xml:space="preserve">EUDR: coolset.com/academy/eudr-delay-2025-explained · cms.law (EU resets the countdown on the EUDR) · polygon-one.com/en/eudr-current-status · globalelr.com (May 2026)</w:t>
+      </w:r>
+    </w:p>
+    <w:p>
+      <w:pPr>
+        <w:pStyle w:val="ListParagraph"/>
+        <w:numPr>
+          <w:ilvl w:val="0"/>
+          <w:numId w:val="2"/>
+        </w:numPr>
+        <w:spacing w:after="60"/>
+      </w:pPr>
+      <w:r>
+        <w:t xml:space="preserve">Batteries: algoodbody.com (batteries due diligence two-year pause) · ess-news.com (22 Jul 2025) · reuschlaw.de (Two years of the Battery Regulation) · pryormarking.com (18 August 2026 …) · compliancegate.com (EU Batteries Regulation timeline)</w:t>
+      </w:r>
+    </w:p>
+    <w:p>
+      <w:pPr>
+        <w:pStyle w:val="ListParagraph"/>
+        <w:numPr>
+          <w:ilvl w:val="0"/>
+          <w:numId w:val="2"/>
+        </w:numPr>
+        <w:spacing w:after="60"/>
+      </w:pPr>
+      <w:r>
+        <w:t xml:space="preserve">Toys: cps.bureauveritas.com (EU Toy Safety Regulation 2025/2509 published) · eurofins.com Tech Watch</w:t>
+      </w:r>
+    </w:p>
+    <w:p>
+      <w:pPr>
+        <w:pStyle w:val="ListParagraph"/>
+        <w:numPr>
+          <w:ilvl w:val="0"/>
+          <w:numId w:val="2"/>
+        </w:numPr>
+        <w:spacing w:after="60"/>
+      </w:pPr>
+      <w:r>
+        <w:t xml:space="preserve">CBAM: mayerbrown.com (EU adopts CBAM simplification regulation, Oct 2025) · reedsmith.com · crowe.com</w:t>
+      </w:r>
+    </w:p>
+    <w:p>
+      <w:pPr>
+        <w:pStyle w:val="ListParagraph"/>
+        <w:numPr>
+          <w:ilvl w:val="0"/>
+          <w:numId w:val="2"/>
+        </w:numPr>
+        <w:spacing w:after="60"/>
+      </w:pPr>
+      <w:r>
+        <w:t xml:space="preserve">Machinery: cema-agri.org joint industry position (19 Jan 2026) · ibf-solutions.com (postponement of MR cybersecurity/AI) · digital.nemko.com</w:t>
+      </w:r>
+    </w:p>
+    <w:p>
+      <w:pPr>
+        <w:pStyle w:val="ListParagraph"/>
+        <w:numPr>
+          <w:ilvl w:val="0"/>
+          <w:numId w:val="2"/>
+        </w:numPr>
+        <w:spacing w:after="60"/>
+      </w:pPr>
+      <w:r>
+        <w:t xml:space="preserve">CPR: inab.ie (transition to new CPR) · economie.fgov.be · addleshawgoddard.com (2026) · TÜV Rheinland communication on 2024/3110</w:t>
+      </w:r>
+    </w:p>
+    <w:p>
+      <w:pPr>
+        <w:pStyle w:val="ListParagraph"/>
+        <w:numPr>
+          <w:ilvl w:val="0"/>
+          <w:numId w:val="2"/>
+        </w:numPr>
+        <w:spacing w:after="60"/>
+      </w:pPr>
+      <w:r>
+        <w:t xml:space="preserve">REACH: eurofins.com (REACH entry 77 before Aug 2026) · tuvsud.com (formaldehyde; PFHxA) · public.cdxsystem.com (entry 79)</w:t>
+      </w:r>
+    </w:p>
+    <w:p>
+      <w:pPr>
+        <w:pStyle w:val="ListParagraph"/>
+        <w:numPr>
+          <w:ilvl w:val="0"/>
+          <w:numId w:val="2"/>
+        </w:numPr>
+        <w:spacing w:after="60"/>
+      </w:pPr>
+      <w:r>
+        <w:t xml:space="preserve">PPWR: packaging-gateway.com (100 mg/kg limit) · traceone.com (What 12 Aug 2026 means) · twobirds.com (2026)</w:t>
+      </w:r>
+    </w:p>
+    <w:p>
+      <w:pPr>
+        <w:pStyle w:val="ListParagraph"/>
+        <w:numPr>
+          <w:ilvl w:val="0"/>
+          <w:numId w:val="2"/>
+        </w:numPr>
+        <w:spacing w:after="60"/>
+      </w:pPr>
+      <w:r>
+        <w:t xml:space="preserve">CLP: ricardo.com · UK Explanatory Memorandum on COM(2025) 526 (assets.publishing.service.gov.uk)</w:t>
+      </w:r>
+    </w:p>
+    <w:p>
+      <w:pPr>
+        <w:pStyle w:val="ListParagraph"/>
+        <w:numPr>
+          <w:ilvl w:val="0"/>
+          <w:numId w:val="2"/>
+        </w:numPr>
+        <w:spacing w:after="60"/>
+      </w:pPr>
+      <w:r>
+        <w:t xml:space="preserve">RED: tuvsud.com (RED cyber standards OJ citation) · cetecomadvanced.com · nemko.com</w:t>
+      </w:r>
+    </w:p>
+    <w:p>
+      <w:pPr>
+        <w:pStyle w:val="ListParagraph"/>
+        <w:numPr>
+          <w:ilvl w:val="0"/>
+          <w:numId w:val="2"/>
+        </w:numPr>
+        <w:spacing w:after="60"/>
+      </w:pPr>
+      <w:r>
+        <w:t xml:space="preserve">GAR: EUR-Lex C/2025/1714 (identified) · Kiwa / NB certificates and EN 498 product leaflets</w:t>
+      </w:r>
+    </w:p>
+    <w:p>
+      <w:pPr>
+        <w:pStyle w:val="ListParagraph"/>
+        <w:numPr>
+          <w:ilvl w:val="0"/>
+          <w:numId w:val="2"/>
+        </w:numPr>
+        <w:spacing w:after="60"/>
+      </w:pPr>
+      <w:r>
+        <w:t xml:space="preserve">Prop 65: spencerfane.com (Mar 2026) · stinson.com · squirepattonboggs.com</w:t>
+      </w:r>
+    </w:p>
     <w:sectPr>
       <w:headerReference w:type="default" r:id="rId7"/>
       <w:footerReference w:type="default" r:id="rId8"/>
@@ -38642,7 +41712,7 @@
         <w:sz w:val="16"/>
         <w:szCs w:val="16"/>
       </w:rPr>
-      <w:t xml:space="preserve">ARENA-VN-QA-TRN-001 Rev. 01  ·  QS Onboarding Training Manual</w:t>
+      <w:t xml:space="preserve">ARENA-VN-QA-TRN-001 Rev. 02  ·  QS Onboarding Training Manual</w:t>
     </w:r>
   </w:p>
 </w:hdr>

</xml_diff>